<commit_message>
fix: enhance hyperlink handling and style inheritance in DocxConverter
</commit_message>
<xml_diff>
--- a/demo/docx/demo1.docx
+++ b/demo/docx/demo1.docx
@@ -5,24 +5,16 @@
     <w:p>
       <w:pPr>
         <w:rPr>
-          <w:rFonts w:ascii="Microsoft YaHei UI" w:hAnsi="Microsoft YaHei UI" w:hint="eastAsia"/>
+          <w:rFonts w:ascii="Microsoft YaHei UI" w:hAnsi="Microsoft YaHei UI"/>
         </w:rPr>
       </w:pPr>
     </w:p>
     <w:p>
       <w:pPr>
         <w:pStyle w:val="a3"/>
-        <w:rPr>
-          <w:rFonts w:hint="eastAsia"/>
-        </w:rPr>
-      </w:pPr>
-      <w:proofErr w:type="spellStart"/>
-      <w:r>
-        <w:t>MinerU</w:t>
-      </w:r>
-      <w:proofErr w:type="spellEnd"/>
-      <w:r>
-        <w:t xml:space="preserve"> supports DOCX document parsing</w:t>
+      </w:pPr>
+      <w:r>
+        <w:t>MinerU supports DOCX document parsing</w:t>
       </w:r>
       <w:r>
         <w:rPr>
@@ -42,13 +34,7 @@
     <w:p/>
     <w:p/>
     <w:p/>
-    <w:p>
-      <w:pPr>
-        <w:rPr>
-          <w:rFonts w:hint="eastAsia"/>
-        </w:rPr>
-      </w:pPr>
-    </w:p>
+    <w:p/>
     <w:p>
       <w:pPr>
         <w:keepNext/>
@@ -107,9 +93,6 @@
         <w:pStyle w:val="af"/>
         <w:ind w:left="2520" w:firstLineChars="210" w:firstLine="420"/>
         <w:jc w:val="left"/>
-        <w:rPr>
-          <w:rFonts w:hint="eastAsia"/>
-        </w:rPr>
       </w:pPr>
       <w:r>
         <w:rPr>
@@ -146,13 +129,7 @@
     <w:p/>
     <w:p/>
     <w:p/>
-    <w:p>
-      <w:pPr>
-        <w:rPr>
-          <w:rFonts w:hint="eastAsia"/>
-        </w:rPr>
-      </w:pPr>
-    </w:p>
+    <w:p/>
     <w:p>
       <w:pPr>
         <w:snapToGrid w:val="0"/>
@@ -160,31 +137,20 @@
         <w:ind w:left="357"/>
         <w:jc w:val="right"/>
         <w:rPr>
+          <w:rFonts w:eastAsia="楷体_GB2312"/>
+          <w:kern w:val="32"/>
+          <w:sz w:val="30"/>
+          <w:szCs w:val="30"/>
+        </w:rPr>
+      </w:pPr>
+      <w:r>
+        <w:rPr>
           <w:rFonts w:eastAsia="楷体_GB2312" w:hint="eastAsia"/>
           <w:kern w:val="32"/>
           <w:sz w:val="30"/>
           <w:szCs w:val="30"/>
         </w:rPr>
-      </w:pPr>
-      <w:proofErr w:type="spellStart"/>
-      <w:r>
-        <w:rPr>
-          <w:rFonts w:eastAsia="楷体_GB2312" w:hint="eastAsia"/>
-          <w:kern w:val="32"/>
-          <w:sz w:val="30"/>
-          <w:szCs w:val="30"/>
-        </w:rPr>
-        <w:t>MinerU</w:t>
-      </w:r>
-      <w:proofErr w:type="spellEnd"/>
-      <w:r>
-        <w:rPr>
-          <w:rFonts w:eastAsia="楷体_GB2312" w:hint="eastAsia"/>
-          <w:kern w:val="32"/>
-          <w:sz w:val="30"/>
-          <w:szCs w:val="30"/>
-        </w:rPr>
-        <w:t xml:space="preserve"> Team</w:t>
+        <w:t>MinerU Team</w:t>
       </w:r>
     </w:p>
     <w:p>
@@ -266,16 +232,12 @@
     </w:p>
     <w:p>
       <w:pPr>
-        <w:rPr>
-          <w:rFonts w:hint="eastAsia"/>
-        </w:rPr>
         <w:sectPr>
-          <w:headerReference w:type="even" r:id="rId10"/>
-          <w:headerReference w:type="default" r:id="rId11"/>
-          <w:footerReference w:type="even" r:id="rId12"/>
-          <w:footerReference w:type="default" r:id="rId13"/>
-          <w:headerReference w:type="first" r:id="rId14"/>
-          <w:footerReference w:type="first" r:id="rId15"/>
+          <w:headerReference w:type="default" r:id="rId10"/>
+          <w:footerReference w:type="even" r:id="rId11"/>
+          <w:footerReference w:type="default" r:id="rId12"/>
+          <w:headerReference w:type="first" r:id="rId13"/>
+          <w:footerReference w:type="first" r:id="rId14"/>
           <w:pgSz w:w="11906" w:h="16838"/>
           <w:pgMar w:top="1440" w:right="1800" w:bottom="1440" w:left="1800" w:header="851" w:footer="992" w:gutter="0"/>
           <w:pgNumType w:start="1"/>
@@ -388,7 +350,7 @@
             </w:rPr>
             <w:fldChar w:fldCharType="separate"/>
           </w:r>
-          <w:hyperlink w:anchor="_Toc223486225" w:history="1">
+          <w:hyperlink w:anchor="_Toc223628856" w:history="1">
             <w:r>
               <w:rPr>
                 <w:rStyle w:val="ae"/>
@@ -436,7 +398,7 @@
                 <w:noProof/>
                 <w:webHidden/>
               </w:rPr>
-              <w:instrText xml:space="preserve"> PAGEREF _Toc223486225 \h </w:instrText>
+              <w:instrText xml:space="preserve"> PAGEREF _Toc223628856 \h </w:instrText>
             </w:r>
             <w:r>
               <w:rPr>
@@ -481,7 +443,7 @@
               <w14:ligatures w14:val="standardContextual"/>
             </w:rPr>
           </w:pPr>
-          <w:hyperlink w:anchor="_Toc223486226" w:history="1">
+          <w:hyperlink w:anchor="_Toc223628857" w:history="1">
             <w:r>
               <w:rPr>
                 <w:rStyle w:val="ae"/>
@@ -529,7 +491,7 @@
                 <w:noProof/>
                 <w:webHidden/>
               </w:rPr>
-              <w:instrText xml:space="preserve"> PAGEREF _Toc223486226 \h </w:instrText>
+              <w:instrText xml:space="preserve"> PAGEREF _Toc223628857 \h </w:instrText>
             </w:r>
             <w:r>
               <w:rPr>
@@ -574,7 +536,7 @@
               <w14:ligatures w14:val="standardContextual"/>
             </w:rPr>
           </w:pPr>
-          <w:hyperlink w:anchor="_Toc223486227" w:history="1">
+          <w:hyperlink w:anchor="_Toc223628858" w:history="1">
             <w:r>
               <w:rPr>
                 <w:rStyle w:val="ae"/>
@@ -622,7 +584,7 @@
                 <w:noProof/>
                 <w:webHidden/>
               </w:rPr>
-              <w:instrText xml:space="preserve"> PAGEREF _Toc223486227 \h </w:instrText>
+              <w:instrText xml:space="preserve"> PAGEREF _Toc223628858 \h </w:instrText>
             </w:r>
             <w:r>
               <w:rPr>
@@ -667,7 +629,7 @@
               <w14:ligatures w14:val="standardContextual"/>
             </w:rPr>
           </w:pPr>
-          <w:hyperlink w:anchor="_Toc223486228" w:history="1">
+          <w:hyperlink w:anchor="_Toc223628859" w:history="1">
             <w:r>
               <w:rPr>
                 <w:rStyle w:val="ae"/>
@@ -715,7 +677,7 @@
                 <w:noProof/>
                 <w:webHidden/>
               </w:rPr>
-              <w:instrText xml:space="preserve"> PAGEREF _Toc223486228 \h </w:instrText>
+              <w:instrText xml:space="preserve"> PAGEREF _Toc223628859 \h </w:instrText>
             </w:r>
             <w:r>
               <w:rPr>
@@ -760,7 +722,7 @@
               <w14:ligatures w14:val="standardContextual"/>
             </w:rPr>
           </w:pPr>
-          <w:hyperlink w:anchor="_Toc223486229" w:history="1">
+          <w:hyperlink w:anchor="_Toc223628860" w:history="1">
             <w:r>
               <w:rPr>
                 <w:rStyle w:val="ae"/>
@@ -808,7 +770,7 @@
                 <w:noProof/>
                 <w:webHidden/>
               </w:rPr>
-              <w:instrText xml:space="preserve"> PAGEREF _Toc223486229 \h </w:instrText>
+              <w:instrText xml:space="preserve"> PAGEREF _Toc223628860 \h </w:instrText>
             </w:r>
             <w:r>
               <w:rPr>
@@ -855,7 +817,7 @@
               <w14:ligatures w14:val="standardContextual"/>
             </w:rPr>
           </w:pPr>
-          <w:hyperlink w:anchor="_Toc223486230" w:history="1">
+          <w:hyperlink w:anchor="_Toc223628861" w:history="1">
             <w:r>
               <w:rPr>
                 <w:rStyle w:val="ae"/>
@@ -1004,7 +966,7 @@
                 <w:noProof/>
                 <w:webHidden/>
               </w:rPr>
-              <w:instrText xml:space="preserve"> PAGEREF _Toc223486230 \h </w:instrText>
+              <w:instrText xml:space="preserve"> PAGEREF _Toc223628861 \h </w:instrText>
             </w:r>
             <w:r>
               <w:rPr>
@@ -1049,7 +1011,7 @@
               <w14:ligatures w14:val="standardContextual"/>
             </w:rPr>
           </w:pPr>
-          <w:hyperlink w:anchor="_Toc223486231" w:history="1">
+          <w:hyperlink w:anchor="_Toc223628862" w:history="1">
             <w:r>
               <w:rPr>
                 <w:rStyle w:val="ae"/>
@@ -1097,7 +1059,7 @@
                 <w:noProof/>
                 <w:webHidden/>
               </w:rPr>
-              <w:instrText xml:space="preserve"> PAGEREF _Toc223486231 \h </w:instrText>
+              <w:instrText xml:space="preserve"> PAGEREF _Toc223628862 \h </w:instrText>
             </w:r>
             <w:r>
               <w:rPr>
@@ -1142,7 +1104,7 @@
               <w14:ligatures w14:val="standardContextual"/>
             </w:rPr>
           </w:pPr>
-          <w:hyperlink w:anchor="_Toc223486232" w:history="1">
+          <w:hyperlink w:anchor="_Toc223628863" w:history="1">
             <w:r>
               <w:rPr>
                 <w:rStyle w:val="ae"/>
@@ -1169,26 +1131,46 @@
                 <w:b/>
                 <w:noProof/>
               </w:rPr>
-              <w:t>标题内包含公式</w:t>
-            </w:r>
-            <m:oMath>
-              <m:r>
-                <w:rPr>
-                  <w:rStyle w:val="ae"/>
-                  <w:rFonts w:ascii="Cambria Math" w:hAnsi="Cambria Math" w:cs="宋体"/>
-                  <w:noProof/>
-                </w:rPr>
-                <m:t>a2+b2=c2</m:t>
-              </m:r>
-            </m:oMath>
+              <w:t xml:space="preserve">标题内包含 </w:t>
+            </w:r>
             <w:r>
               <w:rPr>
                 <w:rStyle w:val="ae"/>
                 <w:rFonts w:cs="宋体"/>
                 <w:b/>
-                <w:noProof/>
-              </w:rPr>
-              <w:t>和超链接hyperlink</w:t>
+                <w:strike/>
+                <w:noProof/>
+              </w:rPr>
+              <w:t>删除线</w:t>
+            </w:r>
+            <w:r>
+              <w:rPr>
+                <w:rStyle w:val="ae"/>
+                <w:rFonts w:cs="宋体"/>
+                <w:bCs/>
+                <w:noProof/>
+              </w:rPr>
+              <w:t xml:space="preserve"> </w:t>
+            </w:r>
+            <w:r>
+              <w:rPr>
+                <w:rStyle w:val="ae"/>
+                <w:rFonts w:cs="宋体"/>
+                <w:b/>
+                <w:i/>
+                <w:iCs/>
+                <w:noProof/>
+              </w:rPr>
+              <w:t xml:space="preserve">斜体 </w:t>
+            </w:r>
+            <w:r>
+              <w:rPr>
+                <w:rStyle w:val="ae"/>
+                <w:rFonts w:cs="宋体"/>
+                <w:b/>
+                <w:noProof/>
+              </w:rPr>
+              <w:t>下划线</w:t>
             </w:r>
             <w:r>
               <w:rPr>
@@ -1209,7 +1191,7 @@
                 <w:noProof/>
                 <w:webHidden/>
               </w:rPr>
-              <w:instrText xml:space="preserve"> PAGEREF _Toc223486232 \h </w:instrText>
+              <w:instrText xml:space="preserve"> PAGEREF _Toc223628863 \h </w:instrText>
             </w:r>
             <w:r>
               <w:rPr>
@@ -1254,7 +1236,7 @@
               <w14:ligatures w14:val="standardContextual"/>
             </w:rPr>
           </w:pPr>
-          <w:hyperlink w:anchor="_Toc223486233" w:history="1">
+          <w:hyperlink w:anchor="_Toc223628864" w:history="1">
             <w:r>
               <w:rPr>
                 <w:rStyle w:val="ae"/>
@@ -1263,6 +1245,118 @@
                 <w:noProof/>
               </w:rPr>
               <w:t>2.3.</w:t>
+            </w:r>
+            <w:r>
+              <w:rPr>
+                <w:rFonts w:asciiTheme="minorHAnsi" w:eastAsiaTheme="minorEastAsia" w:hAnsiTheme="minorHAnsi"/>
+                <w:noProof/>
+                <w:sz w:val="22"/>
+                <w:szCs w:val="24"/>
+                <w14:ligatures w14:val="standardContextual"/>
+              </w:rPr>
+              <w:tab/>
+            </w:r>
+            <w:r>
+              <w:rPr>
+                <w:rStyle w:val="ae"/>
+                <w:rFonts w:cs="宋体"/>
+                <w:b/>
+                <w:noProof/>
+              </w:rPr>
+              <w:t>标题内包含公式</w:t>
+            </w:r>
+            <m:oMath>
+              <m:r>
+                <w:rPr>
+                  <w:rStyle w:val="ae"/>
+                  <w:rFonts w:ascii="Cambria Math" w:hAnsi="Cambria Math" w:cs="宋体"/>
+                  <w:noProof/>
+                </w:rPr>
+                <m:t>a2+b2=c2</m:t>
+              </m:r>
+            </m:oMath>
+            <w:r>
+              <w:rPr>
+                <w:rStyle w:val="ae"/>
+                <w:rFonts w:cs="宋体"/>
+                <w:b/>
+                <w:noProof/>
+              </w:rPr>
+              <w:t>和超链接hyperlink</w:t>
+            </w:r>
+            <w:r>
+              <w:rPr>
+                <w:noProof/>
+                <w:webHidden/>
+              </w:rPr>
+              <w:tab/>
+            </w:r>
+            <w:r>
+              <w:rPr>
+                <w:noProof/>
+                <w:webHidden/>
+              </w:rPr>
+              <w:fldChar w:fldCharType="begin"/>
+            </w:r>
+            <w:r>
+              <w:rPr>
+                <w:noProof/>
+                <w:webHidden/>
+              </w:rPr>
+              <w:instrText xml:space="preserve"> PAGEREF _Toc223628864 \h </w:instrText>
+            </w:r>
+            <w:r>
+              <w:rPr>
+                <w:noProof/>
+                <w:webHidden/>
+              </w:rPr>
+            </w:r>
+            <w:r>
+              <w:rPr>
+                <w:noProof/>
+                <w:webHidden/>
+              </w:rPr>
+              <w:fldChar w:fldCharType="separate"/>
+            </w:r>
+            <w:r>
+              <w:rPr>
+                <w:noProof/>
+                <w:webHidden/>
+              </w:rPr>
+              <w:t>iv</w:t>
+            </w:r>
+            <w:r>
+              <w:rPr>
+                <w:noProof/>
+                <w:webHidden/>
+              </w:rPr>
+              <w:fldChar w:fldCharType="end"/>
+            </w:r>
+          </w:hyperlink>
+        </w:p>
+        <w:p>
+          <w:pPr>
+            <w:pStyle w:val="TOC2"/>
+            <w:tabs>
+              <w:tab w:val="left" w:pos="1100"/>
+            </w:tabs>
+            <w:rPr>
+              <w:rFonts w:asciiTheme="minorHAnsi" w:eastAsiaTheme="minorEastAsia" w:hAnsiTheme="minorHAnsi"/>
+              <w:noProof/>
+              <w:sz w:val="22"/>
+              <w:szCs w:val="24"/>
+              <w14:ligatures w14:val="standardContextual"/>
+            </w:rPr>
+          </w:pPr>
+          <w:hyperlink w:anchor="_Toc223628865" w:history="1">
+            <w:r>
+              <w:rPr>
+                <w:rStyle w:val="ae"/>
+                <w:rFonts w:cs="宋体"/>
+                <w:b/>
+                <w:noProof/>
+              </w:rPr>
+              <w:t>2.4.</w:t>
             </w:r>
             <w:r>
               <w:rPr>
@@ -1320,7 +1414,7 @@
                 <w:noProof/>
                 <w:webHidden/>
               </w:rPr>
-              <w:instrText xml:space="preserve"> PAGEREF _Toc223486233 \h </w:instrText>
+              <w:instrText xml:space="preserve"> PAGEREF _Toc223628865 \h </w:instrText>
             </w:r>
             <w:r>
               <w:rPr>
@@ -1366,7 +1460,7 @@
               <w14:ligatures w14:val="standardContextual"/>
             </w:rPr>
           </w:pPr>
-          <w:hyperlink w:anchor="_Toc223486234" w:history="1">
+          <w:hyperlink w:anchor="_Toc223628866" w:history="1">
             <w:r>
               <w:rPr>
                 <w:rStyle w:val="ae"/>
@@ -1394,7 +1488,7 @@
                 <w:noProof/>
                 <w:webHidden/>
               </w:rPr>
-              <w:instrText xml:space="preserve"> PAGEREF _Toc223486234 \h </w:instrText>
+              <w:instrText xml:space="preserve"> PAGEREF _Toc223628866 \h </w:instrText>
             </w:r>
             <w:r>
               <w:rPr>
@@ -1440,7 +1534,7 @@
               <w14:ligatures w14:val="standardContextual"/>
             </w:rPr>
           </w:pPr>
-          <w:hyperlink w:anchor="_Toc223486235" w:history="1">
+          <w:hyperlink w:anchor="_Toc223628867" w:history="1">
             <w:r>
               <w:rPr>
                 <w:rStyle w:val="ae"/>
@@ -1476,7 +1570,7 @@
                 <w:noProof/>
                 <w:webHidden/>
               </w:rPr>
-              <w:instrText xml:space="preserve"> PAGEREF _Toc223486235 \h </w:instrText>
+              <w:instrText xml:space="preserve"> PAGEREF _Toc223628867 \h </w:instrText>
             </w:r>
             <w:r>
               <w:rPr>
@@ -1521,7 +1615,7 @@
               <w14:ligatures w14:val="standardContextual"/>
             </w:rPr>
           </w:pPr>
-          <w:hyperlink w:anchor="_Toc223486236" w:history="1">
+          <w:hyperlink w:anchor="_Toc223628868" w:history="1">
             <w:r>
               <w:rPr>
                 <w:rStyle w:val="ae"/>
@@ -1565,7 +1659,7 @@
                 <w:noProof/>
                 <w:webHidden/>
               </w:rPr>
-              <w:instrText xml:space="preserve"> PAGEREF _Toc223486236 \h </w:instrText>
+              <w:instrText xml:space="preserve"> PAGEREF _Toc223628868 \h </w:instrText>
             </w:r>
             <w:r>
               <w:rPr>
@@ -1612,7 +1706,7 @@
               <w14:ligatures w14:val="standardContextual"/>
             </w:rPr>
           </w:pPr>
-          <w:hyperlink w:anchor="_Toc223486237" w:history="1">
+          <w:hyperlink w:anchor="_Toc223628869" w:history="1">
             <w:r>
               <w:rPr>
                 <w:rStyle w:val="ae"/>
@@ -1656,7 +1750,7 @@
                 <w:noProof/>
                 <w:webHidden/>
               </w:rPr>
-              <w:instrText xml:space="preserve"> PAGEREF _Toc223486237 \h </w:instrText>
+              <w:instrText xml:space="preserve"> PAGEREF _Toc223628869 \h </w:instrText>
             </w:r>
             <w:r>
               <w:rPr>
@@ -1703,7 +1797,7 @@
               <w14:ligatures w14:val="standardContextual"/>
             </w:rPr>
           </w:pPr>
-          <w:hyperlink w:anchor="_Toc223486238" w:history="1">
+          <w:hyperlink w:anchor="_Toc223628870" w:history="1">
             <w:r>
               <w:rPr>
                 <w:rStyle w:val="ae"/>
@@ -1747,7 +1841,7 @@
                 <w:noProof/>
                 <w:webHidden/>
               </w:rPr>
-              <w:instrText xml:space="preserve"> PAGEREF _Toc223486238 \h </w:instrText>
+              <w:instrText xml:space="preserve"> PAGEREF _Toc223628870 \h </w:instrText>
             </w:r>
             <w:r>
               <w:rPr>
@@ -1792,7 +1886,7 @@
               <w14:ligatures w14:val="standardContextual"/>
             </w:rPr>
           </w:pPr>
-          <w:hyperlink w:anchor="_Toc223486239" w:history="1">
+          <w:hyperlink w:anchor="_Toc223628871" w:history="1">
             <w:r>
               <w:rPr>
                 <w:rStyle w:val="ae"/>
@@ -1836,7 +1930,7 @@
                 <w:noProof/>
                 <w:webHidden/>
               </w:rPr>
-              <w:instrText xml:space="preserve"> PAGEREF _Toc223486239 \h </w:instrText>
+              <w:instrText xml:space="preserve"> PAGEREF _Toc223628871 \h </w:instrText>
             </w:r>
             <w:r>
               <w:rPr>
@@ -1883,7 +1977,7 @@
               <w14:ligatures w14:val="standardContextual"/>
             </w:rPr>
           </w:pPr>
-          <w:hyperlink w:anchor="_Toc223486240" w:history="1">
+          <w:hyperlink w:anchor="_Toc223628872" w:history="1">
             <w:r>
               <w:rPr>
                 <w:rStyle w:val="ae"/>
@@ -1927,7 +2021,7 @@
                 <w:noProof/>
                 <w:webHidden/>
               </w:rPr>
-              <w:instrText xml:space="preserve"> PAGEREF _Toc223486240 \h </w:instrText>
+              <w:instrText xml:space="preserve"> PAGEREF _Toc223628872 \h </w:instrText>
             </w:r>
             <w:r>
               <w:rPr>
@@ -1974,7 +2068,7 @@
               <w14:ligatures w14:val="standardContextual"/>
             </w:rPr>
           </w:pPr>
-          <w:hyperlink w:anchor="_Toc223486241" w:history="1">
+          <w:hyperlink w:anchor="_Toc223628873" w:history="1">
             <w:r>
               <w:rPr>
                 <w:rStyle w:val="ae"/>
@@ -2018,7 +2112,7 @@
                 <w:noProof/>
                 <w:webHidden/>
               </w:rPr>
-              <w:instrText xml:space="preserve"> PAGEREF _Toc223486241 \h </w:instrText>
+              <w:instrText xml:space="preserve"> PAGEREF _Toc223628873 \h </w:instrText>
             </w:r>
             <w:r>
               <w:rPr>
@@ -2065,7 +2159,7 @@
               <w14:ligatures w14:val="standardContextual"/>
             </w:rPr>
           </w:pPr>
-          <w:hyperlink w:anchor="_Toc223486242" w:history="1">
+          <w:hyperlink w:anchor="_Toc223628874" w:history="1">
             <w:r>
               <w:rPr>
                 <w:rStyle w:val="ae"/>
@@ -2109,7 +2203,7 @@
                 <w:noProof/>
                 <w:webHidden/>
               </w:rPr>
-              <w:instrText xml:space="preserve"> PAGEREF _Toc223486242 \h </w:instrText>
+              <w:instrText xml:space="preserve"> PAGEREF _Toc223628874 \h </w:instrText>
             </w:r>
             <w:r>
               <w:rPr>
@@ -2156,7 +2250,7 @@
               <w14:ligatures w14:val="standardContextual"/>
             </w:rPr>
           </w:pPr>
-          <w:hyperlink w:anchor="_Toc223486243" w:history="1">
+          <w:hyperlink w:anchor="_Toc223628875" w:history="1">
             <w:r>
               <w:rPr>
                 <w:rStyle w:val="ae"/>
@@ -2200,7 +2294,7 @@
                 <w:noProof/>
                 <w:webHidden/>
               </w:rPr>
-              <w:instrText xml:space="preserve"> PAGEREF _Toc223486243 \h </w:instrText>
+              <w:instrText xml:space="preserve"> PAGEREF _Toc223628875 \h </w:instrText>
             </w:r>
             <w:r>
               <w:rPr>
@@ -2247,7 +2341,7 @@
               <w14:ligatures w14:val="standardContextual"/>
             </w:rPr>
           </w:pPr>
-          <w:hyperlink w:anchor="_Toc223486244" w:history="1">
+          <w:hyperlink w:anchor="_Toc223628876" w:history="1">
             <w:r>
               <w:rPr>
                 <w:rStyle w:val="ae"/>
@@ -2291,7 +2385,7 @@
                 <w:noProof/>
                 <w:webHidden/>
               </w:rPr>
-              <w:instrText xml:space="preserve"> PAGEREF _Toc223486244 \h </w:instrText>
+              <w:instrText xml:space="preserve"> PAGEREF _Toc223628876 \h </w:instrText>
             </w:r>
             <w:r>
               <w:rPr>
@@ -2337,7 +2431,7 @@
               <w14:ligatures w14:val="standardContextual"/>
             </w:rPr>
           </w:pPr>
-          <w:hyperlink w:anchor="_Toc223486245" w:history="1">
+          <w:hyperlink w:anchor="_Toc223628877" w:history="1">
             <w:r>
               <w:rPr>
                 <w:rStyle w:val="ae"/>
@@ -2372,7 +2466,7 @@
                 <w:noProof/>
                 <w:webHidden/>
               </w:rPr>
-              <w:instrText xml:space="preserve"> PAGEREF _Toc223486245 \h </w:instrText>
+              <w:instrText xml:space="preserve"> PAGEREF _Toc223628877 \h </w:instrText>
             </w:r>
             <w:r>
               <w:rPr>
@@ -2417,7 +2511,7 @@
               <w14:ligatures w14:val="standardContextual"/>
             </w:rPr>
           </w:pPr>
-          <w:hyperlink w:anchor="_Toc223486246" w:history="1">
+          <w:hyperlink w:anchor="_Toc223628878" w:history="1">
             <w:r>
               <w:rPr>
                 <w:rStyle w:val="ae"/>
@@ -2461,7 +2555,7 @@
                 <w:noProof/>
                 <w:webHidden/>
               </w:rPr>
-              <w:instrText xml:space="preserve"> PAGEREF _Toc223486246 \h </w:instrText>
+              <w:instrText xml:space="preserve"> PAGEREF _Toc223628878 \h </w:instrText>
             </w:r>
             <w:r>
               <w:rPr>
@@ -2508,7 +2602,7 @@
               <w14:ligatures w14:val="standardContextual"/>
             </w:rPr>
           </w:pPr>
-          <w:hyperlink w:anchor="_Toc223486247" w:history="1">
+          <w:hyperlink w:anchor="_Toc223628879" w:history="1">
             <w:r>
               <w:rPr>
                 <w:rStyle w:val="ae"/>
@@ -2552,7 +2646,7 @@
                 <w:noProof/>
                 <w:webHidden/>
               </w:rPr>
-              <w:instrText xml:space="preserve"> PAGEREF _Toc223486247 \h </w:instrText>
+              <w:instrText xml:space="preserve"> PAGEREF _Toc223628879 \h </w:instrText>
             </w:r>
             <w:r>
               <w:rPr>
@@ -2599,7 +2693,7 @@
               <w14:ligatures w14:val="standardContextual"/>
             </w:rPr>
           </w:pPr>
-          <w:hyperlink w:anchor="_Toc223486248" w:history="1">
+          <w:hyperlink w:anchor="_Toc223628880" w:history="1">
             <w:r>
               <w:rPr>
                 <w:rStyle w:val="ae"/>
@@ -2643,7 +2737,7 @@
                 <w:noProof/>
                 <w:webHidden/>
               </w:rPr>
-              <w:instrText xml:space="preserve"> PAGEREF _Toc223486248 \h </w:instrText>
+              <w:instrText xml:space="preserve"> PAGEREF _Toc223628880 \h </w:instrText>
             </w:r>
             <w:r>
               <w:rPr>
@@ -2690,7 +2784,7 @@
               <w14:ligatures w14:val="standardContextual"/>
             </w:rPr>
           </w:pPr>
-          <w:hyperlink w:anchor="_Toc223486249" w:history="1">
+          <w:hyperlink w:anchor="_Toc223628881" w:history="1">
             <w:r>
               <w:rPr>
                 <w:rStyle w:val="ae"/>
@@ -2734,7 +2828,7 @@
                 <w:noProof/>
                 <w:webHidden/>
               </w:rPr>
-              <w:instrText xml:space="preserve"> PAGEREF _Toc223486249 \h </w:instrText>
+              <w:instrText xml:space="preserve"> PAGEREF _Toc223628881 \h </w:instrText>
             </w:r>
             <w:r>
               <w:rPr>
@@ -2781,7 +2875,7 @@
               <w14:ligatures w14:val="standardContextual"/>
             </w:rPr>
           </w:pPr>
-          <w:hyperlink w:anchor="_Toc223486250" w:history="1">
+          <w:hyperlink w:anchor="_Toc223628882" w:history="1">
             <w:r>
               <w:rPr>
                 <w:rStyle w:val="ae"/>
@@ -2825,7 +2919,7 @@
                 <w:noProof/>
                 <w:webHidden/>
               </w:rPr>
-              <w:instrText xml:space="preserve"> PAGEREF _Toc223486250 \h </w:instrText>
+              <w:instrText xml:space="preserve"> PAGEREF _Toc223628882 \h </w:instrText>
             </w:r>
             <w:r>
               <w:rPr>
@@ -2872,7 +2966,7 @@
               <w14:ligatures w14:val="standardContextual"/>
             </w:rPr>
           </w:pPr>
-          <w:hyperlink w:anchor="_Toc223486251" w:history="1">
+          <w:hyperlink w:anchor="_Toc223628883" w:history="1">
             <w:r>
               <w:rPr>
                 <w:rStyle w:val="ae"/>
@@ -2916,7 +3010,7 @@
                 <w:noProof/>
                 <w:webHidden/>
               </w:rPr>
-              <w:instrText xml:space="preserve"> PAGEREF _Toc223486251 \h </w:instrText>
+              <w:instrText xml:space="preserve"> PAGEREF _Toc223628883 \h </w:instrText>
             </w:r>
             <w:r>
               <w:rPr>
@@ -2963,7 +3057,7 @@
               <w14:ligatures w14:val="standardContextual"/>
             </w:rPr>
           </w:pPr>
-          <w:hyperlink w:anchor="_Toc223486252" w:history="1">
+          <w:hyperlink w:anchor="_Toc223628884" w:history="1">
             <w:r>
               <w:rPr>
                 <w:rStyle w:val="ae"/>
@@ -3007,7 +3101,7 @@
                 <w:noProof/>
                 <w:webHidden/>
               </w:rPr>
-              <w:instrText xml:space="preserve"> PAGEREF _Toc223486252 \h </w:instrText>
+              <w:instrText xml:space="preserve"> PAGEREF _Toc223628884 \h </w:instrText>
             </w:r>
             <w:r>
               <w:rPr>
@@ -3054,7 +3148,7 @@
               <w14:ligatures w14:val="standardContextual"/>
             </w:rPr>
           </w:pPr>
-          <w:hyperlink w:anchor="_Toc223486253" w:history="1">
+          <w:hyperlink w:anchor="_Toc223628885" w:history="1">
             <w:r>
               <w:rPr>
                 <w:rStyle w:val="ae"/>
@@ -3098,7 +3192,7 @@
                 <w:noProof/>
                 <w:webHidden/>
               </w:rPr>
-              <w:instrText xml:space="preserve"> PAGEREF _Toc223486253 \h </w:instrText>
+              <w:instrText xml:space="preserve"> PAGEREF _Toc223628885 \h </w:instrText>
             </w:r>
             <w:r>
               <w:rPr>
@@ -3143,7 +3237,7 @@
               <w14:ligatures w14:val="standardContextual"/>
             </w:rPr>
           </w:pPr>
-          <w:hyperlink w:anchor="_Toc223486254" w:history="1">
+          <w:hyperlink w:anchor="_Toc223628886" w:history="1">
             <w:r>
               <w:rPr>
                 <w:rStyle w:val="ae"/>
@@ -3187,7 +3281,7 @@
                 <w:noProof/>
                 <w:webHidden/>
               </w:rPr>
-              <w:instrText xml:space="preserve"> PAGEREF _Toc223486254 \h </w:instrText>
+              <w:instrText xml:space="preserve"> PAGEREF _Toc223628886 \h </w:instrText>
             </w:r>
             <w:r>
               <w:rPr>
@@ -3234,7 +3328,7 @@
               <w14:ligatures w14:val="standardContextual"/>
             </w:rPr>
           </w:pPr>
-          <w:hyperlink w:anchor="_Toc223486255" w:history="1">
+          <w:hyperlink w:anchor="_Toc223628887" w:history="1">
             <w:r>
               <w:rPr>
                 <w:rStyle w:val="ae"/>
@@ -3278,7 +3372,7 @@
                 <w:noProof/>
                 <w:webHidden/>
               </w:rPr>
-              <w:instrText xml:space="preserve"> PAGEREF _Toc223486255 \h </w:instrText>
+              <w:instrText xml:space="preserve"> PAGEREF _Toc223628887 \h </w:instrText>
             </w:r>
             <w:r>
               <w:rPr>
@@ -3325,7 +3419,7 @@
               <w14:ligatures w14:val="standardContextual"/>
             </w:rPr>
           </w:pPr>
-          <w:hyperlink w:anchor="_Toc223486256" w:history="1">
+          <w:hyperlink w:anchor="_Toc223628888" w:history="1">
             <w:r>
               <w:rPr>
                 <w:rStyle w:val="ae"/>
@@ -3369,7 +3463,7 @@
                 <w:noProof/>
                 <w:webHidden/>
               </w:rPr>
-              <w:instrText xml:space="preserve"> PAGEREF _Toc223486256 \h </w:instrText>
+              <w:instrText xml:space="preserve"> PAGEREF _Toc223628888 \h </w:instrText>
             </w:r>
             <w:r>
               <w:rPr>
@@ -3416,7 +3510,7 @@
               <w14:ligatures w14:val="standardContextual"/>
             </w:rPr>
           </w:pPr>
-          <w:hyperlink w:anchor="_Toc223486257" w:history="1">
+          <w:hyperlink w:anchor="_Toc223628889" w:history="1">
             <w:r>
               <w:rPr>
                 <w:rStyle w:val="ae"/>
@@ -3460,7 +3554,7 @@
                 <w:noProof/>
                 <w:webHidden/>
               </w:rPr>
-              <w:instrText xml:space="preserve"> PAGEREF _Toc223486257 \h </w:instrText>
+              <w:instrText xml:space="preserve"> PAGEREF _Toc223628889 \h </w:instrText>
             </w:r>
             <w:r>
               <w:rPr>
@@ -3507,7 +3601,7 @@
               <w14:ligatures w14:val="standardContextual"/>
             </w:rPr>
           </w:pPr>
-          <w:hyperlink w:anchor="_Toc223486258" w:history="1">
+          <w:hyperlink w:anchor="_Toc223628890" w:history="1">
             <w:r>
               <w:rPr>
                 <w:rStyle w:val="ae"/>
@@ -3553,7 +3647,7 @@
                 <w:noProof/>
                 <w:webHidden/>
               </w:rPr>
-              <w:instrText xml:space="preserve"> PAGEREF _Toc223486258 \h </w:instrText>
+              <w:instrText xml:space="preserve"> PAGEREF _Toc223628890 \h </w:instrText>
             </w:r>
             <w:r>
               <w:rPr>
@@ -3600,7 +3694,7 @@
               <w14:ligatures w14:val="standardContextual"/>
             </w:rPr>
           </w:pPr>
-          <w:hyperlink w:anchor="_Toc223486259" w:history="1">
+          <w:hyperlink w:anchor="_Toc223628891" w:history="1">
             <w:r>
               <w:rPr>
                 <w:rStyle w:val="ae"/>
@@ -3625,23 +3719,7 @@
                 <w:rFonts w:asciiTheme="majorEastAsia" w:hAnsiTheme="majorEastAsia"/>
                 <w:noProof/>
               </w:rPr>
-              <w:t>参</w:t>
-            </w:r>
-            <w:r>
-              <w:rPr>
-                <w:rStyle w:val="ae"/>
-                <w:rFonts w:asciiTheme="majorEastAsia" w:hAnsiTheme="majorEastAsia"/>
-                <w:noProof/>
-              </w:rPr>
-              <w:t>考</w:t>
-            </w:r>
-            <w:r>
-              <w:rPr>
-                <w:rStyle w:val="ae"/>
-                <w:rFonts w:asciiTheme="majorEastAsia" w:hAnsiTheme="majorEastAsia"/>
-                <w:noProof/>
-              </w:rPr>
-              <w:t>文献</w:t>
+              <w:t>参考文献</w:t>
             </w:r>
             <w:r>
               <w:rPr>
@@ -3662,7 +3740,7 @@
                 <w:noProof/>
                 <w:webHidden/>
               </w:rPr>
-              <w:instrText xml:space="preserve"> PAGEREF _Toc223486259 \h </w:instrText>
+              <w:instrText xml:space="preserve"> PAGEREF _Toc223628891 \h </w:instrText>
             </w:r>
             <w:r>
               <w:rPr>
@@ -3717,7 +3795,6 @@
       <w:pPr>
         <w:ind w:firstLine="422"/>
         <w:rPr>
-          <w:rFonts w:hint="eastAsia"/>
           <w:b/>
           <w:bCs/>
           <w:lang w:val="zh-CN"/>
@@ -3756,12 +3833,12 @@
         <w:jc w:val="left"/>
         <w:outlineLvl w:val="0"/>
         <w:rPr>
-          <w:rFonts w:ascii="宋体" w:eastAsia="宋体" w:hAnsi="宋体" w:cs="宋体" w:hint="eastAsia"/>
+          <w:rFonts w:ascii="宋体" w:eastAsia="宋体" w:hAnsi="宋体" w:cs="宋体"/>
           <w:b/>
           <w:sz w:val="32"/>
         </w:rPr>
       </w:pPr>
-      <w:bookmarkStart w:id="0" w:name="_Toc223486225"/>
+      <w:bookmarkStart w:id="0" w:name="_Toc223628856"/>
       <w:r>
         <w:rPr>
           <w:rFonts w:ascii="宋体" w:eastAsia="宋体" w:hAnsi="宋体" w:cs="宋体" w:hint="eastAsia"/>
@@ -3782,12 +3859,12 @@
         <w:jc w:val="left"/>
         <w:outlineLvl w:val="1"/>
         <w:rPr>
-          <w:rFonts w:ascii="宋体" w:eastAsia="宋体" w:hAnsi="宋体" w:cs="宋体" w:hint="eastAsia"/>
+          <w:rFonts w:ascii="宋体" w:eastAsia="宋体" w:hAnsi="宋体" w:cs="宋体"/>
           <w:b/>
           <w:sz w:val="32"/>
         </w:rPr>
       </w:pPr>
-      <w:bookmarkStart w:id="1" w:name="_Toc223486226"/>
+      <w:bookmarkStart w:id="1" w:name="_Toc223628857"/>
       <w:r>
         <w:rPr>
           <w:rFonts w:ascii="宋体" w:eastAsia="宋体" w:hAnsi="宋体" w:cs="宋体" w:hint="eastAsia"/>
@@ -3931,7 +4008,7 @@
         <w:spacing w:after="160" w:line="278" w:lineRule="auto"/>
         <w:jc w:val="left"/>
         <w:rPr>
-          <w:rFonts w:cs="Times New Roman (正文 CS 字体)" w:hint="eastAsia"/>
+          <w:rFonts w:cs="Times New Roman (正文 CS 字体)"/>
           <w:u w:val="single"/>
         </w:rPr>
       </w:pPr>
@@ -3954,18 +4031,18 @@
         <w:jc w:val="left"/>
         <w:outlineLvl w:val="1"/>
         <w:rPr>
+          <w:rFonts w:ascii="宋体" w:eastAsia="宋体" w:hAnsi="宋体" w:cs="宋体"/>
+          <w:b/>
+          <w:sz w:val="32"/>
+        </w:rPr>
+      </w:pPr>
+      <w:bookmarkStart w:id="2" w:name="_Toc223628858"/>
+      <w:r>
+        <w:rPr>
           <w:rFonts w:ascii="宋体" w:eastAsia="宋体" w:hAnsi="宋体" w:cs="宋体" w:hint="eastAsia"/>
           <w:b/>
           <w:sz w:val="32"/>
         </w:rPr>
-      </w:pPr>
-      <w:bookmarkStart w:id="2" w:name="_Toc223486227"/>
-      <w:r>
-        <w:rPr>
-          <w:rFonts w:ascii="宋体" w:eastAsia="宋体" w:hAnsi="宋体" w:cs="宋体" w:hint="eastAsia"/>
-          <w:b/>
-          <w:sz w:val="32"/>
-        </w:rPr>
         <w:t>带格式正文</w:t>
       </w:r>
       <w:bookmarkEnd w:id="2"/>
@@ -4014,7 +4091,7 @@
       </w:r>
     </w:p>
     <w:p>
-      <w:hyperlink r:id="rId16" w:history="1">
+      <w:hyperlink r:id="rId15" w:history="1">
         <w:r>
           <w:rPr>
             <w:rStyle w:val="ae"/>
@@ -4029,7 +4106,6 @@
     <w:p>
       <w:pPr>
         <w:rPr>
-          <w:rFonts w:hint="eastAsia"/>
           <w:strike/>
         </w:rPr>
       </w:pPr>
@@ -4049,7 +4125,7 @@
           <w:iCs/>
         </w:rPr>
       </w:pPr>
-      <w:hyperlink r:id="rId17" w:history="1">
+      <w:hyperlink r:id="rId16" w:history="1">
         <w:r>
           <w:rPr>
             <w:rStyle w:val="ae"/>
@@ -4155,7 +4231,7 @@
       <w:r>
         <w:t xml:space="preserve"> and </w:t>
       </w:r>
-      <w:hyperlink r:id="rId18" w:history="1">
+      <w:hyperlink r:id="rId17" w:history="1">
         <w:r>
           <w:rPr>
             <w:rStyle w:val="ae"/>
@@ -4174,29 +4250,19 @@
       <w:r>
         <w:t xml:space="preserve">Normal </w:t>
       </w:r>
-      <w:r>
-        <w:fldChar w:fldCharType="begin"/>
-      </w:r>
-      <w:r>
-        <w:instrText>HYPERLINK "https://github.com/opendatalab/MinerU"</w:instrText>
-      </w:r>
-      <w:r>
-        <w:fldChar w:fldCharType="separate"/>
-      </w:r>
-      <w:r>
-        <w:rPr>
-          <w:rStyle w:val="ae"/>
-          <w:b/>
-          <w:bCs/>
-          <w:i/>
-          <w:iCs/>
-          <w:strike/>
-        </w:rPr>
-        <w:t>italic bold underline strikethrough hyperlink</w:t>
-      </w:r>
-      <w:r>
-        <w:fldChar w:fldCharType="end"/>
-      </w:r>
+      <w:hyperlink r:id="rId18" w:history="1">
+        <w:r>
+          <w:rPr>
+            <w:rStyle w:val="ae"/>
+            <w:b/>
+            <w:bCs/>
+            <w:i/>
+            <w:iCs/>
+            <w:strike/>
+          </w:rPr>
+          <w:t>italic bold underline strikethrough hyperlink</w:t>
+        </w:r>
+      </w:hyperlink>
       <w:r>
         <w:t xml:space="preserve"> </w:t>
       </w:r>
@@ -4207,7 +4273,7 @@
     <w:p>
       <w:pPr>
         <w:rPr>
-          <w:rFonts w:cs="Times New Roman (正文 CS 字体)" w:hint="eastAsia"/>
+          <w:rFonts w:cs="Times New Roman (正文 CS 字体)"/>
           <w:em w:val="dot"/>
         </w:rPr>
       </w:pPr>
@@ -4243,12 +4309,12 @@
         <w:jc w:val="left"/>
         <w:outlineLvl w:val="1"/>
         <w:rPr>
-          <w:rFonts w:ascii="宋体" w:eastAsia="宋体" w:hAnsi="宋体" w:cs="宋体" w:hint="eastAsia"/>
+          <w:rFonts w:ascii="宋体" w:eastAsia="宋体" w:hAnsi="宋体" w:cs="宋体"/>
           <w:b/>
           <w:sz w:val="32"/>
         </w:rPr>
       </w:pPr>
-      <w:bookmarkStart w:id="3" w:name="_Toc223486228"/>
+      <w:bookmarkStart w:id="3" w:name="_Toc223628859"/>
       <w:r>
         <w:rPr>
           <w:rFonts w:ascii="宋体" w:eastAsia="宋体" w:hAnsi="宋体" w:cs="宋体" w:hint="eastAsia"/>
@@ -4360,7 +4426,6 @@
         </w:numPr>
         <w:jc w:val="left"/>
         <w:rPr>
-          <w:rFonts w:hint="eastAsia"/>
           <w:u w:val="single"/>
         </w:rPr>
       </w:pPr>
@@ -4431,7 +4496,6 @@
         </w:rPr>
         <w:t xml:space="preserve"> </w:t>
       </w:r>
-      <w:proofErr w:type="gramStart"/>
       <w:r>
         <w:rPr>
           <w:strike/>
@@ -4445,7 +4509,6 @@
         </w:rPr>
         <w:t>h</w:t>
       </w:r>
-      <w:proofErr w:type="gramEnd"/>
     </w:p>
     <w:p>
       <w:pPr>
@@ -4457,7 +4520,6 @@
         </w:numPr>
         <w:jc w:val="left"/>
         <w:rPr>
-          <w:rFonts w:hint="eastAsia"/>
           <w:u w:val="single"/>
         </w:rPr>
       </w:pPr>
@@ -4492,12 +4554,12 @@
         <w:jc w:val="left"/>
         <w:outlineLvl w:val="1"/>
         <w:rPr>
-          <w:rFonts w:ascii="宋体" w:eastAsia="宋体" w:hAnsi="宋体" w:cs="宋体" w:hint="eastAsia"/>
+          <w:rFonts w:ascii="宋体" w:eastAsia="宋体" w:hAnsi="宋体" w:cs="宋体"/>
           <w:b/>
           <w:sz w:val="32"/>
         </w:rPr>
       </w:pPr>
-      <w:bookmarkStart w:id="4" w:name="_Toc223486229"/>
+      <w:bookmarkStart w:id="4" w:name="_Toc223628860"/>
       <w:r>
         <w:rPr>
           <w:rFonts w:ascii="宋体" w:eastAsia="宋体" w:hAnsi="宋体" w:cs="宋体" w:hint="eastAsia"/>
@@ -4517,7 +4579,7 @@
         <w:spacing w:before="120" w:after="120" w:line="360" w:lineRule="auto"/>
         <w:jc w:val="left"/>
         <w:rPr>
-          <w:rFonts w:ascii="宋体" w:eastAsia="宋体" w:hAnsi="宋体" w:cs="宋体" w:hint="eastAsia"/>
+          <w:rFonts w:ascii="宋体" w:eastAsia="宋体" w:hAnsi="宋体" w:cs="宋体"/>
           <w:b/>
           <w:bCs/>
           <w:sz w:val="22"/>
@@ -4558,7 +4620,7 @@
         <w:spacing w:before="120" w:after="120" w:line="360" w:lineRule="auto"/>
         <w:jc w:val="left"/>
         <w:rPr>
-          <w:rFonts w:ascii="宋体" w:eastAsia="宋体" w:hAnsi="宋体" w:cs="宋体" w:hint="eastAsia"/>
+          <w:rFonts w:ascii="宋体" w:eastAsia="宋体" w:hAnsi="宋体" w:cs="宋体"/>
           <w:sz w:val="22"/>
           <w:u w:val="single"/>
         </w:rPr>
@@ -4609,56 +4671,24 @@
         </w:rPr>
         <w:t>无序列表项3：</w:t>
       </w:r>
-      <w:r>
-        <w:rPr>
-          <w:rFonts w:ascii="宋体" w:eastAsia="宋体" w:hAnsi="宋体" w:cs="宋体"/>
-          <w:sz w:val="22"/>
-        </w:rPr>
-        <w:fldChar w:fldCharType="begin"/>
-      </w:r>
-      <w:r>
-        <w:rPr>
-          <w:rFonts w:ascii="宋体" w:eastAsia="宋体" w:hAnsi="宋体" w:cs="宋体"/>
-          <w:sz w:val="22"/>
-        </w:rPr>
-        <w:instrText>HYPERLINK "https://github.com/opendatalab/MinerU"</w:instrText>
-      </w:r>
-      <w:r>
-        <w:rPr>
-          <w:rFonts w:ascii="宋体" w:eastAsia="宋体" w:hAnsi="宋体" w:cs="宋体"/>
-          <w:sz w:val="22"/>
-        </w:rPr>
-      </w:r>
-      <w:r>
-        <w:rPr>
-          <w:rFonts w:ascii="宋体" w:eastAsia="宋体" w:hAnsi="宋体" w:cs="宋体"/>
-          <w:sz w:val="22"/>
-        </w:rPr>
-        <w:fldChar w:fldCharType="separate"/>
-      </w:r>
-      <w:r>
-        <w:rPr>
-          <w:rStyle w:val="ae"/>
-          <w:rFonts w:ascii="宋体" w:eastAsia="宋体" w:hAnsi="宋体" w:cs="宋体"/>
-          <w:sz w:val="22"/>
-        </w:rPr>
-        <w:t>hyperlink</w:t>
-      </w:r>
-      <w:r>
-        <w:rPr>
-          <w:rStyle w:val="ae"/>
-          <w:rFonts w:ascii="宋体" w:eastAsia="宋体" w:hAnsi="宋体" w:cs="宋体" w:hint="eastAsia"/>
-          <w:sz w:val="22"/>
-        </w:rPr>
-        <w:t>超链接文本</w:t>
-      </w:r>
-      <w:r>
-        <w:rPr>
-          <w:rFonts w:ascii="宋体" w:eastAsia="宋体" w:hAnsi="宋体" w:cs="宋体"/>
-          <w:sz w:val="22"/>
-        </w:rPr>
-        <w:fldChar w:fldCharType="end"/>
-      </w:r>
+      <w:hyperlink r:id="rId19" w:history="1">
+        <w:r>
+          <w:rPr>
+            <w:rStyle w:val="ae"/>
+            <w:rFonts w:ascii="宋体" w:eastAsia="宋体" w:hAnsi="宋体" w:cs="宋体"/>
+            <w:sz w:val="22"/>
+          </w:rPr>
+          <w:t>hyperlink</w:t>
+        </w:r>
+        <w:r>
+          <w:rPr>
+            <w:rStyle w:val="ae"/>
+            <w:rFonts w:ascii="宋体" w:eastAsia="宋体" w:hAnsi="宋体" w:cs="宋体" w:hint="eastAsia"/>
+            <w:sz w:val="22"/>
+          </w:rPr>
+          <w:t>超链接文本</w:t>
+        </w:r>
+      </w:hyperlink>
     </w:p>
     <w:p>
       <w:pPr>
@@ -4712,7 +4742,7 @@
         <w:ind w:left="425" w:hanging="425"/>
         <w:jc w:val="left"/>
         <w:rPr>
-          <w:rFonts w:ascii="宋体" w:eastAsia="宋体" w:hAnsi="宋体" w:cs="宋体" w:hint="eastAsia"/>
+          <w:rFonts w:ascii="宋体" w:eastAsia="宋体" w:hAnsi="宋体" w:cs="宋体"/>
           <w:i/>
           <w:iCs/>
           <w:sz w:val="22"/>
@@ -4816,7 +4846,7 @@
         </w:rPr>
         <w:t xml:space="preserve"> </w:t>
       </w:r>
-      <w:hyperlink r:id="rId19" w:history="1">
+      <w:hyperlink r:id="rId20" w:history="1">
         <w:r>
           <w:rPr>
             <w:rStyle w:val="ae"/>
@@ -4851,7 +4881,7 @@
         <w:spacing w:before="120" w:after="120" w:line="360" w:lineRule="auto"/>
         <w:jc w:val="left"/>
         <w:rPr>
-          <w:rFonts w:ascii="宋体" w:eastAsia="宋体" w:hAnsi="宋体" w:cs="宋体" w:hint="eastAsia"/>
+          <w:rFonts w:ascii="宋体" w:eastAsia="宋体" w:hAnsi="宋体" w:cs="宋体"/>
           <w:i/>
           <w:iCs/>
           <w:sz w:val="22"/>
@@ -4864,73 +4894,19 @@
         </w:rPr>
         <w:t>无序列表项7：</w:t>
       </w:r>
-      <w:r>
-        <w:fldChar w:fldCharType="begin"/>
-      </w:r>
-      <w:r>
-        <w:instrText>HYPERLINK "https://mineru.net/"</w:instrText>
-      </w:r>
-      <w:r>
-        <w:fldChar w:fldCharType="separate"/>
-      </w:r>
-      <w:r>
-        <w:rPr>
-          <w:rStyle w:val="ae"/>
-          <w:b/>
-          <w:bCs/>
-          <w:i/>
-          <w:iCs/>
-          <w:strike/>
-        </w:rPr>
-        <w:t>italic bold underline strikethrou</w:t>
-      </w:r>
-      <w:r>
-        <w:rPr>
-          <w:rStyle w:val="ae"/>
-          <w:b/>
-          <w:bCs/>
-          <w:i/>
-          <w:iCs/>
-          <w:strike/>
-        </w:rPr>
-        <w:t>g</w:t>
-      </w:r>
-      <w:r>
-        <w:rPr>
-          <w:rStyle w:val="ae"/>
-          <w:b/>
-          <w:bCs/>
-          <w:i/>
-          <w:iCs/>
-          <w:strike/>
-        </w:rPr>
-        <w:t>h</w:t>
-      </w:r>
-      <w:r>
-        <w:rPr>
-          <w:rStyle w:val="ae"/>
-          <w:b/>
-          <w:bCs/>
-          <w:i/>
-          <w:iCs/>
-          <w:strike/>
-        </w:rPr>
-        <w:t xml:space="preserve"> </w:t>
-      </w:r>
-      <w:r>
-        <w:rPr>
-          <w:rStyle w:val="ae"/>
-          <w:b/>
-          <w:bCs/>
-          <w:i/>
-          <w:iCs/>
-          <w:strike/>
-        </w:rPr>
-        <w:t>hyperlink</w:t>
-      </w:r>
-      <w:r>
-        <w:fldChar w:fldCharType="end"/>
-      </w:r>
+      <w:hyperlink r:id="rId21" w:history="1">
+        <w:r>
+          <w:rPr>
+            <w:rStyle w:val="ae"/>
+            <w:b/>
+            <w:bCs/>
+            <w:i/>
+            <w:iCs/>
+            <w:strike/>
+          </w:rPr>
+          <w:t>italic bold underline strikethrough hyperlink</w:t>
+        </w:r>
+      </w:hyperlink>
     </w:p>
     <w:p>
       <w:pPr>
@@ -4947,7 +4923,7 @@
           <w:sz w:val="32"/>
         </w:rPr>
       </w:pPr>
-      <w:bookmarkStart w:id="6" w:name="_Toc223486230"/>
+      <w:bookmarkStart w:id="6" w:name="_Toc223628861"/>
       <w:bookmarkEnd w:id="5"/>
       <w:r>
         <w:rPr>
@@ -5114,7 +5090,7 @@
           <w:sz w:val="32"/>
         </w:rPr>
       </w:pPr>
-      <w:bookmarkStart w:id="7" w:name="_Toc223486231"/>
+      <w:bookmarkStart w:id="7" w:name="_Toc223628862"/>
       <w:r>
         <w:rPr>
           <w:rFonts w:ascii="宋体" w:eastAsia="宋体" w:hAnsi="宋体" w:cs="宋体" w:hint="eastAsia"/>
@@ -5123,63 +5099,18 @@
         </w:rPr>
         <w:t>标题内包含超链接</w:t>
       </w:r>
-      <w:r>
-        <w:rPr>
-          <w:rFonts w:ascii="宋体" w:eastAsia="宋体" w:hAnsi="宋体" w:cs="宋体"/>
-          <w:b/>
-          <w:sz w:val="32"/>
-        </w:rPr>
-        <w:fldChar w:fldCharType="begin"/>
-      </w:r>
-      <w:r>
-        <w:rPr>
-          <w:rFonts w:ascii="宋体" w:eastAsia="宋体" w:hAnsi="宋体" w:cs="宋体"/>
-          <w:b/>
-          <w:sz w:val="32"/>
-        </w:rPr>
-        <w:instrText>HYPERLINK "https://mineru.net/"</w:instrText>
-      </w:r>
-      <w:r>
-        <w:rPr>
-          <w:rFonts w:ascii="宋体" w:eastAsia="宋体" w:hAnsi="宋体" w:cs="宋体"/>
-          <w:b/>
-          <w:sz w:val="32"/>
-        </w:rPr>
-      </w:r>
-      <w:r>
-        <w:rPr>
-          <w:rFonts w:ascii="宋体" w:eastAsia="宋体" w:hAnsi="宋体" w:cs="宋体"/>
-          <w:b/>
-          <w:sz w:val="32"/>
-        </w:rPr>
-        <w:fldChar w:fldCharType="separate"/>
-      </w:r>
-      <w:r>
-        <w:rPr>
-          <w:rStyle w:val="ae"/>
-          <w:rFonts w:ascii="宋体" w:eastAsia="宋体" w:hAnsi="宋体" w:cs="宋体"/>
-          <w:b/>
-          <w:sz w:val="32"/>
-        </w:rPr>
-        <w:t>hyperlink</w:t>
-      </w:r>
-      <w:bookmarkEnd w:id="7"/>
-      <w:r>
-        <w:rPr>
-          <w:rFonts w:ascii="宋体" w:eastAsia="宋体" w:hAnsi="宋体" w:cs="宋体"/>
-          <w:b/>
-          <w:sz w:val="32"/>
-        </w:rPr>
-        <w:fldChar w:fldCharType="end"/>
-      </w:r>
-      <w:r>
-        <w:rPr>
-          <w:rFonts w:ascii="宋体" w:eastAsia="宋体" w:hAnsi="宋体" w:cs="宋体"/>
-          <w:b/>
-          <w:sz w:val="32"/>
-        </w:rPr>
-        <w:t xml:space="preserve"> </w:t>
-      </w:r>
+      <w:hyperlink r:id="rId22" w:history="1">
+        <w:r>
+          <w:rPr>
+            <w:rStyle w:val="ae"/>
+            <w:rFonts w:ascii="宋体" w:eastAsia="宋体" w:hAnsi="宋体" w:cs="宋体"/>
+            <w:b/>
+            <w:sz w:val="32"/>
+          </w:rPr>
+          <w:t>hyperlink</w:t>
+        </w:r>
+        <w:bookmarkEnd w:id="7"/>
+      </w:hyperlink>
     </w:p>
     <w:p>
       <w:pPr>
@@ -5191,12 +5122,92 @@
         <w:jc w:val="left"/>
         <w:outlineLvl w:val="1"/>
         <w:rPr>
+          <w:rFonts w:ascii="宋体" w:eastAsia="宋体" w:hAnsi="宋体" w:cs="宋体" w:hint="eastAsia"/>
+          <w:b/>
+          <w:sz w:val="32"/>
+        </w:rPr>
+      </w:pPr>
+      <w:bookmarkStart w:id="8" w:name="_Toc223628863"/>
+      <w:r>
+        <w:rPr>
+          <w:rFonts w:ascii="宋体" w:eastAsia="宋体" w:hAnsi="宋体" w:cs="宋体" w:hint="eastAsia"/>
+          <w:b/>
+          <w:sz w:val="32"/>
+        </w:rPr>
+        <w:t>标题内包含</w:t>
+      </w:r>
+      <w:r>
+        <w:rPr>
+          <w:rFonts w:ascii="宋体" w:eastAsia="宋体" w:hAnsi="宋体" w:cs="宋体" w:hint="eastAsia"/>
+          <w:b/>
+          <w:sz w:val="32"/>
+        </w:rPr>
+        <w:t xml:space="preserve"> </w:t>
+      </w:r>
+      <w:r>
+        <w:rPr>
+          <w:rFonts w:ascii="宋体" w:eastAsia="宋体" w:hAnsi="宋体" w:cs="宋体" w:hint="eastAsia"/>
+          <w:b/>
+          <w:strike/>
+          <w:sz w:val="32"/>
+        </w:rPr>
+        <w:t>删除线</w:t>
+      </w:r>
+      <w:r>
+        <w:rPr>
+          <w:rFonts w:ascii="宋体" w:eastAsia="宋体" w:hAnsi="宋体" w:cs="宋体" w:hint="eastAsia"/>
+          <w:bCs/>
+          <w:sz w:val="32"/>
+        </w:rPr>
+        <w:t xml:space="preserve"> </w:t>
+      </w:r>
+      <w:r>
+        <w:rPr>
+          <w:rFonts w:ascii="宋体" w:eastAsia="宋体" w:hAnsi="宋体" w:cs="宋体" w:hint="eastAsia"/>
+          <w:b/>
+          <w:i/>
+          <w:iCs/>
+          <w:sz w:val="32"/>
+        </w:rPr>
+        <w:t>斜体</w:t>
+      </w:r>
+      <w:r>
+        <w:rPr>
+          <w:rFonts w:ascii="宋体" w:eastAsia="宋体" w:hAnsi="宋体" w:cs="宋体" w:hint="eastAsia"/>
+          <w:b/>
+          <w:i/>
+          <w:iCs/>
+          <w:sz w:val="32"/>
+        </w:rPr>
+        <w:t xml:space="preserve"> </w:t>
+      </w:r>
+      <w:r>
+        <w:rPr>
+          <w:rFonts w:ascii="宋体" w:eastAsia="宋体" w:hAnsi="宋体" w:cs="宋体" w:hint="eastAsia"/>
+          <w:b/>
+          <w:sz w:val="32"/>
+          <w:u w:val="words"/>
+        </w:rPr>
+        <w:t>下划线</w:t>
+      </w:r>
+      <w:bookmarkEnd w:id="8"/>
+    </w:p>
+    <w:p>
+      <w:pPr>
+        <w:numPr>
+          <w:ilvl w:val="1"/>
+          <w:numId w:val="12"/>
+        </w:numPr>
+        <w:spacing w:before="320" w:after="120" w:line="360" w:lineRule="auto"/>
+        <w:jc w:val="left"/>
+        <w:outlineLvl w:val="1"/>
+        <w:rPr>
           <w:rFonts w:ascii="宋体" w:eastAsia="宋体" w:hAnsi="宋体" w:cs="宋体"/>
           <w:b/>
           <w:sz w:val="32"/>
         </w:rPr>
       </w:pPr>
-      <w:bookmarkStart w:id="8" w:name="_Toc223486232"/>
+      <w:bookmarkStart w:id="9" w:name="_Toc223628864"/>
       <w:r>
         <w:rPr>
           <w:rFonts w:ascii="宋体" w:eastAsia="宋体" w:hAnsi="宋体" w:cs="宋体" w:hint="eastAsia"/>
@@ -5313,55 +5324,18 @@
         </w:rPr>
         <w:t>和超链接</w:t>
       </w:r>
-      <w:r>
-        <w:rPr>
-          <w:rFonts w:ascii="宋体" w:eastAsia="宋体" w:hAnsi="宋体" w:cs="宋体"/>
-          <w:b/>
-          <w:sz w:val="32"/>
-        </w:rPr>
-        <w:fldChar w:fldCharType="begin"/>
-      </w:r>
-      <w:r>
-        <w:rPr>
-          <w:rFonts w:ascii="宋体" w:eastAsia="宋体" w:hAnsi="宋体" w:cs="宋体"/>
-          <w:b/>
-          <w:sz w:val="32"/>
-        </w:rPr>
-        <w:instrText>HYPERLINK "https://mineru.net/"</w:instrText>
-      </w:r>
-      <w:r>
-        <w:rPr>
-          <w:rFonts w:ascii="宋体" w:eastAsia="宋体" w:hAnsi="宋体" w:cs="宋体"/>
-          <w:b/>
-          <w:sz w:val="32"/>
-        </w:rPr>
-      </w:r>
-      <w:r>
-        <w:rPr>
-          <w:rFonts w:ascii="宋体" w:eastAsia="宋体" w:hAnsi="宋体" w:cs="宋体"/>
-          <w:b/>
-          <w:sz w:val="32"/>
-        </w:rPr>
-        <w:fldChar w:fldCharType="separate"/>
-      </w:r>
-      <w:r>
-        <w:rPr>
-          <w:rStyle w:val="ae"/>
-          <w:rFonts w:ascii="宋体" w:eastAsia="宋体" w:hAnsi="宋体" w:cs="宋体"/>
-          <w:b/>
-          <w:sz w:val="32"/>
-        </w:rPr>
-        <w:t>hyperlink</w:t>
-      </w:r>
-      <w:bookmarkEnd w:id="8"/>
-      <w:r>
-        <w:rPr>
-          <w:rFonts w:ascii="宋体" w:eastAsia="宋体" w:hAnsi="宋体" w:cs="宋体"/>
-          <w:b/>
-          <w:sz w:val="32"/>
-        </w:rPr>
-        <w:fldChar w:fldCharType="end"/>
-      </w:r>
+      <w:hyperlink r:id="rId23" w:history="1">
+        <w:r>
+          <w:rPr>
+            <w:rStyle w:val="ae"/>
+            <w:rFonts w:ascii="宋体" w:eastAsia="宋体" w:hAnsi="宋体" w:cs="宋体"/>
+            <w:b/>
+            <w:sz w:val="32"/>
+          </w:rPr>
+          <w:t>hyperlink</w:t>
+        </w:r>
+        <w:bookmarkEnd w:id="9"/>
+      </w:hyperlink>
     </w:p>
     <w:p>
       <w:pPr>
@@ -5378,7 +5352,7 @@
           <w:sz w:val="32"/>
         </w:rPr>
       </w:pPr>
-      <w:bookmarkStart w:id="9" w:name="_Toc223486233"/>
+      <w:bookmarkStart w:id="10" w:name="_Toc223628865"/>
       <w:r>
         <w:rPr>
           <w:rFonts w:ascii="宋体" w:eastAsia="宋体" w:hAnsi="宋体" w:cs="宋体" w:hint="eastAsia"/>
@@ -5565,7 +5539,7 @@
           </m:e>
         </m:nary>
       </m:oMath>
-      <w:bookmarkEnd w:id="9"/>
+      <w:bookmarkEnd w:id="10"/>
     </w:p>
     <w:p>
       <w:pPr>
@@ -5583,7 +5557,7 @@
           <w:szCs w:val="32"/>
         </w:rPr>
         <w:sectPr>
-          <w:footerReference w:type="default" r:id="rId20"/>
+          <w:footerReference w:type="default" r:id="rId24"/>
           <w:pgSz w:w="11906" w:h="16838"/>
           <w:pgMar w:top="1440" w:right="1800" w:bottom="1440" w:left="1800" w:header="851" w:footer="992" w:gutter="0"/>
           <w:pgNumType w:fmt="lowerRoman" w:start="1"/>
@@ -5602,7 +5576,7 @@
           <w:szCs w:val="32"/>
         </w:rPr>
       </w:pPr>
-      <w:bookmarkStart w:id="10" w:name="_Toc223486234"/>
+      <w:bookmarkStart w:id="11" w:name="_Toc223628866"/>
       <w:r>
         <w:rPr>
           <w:rFonts w:asciiTheme="majorEastAsia" w:hAnsiTheme="majorEastAsia" w:hint="eastAsia"/>
@@ -5612,14 +5586,11 @@
         <w:lastRenderedPageBreak/>
         <w:t>后面是正常的章节标题</w:t>
       </w:r>
-      <w:bookmarkEnd w:id="10"/>
+      <w:bookmarkEnd w:id="11"/>
     </w:p>
     <w:p>
       <w:pPr>
         <w:pStyle w:val="af9"/>
-        <w:rPr>
-          <w:rFonts w:hint="eastAsia"/>
-        </w:rPr>
       </w:pPr>
       <w:r>
         <w:rPr>
@@ -5645,12 +5616,11 @@
         <w:spacing w:before="200" w:after="200" w:line="360" w:lineRule="auto"/>
         <w:jc w:val="center"/>
         <w:rPr>
-          <w:rFonts w:hint="eastAsia"/>
           <w:sz w:val="32"/>
           <w:szCs w:val="32"/>
         </w:rPr>
       </w:pPr>
-      <w:bookmarkStart w:id="11" w:name="_Toc223486235"/>
+      <w:bookmarkStart w:id="12" w:name="_Toc223628867"/>
       <w:r>
         <w:rPr>
           <w:rFonts w:asciiTheme="majorEastAsia" w:hAnsiTheme="majorEastAsia" w:hint="eastAsia"/>
@@ -5675,7 +5645,7 @@
         </w:rPr>
         <w:t>第一章标题</w:t>
       </w:r>
-      <w:bookmarkEnd w:id="11"/>
+      <w:bookmarkEnd w:id="12"/>
     </w:p>
     <w:p>
       <w:pPr>
@@ -5686,7 +5656,7 @@
         </w:numPr>
         <w:ind w:left="880" w:hanging="440"/>
       </w:pPr>
-      <w:bookmarkStart w:id="12" w:name="_Toc223486236"/>
+      <w:bookmarkStart w:id="13" w:name="_Toc223628868"/>
       <w:r>
         <w:rPr>
           <w:rFonts w:hint="eastAsia"/>
@@ -5702,7 +5672,7 @@
         </w:rPr>
         <w:t>s</w:t>
       </w:r>
-      <w:bookmarkEnd w:id="12"/>
+      <w:bookmarkEnd w:id="13"/>
     </w:p>
     <w:p>
       <w:pPr>
@@ -5711,21 +5681,18 @@
           <w:ilvl w:val="2"/>
           <w:numId w:val="4"/>
         </w:numPr>
+      </w:pPr>
+      <w:bookmarkStart w:id="14" w:name="_Toc223628869"/>
+      <w:r>
+        <w:t>Grouped image</w:t>
+      </w:r>
+      <w:r>
         <w:rPr>
           <w:rFonts w:hint="eastAsia"/>
         </w:rPr>
-      </w:pPr>
-      <w:bookmarkStart w:id="13" w:name="_Toc223486237"/>
-      <w:r>
-        <w:t>Grouped image</w:t>
-      </w:r>
-      <w:r>
-        <w:rPr>
-          <w:rFonts w:hint="eastAsia"/>
-        </w:rPr>
         <w:t>s</w:t>
       </w:r>
-      <w:bookmarkEnd w:id="13"/>
+      <w:bookmarkEnd w:id="14"/>
     </w:p>
     <w:p>
       <w:r>
@@ -5768,7 +5735,7 @@
                           </pic:cNvPicPr>
                         </pic:nvPicPr>
                         <pic:blipFill>
-                          <a:blip r:embed="rId21" cstate="print">
+                          <a:blip r:embed="rId25" cstate="print">
                             <a:extLst>
                               <a:ext uri="{28A0092B-C50C-407E-A947-70E740481C1C}">
                                 <a14:useLocalDpi xmlns:a14="http://schemas.microsoft.com/office/drawing/2010/main" val="0"/>
@@ -5801,7 +5768,7 @@
                           </pic:cNvPicPr>
                         </pic:nvPicPr>
                         <pic:blipFill>
-                          <a:blip r:embed="rId22">
+                          <a:blip r:embed="rId26">
                             <a:extLst>
                               <a:ext uri="{28A0092B-C50C-407E-A947-70E740481C1C}">
                                 <a14:useLocalDpi xmlns:a14="http://schemas.microsoft.com/office/drawing/2010/main" val="0"/>
@@ -5856,11 +5823,11 @@
                   <o:lock v:ext="edit" aspectratio="t"/>
                 </v:shapetype>
                 <v:shape id="Picture 1" o:spid="_x0000_s1027" type="#_x0000_t75" style="position:absolute;width:10604;height:10604;visibility:visible;mso-wrap-style:square" o:gfxdata="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" stroked="t" strokecolor="#156082 [3204]">
-                  <v:imagedata r:id="rId23" o:title=""/>
+                  <v:imagedata r:id="rId27" o:title=""/>
                   <v:path arrowok="t"/>
                 </v:shape>
                 <v:shape id="Picture 2" o:spid="_x0000_s1028" type="#_x0000_t75" style="position:absolute;left:10951;width:10605;height:10604;visibility:visible;mso-wrap-style:square" o:gfxdata="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" stroked="t" strokecolor="#156082 [3204]">
-                  <v:imagedata r:id="rId24" o:title=""/>
+                  <v:imagedata r:id="rId28" o:title=""/>
                   <v:path arrowok="t"/>
                 </v:shape>
                 <w10:wrap type="topAndBottom"/>
@@ -5880,27 +5847,24 @@
           <w:ilvl w:val="2"/>
           <w:numId w:val="4"/>
         </w:numPr>
+      </w:pPr>
+      <w:bookmarkStart w:id="15" w:name="_Toc223628870"/>
+      <w:r>
         <w:rPr>
           <w:rFonts w:hint="eastAsia"/>
         </w:rPr>
-      </w:pPr>
-      <w:bookmarkStart w:id="14" w:name="_Toc223486238"/>
+        <w:t>Ung</w:t>
+      </w:r>
+      <w:r>
+        <w:t>rouped image</w:t>
+      </w:r>
       <w:r>
         <w:rPr>
           <w:rFonts w:hint="eastAsia"/>
         </w:rPr>
-        <w:t>Ung</w:t>
-      </w:r>
-      <w:r>
-        <w:t>rouped image</w:t>
-      </w:r>
-      <w:r>
-        <w:rPr>
-          <w:rFonts w:hint="eastAsia"/>
-        </w:rPr>
         <w:t>s</w:t>
       </w:r>
-      <w:bookmarkEnd w:id="14"/>
+      <w:bookmarkEnd w:id="15"/>
     </w:p>
     <w:p>
       <w:r>
@@ -5923,11 +5887,6 @@
       </w:r>
     </w:p>
     <w:p>
-      <w:pPr>
-        <w:rPr>
-          <w:rFonts w:hint="eastAsia"/>
-        </w:rPr>
-      </w:pPr>
       <w:r>
         <w:rPr>
           <w:rFonts w:hint="eastAsia"/>
@@ -5950,7 +5909,7 @@
                     <pic:cNvPicPr/>
                   </pic:nvPicPr>
                   <pic:blipFill>
-                    <a:blip r:embed="rId25" cstate="print">
+                    <a:blip r:embed="rId29" cstate="print">
                       <a:extLst>
                         <a:ext uri="{28A0092B-C50C-407E-A947-70E740481C1C}">
                           <a14:useLocalDpi xmlns:a14="http://schemas.microsoft.com/office/drawing/2010/main" val="0"/>
@@ -5998,7 +5957,7 @@
                     <pic:cNvPicPr/>
                   </pic:nvPicPr>
                   <pic:blipFill>
-                    <a:blip r:embed="rId26" cstate="print">
+                    <a:blip r:embed="rId30" cstate="print">
                       <a:extLst>
                         <a:ext uri="{28A0092B-C50C-407E-A947-70E740481C1C}">
                           <a14:useLocalDpi xmlns:a14="http://schemas.microsoft.com/office/drawing/2010/main" val="0"/>
@@ -6034,14 +5993,14 @@
         </w:numPr>
         <w:ind w:left="880" w:hanging="440"/>
       </w:pPr>
-      <w:bookmarkStart w:id="15" w:name="_Toc223486239"/>
+      <w:bookmarkStart w:id="16" w:name="_Toc223628871"/>
       <w:r>
         <w:rPr>
           <w:rFonts w:hint="eastAsia"/>
         </w:rPr>
         <w:t>Many Tables</w:t>
       </w:r>
-      <w:bookmarkEnd w:id="15"/>
+      <w:bookmarkEnd w:id="16"/>
     </w:p>
     <w:p>
       <w:pPr>
@@ -6051,7 +6010,7 @@
           <w:numId w:val="4"/>
         </w:numPr>
       </w:pPr>
-      <w:bookmarkStart w:id="16" w:name="_Toc223486240"/>
+      <w:bookmarkStart w:id="17" w:name="_Toc223628872"/>
       <w:r>
         <w:t>Table with rich cell</w:t>
       </w:r>
@@ -6061,7 +6020,7 @@
         </w:rPr>
         <w:t>s</w:t>
       </w:r>
-      <w:bookmarkEnd w:id="16"/>
+      <w:bookmarkEnd w:id="17"/>
     </w:p>
     <w:tbl>
       <w:tblPr>
@@ -6373,59 +6332,44 @@
         </w:tc>
       </w:tr>
     </w:tbl>
+    <w:p/>
+    <w:p/>
     <w:p>
       <w:pPr>
+        <w:pStyle w:val="3"/>
+      </w:pPr>
+      <w:bookmarkStart w:id="18" w:name="_Toc223628873"/>
+      <w:r>
         <w:rPr>
           <w:rFonts w:hint="eastAsia"/>
         </w:rPr>
-      </w:pPr>
-    </w:p>
-    <w:p>
-      <w:pPr>
+        <w:t>1.</w:t>
+      </w:r>
+      <w:r>
+        <w:t>2</w:t>
+      </w:r>
+      <w:r>
         <w:rPr>
           <w:rFonts w:hint="eastAsia"/>
         </w:rPr>
-      </w:pPr>
-    </w:p>
-    <w:p>
-      <w:pPr>
-        <w:pStyle w:val="3"/>
+        <w:t>.</w:t>
+      </w:r>
+      <w:r>
+        <w:t>2</w:t>
+      </w:r>
+      <w:r>
+        <w:tab/>
+      </w:r>
+      <w:r>
+        <w:t>Table with nested tabl</w:t>
+      </w:r>
+      <w:r>
         <w:rPr>
           <w:rFonts w:hint="eastAsia"/>
         </w:rPr>
-      </w:pPr>
-      <w:bookmarkStart w:id="17" w:name="_Toc223486241"/>
-      <w:r>
-        <w:rPr>
-          <w:rFonts w:hint="eastAsia"/>
-        </w:rPr>
-        <w:t>1.</w:t>
-      </w:r>
-      <w:r>
-        <w:t>2</w:t>
-      </w:r>
-      <w:r>
-        <w:rPr>
-          <w:rFonts w:hint="eastAsia"/>
-        </w:rPr>
-        <w:t>.</w:t>
-      </w:r>
-      <w:r>
-        <w:t>2</w:t>
-      </w:r>
-      <w:r>
-        <w:tab/>
-      </w:r>
-      <w:r>
-        <w:t>Table with nested tabl</w:t>
-      </w:r>
-      <w:r>
-        <w:rPr>
-          <w:rFonts w:hint="eastAsia"/>
-        </w:rPr>
         <w:t>e</w:t>
       </w:r>
-      <w:bookmarkEnd w:id="17"/>
+      <w:bookmarkEnd w:id="18"/>
     </w:p>
     <w:p>
       <w:r>
@@ -6842,22 +6786,16 @@
         <w:t xml:space="preserve"> formatting</w:t>
       </w:r>
     </w:p>
+    <w:p/>
     <w:p>
       <w:pPr>
+        <w:pStyle w:val="3"/>
+      </w:pPr>
+      <w:bookmarkStart w:id="19" w:name="_Toc223628874"/>
+      <w:r>
         <w:rPr>
           <w:rFonts w:hint="eastAsia"/>
         </w:rPr>
-      </w:pPr>
-    </w:p>
-    <w:p>
-      <w:pPr>
-        <w:pStyle w:val="3"/>
-      </w:pPr>
-      <w:bookmarkStart w:id="18" w:name="_Toc223486242"/>
-      <w:r>
-        <w:rPr>
-          <w:rFonts w:hint="eastAsia"/>
-        </w:rPr>
         <w:t>1.2.3</w:t>
       </w:r>
       <w:r>
@@ -6866,7 +6804,7 @@
       <w:r>
         <w:t>Table with picture</w:t>
       </w:r>
-      <w:bookmarkEnd w:id="18"/>
+      <w:bookmarkEnd w:id="19"/>
     </w:p>
     <w:tbl>
       <w:tblPr>
@@ -6947,7 +6885,7 @@
                           </pic:cNvPicPr>
                         </pic:nvPicPr>
                         <pic:blipFill>
-                          <a:blip r:embed="rId27" cstate="print">
+                          <a:blip r:embed="rId31" cstate="print">
                             <a:extLst>
                               <a:ext uri="{28A0092B-C50C-407E-A947-70E740481C1C}">
                                 <a14:useLocalDpi xmlns:a14="http://schemas.microsoft.com/office/drawing/2010/main" val="0"/>
@@ -7025,7 +6963,7 @@
                           </pic:cNvPicPr>
                         </pic:nvPicPr>
                         <pic:blipFill>
-                          <a:blip r:embed="rId28" cstate="print">
+                          <a:blip r:embed="rId32" cstate="print">
                             <a:extLst>
                               <a:ext uri="{28A0092B-C50C-407E-A947-70E740481C1C}">
                                 <a14:useLocalDpi xmlns:a14="http://schemas.microsoft.com/office/drawing/2010/main" val="0"/>
@@ -7068,24 +7006,18 @@
         </w:tc>
       </w:tr>
     </w:tbl>
+    <w:p/>
     <w:p>
       <w:pPr>
-        <w:rPr>
-          <w:rFonts w:hint="eastAsia"/>
-        </w:rPr>
-      </w:pPr>
-    </w:p>
-    <w:p>
-      <w:pPr>
         <w:pStyle w:val="3"/>
         <w:rPr>
-          <w:rFonts w:asciiTheme="minorEastAsia" w:eastAsiaTheme="minorEastAsia" w:hAnsiTheme="minorEastAsia" w:hint="eastAsia"/>
+          <w:rFonts w:asciiTheme="minorEastAsia" w:eastAsiaTheme="minorEastAsia" w:hAnsiTheme="minorEastAsia"/>
           <w:b/>
           <w:bCs/>
           <w:szCs w:val="21"/>
         </w:rPr>
       </w:pPr>
-      <w:bookmarkStart w:id="19" w:name="_Toc223486243"/>
+      <w:bookmarkStart w:id="20" w:name="_Toc223628875"/>
       <w:r>
         <w:rPr>
           <w:rFonts w:hint="eastAsia"/>
@@ -7107,7 +7039,7 @@
         </w:rPr>
         <w:t>Table with equations</w:t>
       </w:r>
-      <w:bookmarkEnd w:id="19"/>
+      <w:bookmarkEnd w:id="20"/>
     </w:p>
     <w:tbl>
       <w:tblPr>
@@ -7433,47 +7365,39 @@
         <w:snapToGrid w:val="0"/>
         <w:spacing w:line="540" w:lineRule="exact"/>
         <w:rPr>
-          <w:rFonts w:asciiTheme="minorEastAsia" w:hAnsiTheme="minorEastAsia" w:hint="eastAsia"/>
+          <w:rFonts w:asciiTheme="minorEastAsia" w:hAnsiTheme="minorEastAsia"/>
         </w:rPr>
       </w:pPr>
     </w:p>
     <w:p>
       <w:pPr>
         <w:pStyle w:val="3"/>
+      </w:pPr>
+      <w:bookmarkStart w:id="21" w:name="_Toc223628876"/>
+      <w:r>
         <w:rPr>
           <w:rFonts w:hint="eastAsia"/>
         </w:rPr>
-      </w:pPr>
-      <w:bookmarkStart w:id="20" w:name="_Toc223486244"/>
+        <w:t>1.</w:t>
+      </w:r>
       <w:r>
         <w:rPr>
           <w:rFonts w:hint="eastAsia"/>
         </w:rPr>
-        <w:t>1.</w:t>
+        <w:t>2.5</w:t>
+      </w:r>
+      <w:r>
+        <w:tab/>
       </w:r>
       <w:r>
         <w:rPr>
           <w:rFonts w:hint="eastAsia"/>
         </w:rPr>
-        <w:t>2.5</w:t>
-      </w:r>
-      <w:r>
-        <w:tab/>
-      </w:r>
-      <w:r>
-        <w:rPr>
-          <w:rFonts w:hint="eastAsia"/>
-        </w:rPr>
         <w:t>Tables</w:t>
       </w:r>
-      <w:bookmarkEnd w:id="20"/>
+      <w:bookmarkEnd w:id="21"/>
     </w:p>
     <w:p>
-      <w:pPr>
-        <w:rPr>
-          <w:rFonts w:hint="eastAsia"/>
-        </w:rPr>
-      </w:pPr>
       <w:r>
         <w:rPr>
           <w:rFonts w:hint="eastAsia"/>
@@ -7610,11 +7534,6 @@
     </w:tbl>
     <w:p/>
     <w:p>
-      <w:pPr>
-        <w:rPr>
-          <w:rFonts w:hint="eastAsia"/>
-        </w:rPr>
-      </w:pPr>
       <w:r>
         <w:rPr>
           <w:rFonts w:hint="eastAsia"/>
@@ -7804,7 +7723,7 @@
         <w:snapToGrid w:val="0"/>
         <w:spacing w:line="360" w:lineRule="auto"/>
         <w:rPr>
-          <w:rFonts w:asciiTheme="minorEastAsia" w:hAnsiTheme="minorEastAsia" w:hint="eastAsia"/>
+          <w:rFonts w:asciiTheme="minorEastAsia" w:hAnsiTheme="minorEastAsia"/>
         </w:rPr>
       </w:pPr>
       <w:r>
@@ -7878,7 +7797,6 @@
                 <w:b/>
               </w:rPr>
             </w:pPr>
-            <w:proofErr w:type="spellStart"/>
             <w:r>
               <w:rPr>
                 <w:rFonts w:hint="eastAsia"/>
@@ -7900,7 +7818,6 @@
               </w:rPr>
               <w:t>基本情况</w:t>
             </w:r>
-            <w:proofErr w:type="spellEnd"/>
           </w:p>
         </w:tc>
       </w:tr>
@@ -7948,7 +7865,6 @@
               <w:spacing w:line="360" w:lineRule="auto"/>
               <w:jc w:val="center"/>
             </w:pPr>
-            <w:proofErr w:type="spellStart"/>
             <w:r>
               <w:rPr>
                 <w:rFonts w:hint="eastAsia"/>
@@ -7956,7 +7872,6 @@
               </w:rPr>
               <w:t>MinerU</w:t>
             </w:r>
-            <w:proofErr w:type="spellEnd"/>
           </w:p>
         </w:tc>
         <w:tc>
@@ -8040,15 +7955,20 @@
             <w:r>
               <w:rPr>
                 <w:rFonts w:hint="eastAsia"/>
+                <w:lang w:eastAsia="zh-CN"/>
               </w:rPr>
               <w:t>一寸照片（不超过5</w:t>
             </w:r>
             <w:r>
+              <w:rPr>
+                <w:lang w:eastAsia="zh-CN"/>
+              </w:rPr>
               <w:t>0MB</w:t>
             </w:r>
             <w:r>
               <w:rPr>
                 <w:rFonts w:hint="eastAsia"/>
+                <w:lang w:eastAsia="zh-CN"/>
               </w:rPr>
               <w:t>）</w:t>
             </w:r>
@@ -8058,15 +7978,13 @@
               <w:spacing w:line="360" w:lineRule="auto"/>
               <w:jc w:val="center"/>
               <w:rPr>
+                <w:lang w:eastAsia="zh-CN"/>
+              </w:rPr>
+            </w:pPr>
+            <w:r>
+              <w:rPr>
                 <w:rFonts w:hint="eastAsia"/>
-                <w:lang w:eastAsia="zh-CN"/>
-              </w:rPr>
-            </w:pPr>
-            <w:r>
-              <w:rPr>
-                <w:rFonts w:hint="eastAsia"/>
-                <w:noProof/>
-                <w:lang w:eastAsia="zh-CN"/>
+                <w:noProof/>
                 <w14:ligatures w14:val="standardContextual"/>
               </w:rPr>
               <w:drawing>
@@ -8085,7 +8003,7 @@
                           <pic:cNvPicPr/>
                         </pic:nvPicPr>
                         <pic:blipFill>
-                          <a:blip r:embed="rId29">
+                          <a:blip r:embed="rId33">
                             <a:extLst>
                               <a:ext uri="{28A0092B-C50C-407E-A947-70E740481C1C}">
                                 <a14:useLocalDpi xmlns:a14="http://schemas.microsoft.com/office/drawing/2010/main" val="0"/>
@@ -8702,36 +8620,32 @@
               <w:spacing w:line="360" w:lineRule="auto"/>
               <w:rPr>
                 <w:b/>
+                <w:lang w:eastAsia="zh-CN"/>
               </w:rPr>
             </w:pPr>
-            <w:r>
-              <w:rPr>
-                <w:rFonts w:hint="eastAsia"/>
-                <w:b/>
-              </w:rPr>
-              <w:t>主申请人</w:t>
-            </w:r>
-            <w:r>
-              <w:rPr>
-                <w:rFonts w:ascii="宋体" w:eastAsia="宋体" w:hAnsi="宋体" w:hint="eastAsia"/>
-                <w:b/>
-              </w:rPr>
-              <w:t>-</w:t>
-            </w:r>
-            <w:r>
-              <w:rPr>
-                <w:rFonts w:hint="eastAsia"/>
-                <w:b/>
-              </w:rPr>
-              <w:t>户籍迁移及档案情况</w:t>
-            </w:r>
             <w:r>
               <w:rPr>
                 <w:rFonts w:hint="eastAsia"/>
                 <w:b/>
                 <w:lang w:eastAsia="zh-CN"/>
               </w:rPr>
-              <w:t>（严格按照户口本首页信息填写）</w:t>
+              <w:t>主申请人</w:t>
+            </w:r>
+            <w:r>
+              <w:rPr>
+                <w:rFonts w:ascii="宋体" w:eastAsia="宋体" w:hAnsi="宋体" w:hint="eastAsia"/>
+                <w:b/>
+                <w:lang w:eastAsia="zh-CN"/>
+              </w:rPr>
+              <w:t>-</w:t>
+            </w:r>
+            <w:r>
+              <w:rPr>
+                <w:rFonts w:hint="eastAsia"/>
+                <w:b/>
+                <w:lang w:eastAsia="zh-CN"/>
+              </w:rPr>
+              <w:t>户籍迁移及档案情况（严格按照户口本首页信息填写）</w:t>
             </w:r>
           </w:p>
         </w:tc>
@@ -8977,6 +8891,11 @@
             </w:tcBorders>
           </w:tcPr>
           <w:p>
+            <w:pPr>
+              <w:rPr>
+                <w:lang w:eastAsia="zh-CN"/>
+              </w:rPr>
+            </w:pPr>
             <w:r>
               <w:rPr>
                 <w:rFonts w:hint="eastAsia"/>
@@ -9011,6 +8930,9 @@
             <w:pPr>
               <w:spacing w:line="360" w:lineRule="auto"/>
               <w:jc w:val="center"/>
+              <w:rPr>
+                <w:lang w:eastAsia="zh-CN"/>
+              </w:rPr>
             </w:pPr>
           </w:p>
         </w:tc>
@@ -9162,12 +9084,14 @@
               <w:spacing w:line="360" w:lineRule="auto"/>
               <w:rPr>
                 <w:b/>
+                <w:lang w:eastAsia="zh-CN"/>
               </w:rPr>
             </w:pPr>
             <w:r>
               <w:rPr>
                 <w:rFonts w:hint="eastAsia"/>
                 <w:b/>
+                <w:lang w:eastAsia="zh-CN"/>
               </w:rPr>
               <w:t>主申请人</w:t>
             </w:r>
@@ -9175,6 +9099,7 @@
               <w:rPr>
                 <w:rFonts w:ascii="宋体" w:eastAsia="宋体" w:hAnsi="宋体" w:hint="eastAsia"/>
                 <w:b/>
+                <w:lang w:eastAsia="zh-CN"/>
               </w:rPr>
               <w:t>-</w:t>
             </w:r>
@@ -9182,6 +9107,7 @@
               <w:rPr>
                 <w:rFonts w:hint="eastAsia"/>
                 <w:b/>
+                <w:lang w:eastAsia="zh-CN"/>
               </w:rPr>
               <w:t>教育经历（从大学顺序填起，特殊人才可从中学或相应的职业教育顺序填起）</w:t>
             </w:r>
@@ -9722,12 +9648,14 @@
               <w:spacing w:line="360" w:lineRule="auto"/>
               <w:rPr>
                 <w:b/>
+                <w:lang w:eastAsia="zh-CN"/>
               </w:rPr>
             </w:pPr>
             <w:r>
               <w:rPr>
                 <w:rFonts w:hint="eastAsia"/>
                 <w:b/>
+                <w:lang w:eastAsia="zh-CN"/>
               </w:rPr>
               <w:t>主申请人</w:t>
             </w:r>
@@ -9735,6 +9663,7 @@
               <w:rPr>
                 <w:rFonts w:ascii="宋体" w:eastAsia="宋体" w:hAnsi="宋体" w:hint="eastAsia"/>
                 <w:b/>
+                <w:lang w:eastAsia="zh-CN"/>
               </w:rPr>
               <w:t>-</w:t>
             </w:r>
@@ -9742,6 +9671,7 @@
               <w:rPr>
                 <w:rFonts w:hint="eastAsia"/>
                 <w:b/>
+                <w:lang w:eastAsia="zh-CN"/>
               </w:rPr>
               <w:t>工作经历（从初次参加工作顺序填写，待业请填写在工作经历中，填写待业及时间段）</w:t>
             </w:r>
@@ -9771,10 +9701,14 @@
             <w:pPr>
               <w:spacing w:line="360" w:lineRule="auto"/>
               <w:jc w:val="center"/>
+              <w:rPr>
+                <w:lang w:eastAsia="zh-CN"/>
+              </w:rPr>
             </w:pPr>
             <w:r>
               <w:rPr>
                 <w:rFonts w:hint="eastAsia"/>
+                <w:lang w:eastAsia="zh-CN"/>
               </w:rPr>
               <w:t>起止时间</w:t>
             </w:r>
@@ -9783,6 +9717,9 @@
             <w:pPr>
               <w:spacing w:line="360" w:lineRule="auto"/>
               <w:jc w:val="center"/>
+              <w:rPr>
+                <w:lang w:eastAsia="zh-CN"/>
+              </w:rPr>
             </w:pPr>
             <w:r>
               <w:rPr>
@@ -9820,10 +9757,14 @@
             <w:pPr>
               <w:spacing w:line="360" w:lineRule="auto"/>
               <w:jc w:val="center"/>
+              <w:rPr>
+                <w:lang w:eastAsia="zh-CN"/>
+              </w:rPr>
             </w:pPr>
             <w:r>
               <w:rPr>
                 <w:rFonts w:hint="eastAsia"/>
+                <w:lang w:eastAsia="zh-CN"/>
               </w:rPr>
               <w:t>工作单位</w:t>
             </w:r>
@@ -9832,6 +9773,9 @@
             <w:pPr>
               <w:spacing w:line="360" w:lineRule="auto"/>
               <w:jc w:val="center"/>
+              <w:rPr>
+                <w:lang w:eastAsia="zh-CN"/>
+              </w:rPr>
             </w:pPr>
             <w:r>
               <w:rPr>
@@ -9872,10 +9816,14 @@
             <w:pPr>
               <w:spacing w:line="360" w:lineRule="auto"/>
               <w:jc w:val="center"/>
+              <w:rPr>
+                <w:lang w:eastAsia="zh-CN"/>
+              </w:rPr>
             </w:pPr>
             <w:r>
               <w:rPr>
                 <w:rFonts w:hint="eastAsia"/>
+                <w:lang w:eastAsia="zh-CN"/>
               </w:rPr>
               <w:t>主要工作内容</w:t>
             </w:r>
@@ -9884,6 +9832,9 @@
             <w:pPr>
               <w:spacing w:line="360" w:lineRule="auto"/>
               <w:jc w:val="center"/>
+              <w:rPr>
+                <w:lang w:eastAsia="zh-CN"/>
+              </w:rPr>
             </w:pPr>
             <w:r>
               <w:rPr>
@@ -9917,6 +9868,9 @@
           <w:p>
             <w:pPr>
               <w:spacing w:line="360" w:lineRule="auto"/>
+              <w:rPr>
+                <w:lang w:eastAsia="zh-CN"/>
+              </w:rPr>
             </w:pPr>
           </w:p>
         </w:tc>
@@ -9928,6 +9882,9 @@
           <w:p>
             <w:pPr>
               <w:spacing w:line="360" w:lineRule="auto"/>
+              <w:rPr>
+                <w:lang w:eastAsia="zh-CN"/>
+              </w:rPr>
             </w:pPr>
           </w:p>
         </w:tc>
@@ -9939,6 +9896,9 @@
           <w:p>
             <w:pPr>
               <w:spacing w:line="360" w:lineRule="auto"/>
+              <w:rPr>
+                <w:lang w:eastAsia="zh-CN"/>
+              </w:rPr>
             </w:pPr>
           </w:p>
         </w:tc>
@@ -9950,6 +9910,9 @@
           <w:p>
             <w:pPr>
               <w:spacing w:line="360" w:lineRule="auto"/>
+              <w:rPr>
+                <w:lang w:eastAsia="zh-CN"/>
+              </w:rPr>
             </w:pPr>
           </w:p>
         </w:tc>
@@ -9964,6 +9927,9 @@
           <w:p>
             <w:pPr>
               <w:spacing w:line="360" w:lineRule="auto"/>
+              <w:rPr>
+                <w:lang w:eastAsia="zh-CN"/>
+              </w:rPr>
             </w:pPr>
           </w:p>
         </w:tc>
@@ -9990,6 +9956,9 @@
           <w:p>
             <w:pPr>
               <w:spacing w:line="360" w:lineRule="auto"/>
+              <w:rPr>
+                <w:lang w:eastAsia="zh-CN"/>
+              </w:rPr>
             </w:pPr>
           </w:p>
         </w:tc>
@@ -10001,6 +9970,9 @@
           <w:p>
             <w:pPr>
               <w:spacing w:line="360" w:lineRule="auto"/>
+              <w:rPr>
+                <w:lang w:eastAsia="zh-CN"/>
+              </w:rPr>
             </w:pPr>
           </w:p>
         </w:tc>
@@ -10012,6 +9984,9 @@
           <w:p>
             <w:pPr>
               <w:spacing w:line="360" w:lineRule="auto"/>
+              <w:rPr>
+                <w:lang w:eastAsia="zh-CN"/>
+              </w:rPr>
             </w:pPr>
           </w:p>
         </w:tc>
@@ -10023,6 +9998,9 @@
           <w:p>
             <w:pPr>
               <w:spacing w:line="360" w:lineRule="auto"/>
+              <w:rPr>
+                <w:lang w:eastAsia="zh-CN"/>
+              </w:rPr>
             </w:pPr>
           </w:p>
         </w:tc>
@@ -10037,6 +10015,9 @@
           <w:p>
             <w:pPr>
               <w:spacing w:line="360" w:lineRule="auto"/>
+              <w:rPr>
+                <w:lang w:eastAsia="zh-CN"/>
+              </w:rPr>
             </w:pPr>
           </w:p>
         </w:tc>
@@ -10063,6 +10044,9 @@
           <w:p>
             <w:pPr>
               <w:spacing w:line="360" w:lineRule="auto"/>
+              <w:rPr>
+                <w:lang w:eastAsia="zh-CN"/>
+              </w:rPr>
             </w:pPr>
           </w:p>
         </w:tc>
@@ -10074,6 +10058,9 @@
           <w:p>
             <w:pPr>
               <w:spacing w:line="360" w:lineRule="auto"/>
+              <w:rPr>
+                <w:lang w:eastAsia="zh-CN"/>
+              </w:rPr>
             </w:pPr>
           </w:p>
         </w:tc>
@@ -10085,6 +10072,9 @@
           <w:p>
             <w:pPr>
               <w:spacing w:line="360" w:lineRule="auto"/>
+              <w:rPr>
+                <w:lang w:eastAsia="zh-CN"/>
+              </w:rPr>
             </w:pPr>
           </w:p>
         </w:tc>
@@ -10096,6 +10086,9 @@
           <w:p>
             <w:pPr>
               <w:spacing w:line="360" w:lineRule="auto"/>
+              <w:rPr>
+                <w:lang w:eastAsia="zh-CN"/>
+              </w:rPr>
             </w:pPr>
           </w:p>
         </w:tc>
@@ -10110,6 +10103,9 @@
           <w:p>
             <w:pPr>
               <w:spacing w:line="360" w:lineRule="auto"/>
+              <w:rPr>
+                <w:lang w:eastAsia="zh-CN"/>
+              </w:rPr>
             </w:pPr>
           </w:p>
         </w:tc>
@@ -10136,6 +10132,9 @@
           <w:p>
             <w:pPr>
               <w:spacing w:line="360" w:lineRule="auto"/>
+              <w:rPr>
+                <w:lang w:eastAsia="zh-CN"/>
+              </w:rPr>
             </w:pPr>
           </w:p>
         </w:tc>
@@ -10147,6 +10146,9 @@
           <w:p>
             <w:pPr>
               <w:spacing w:line="360" w:lineRule="auto"/>
+              <w:rPr>
+                <w:lang w:eastAsia="zh-CN"/>
+              </w:rPr>
             </w:pPr>
           </w:p>
         </w:tc>
@@ -10158,6 +10160,9 @@
           <w:p>
             <w:pPr>
               <w:spacing w:line="360" w:lineRule="auto"/>
+              <w:rPr>
+                <w:lang w:eastAsia="zh-CN"/>
+              </w:rPr>
             </w:pPr>
           </w:p>
         </w:tc>
@@ -10169,6 +10174,9 @@
           <w:p>
             <w:pPr>
               <w:spacing w:line="360" w:lineRule="auto"/>
+              <w:rPr>
+                <w:lang w:eastAsia="zh-CN"/>
+              </w:rPr>
             </w:pPr>
           </w:p>
         </w:tc>
@@ -10183,6 +10191,9 @@
           <w:p>
             <w:pPr>
               <w:spacing w:line="360" w:lineRule="auto"/>
+              <w:rPr>
+                <w:lang w:eastAsia="zh-CN"/>
+              </w:rPr>
             </w:pPr>
           </w:p>
         </w:tc>
@@ -10262,10 +10273,14 @@
           <w:p>
             <w:pPr>
               <w:spacing w:line="360" w:lineRule="auto"/>
+              <w:rPr>
+                <w:lang w:eastAsia="zh-CN"/>
+              </w:rPr>
             </w:pPr>
             <w:r>
               <w:rPr>
                 <w:rFonts w:hint="eastAsia"/>
+                <w:lang w:eastAsia="zh-CN"/>
               </w:rPr>
               <w:t>是否为事业单位编制内人员</w:t>
             </w:r>
@@ -10279,6 +10294,9 @@
           <w:p>
             <w:pPr>
               <w:spacing w:line="360" w:lineRule="auto"/>
+              <w:rPr>
+                <w:lang w:eastAsia="zh-CN"/>
+              </w:rPr>
             </w:pPr>
           </w:p>
         </w:tc>
@@ -10290,19 +10308,16 @@
           <w:p>
             <w:pPr>
               <w:spacing w:line="360" w:lineRule="auto"/>
+              <w:rPr>
+                <w:lang w:eastAsia="zh-CN"/>
+              </w:rPr>
             </w:pPr>
-            <w:r>
-              <w:rPr>
-                <w:rFonts w:hint="eastAsia"/>
-              </w:rPr>
-              <w:t>劳动（聘用）合同</w:t>
-            </w:r>
             <w:r>
               <w:rPr>
                 <w:rFonts w:hint="eastAsia"/>
                 <w:lang w:eastAsia="zh-CN"/>
               </w:rPr>
-              <w:t>起止时间</w:t>
+              <w:t>劳动（聘用）合同起止时间</w:t>
             </w:r>
           </w:p>
         </w:tc>
@@ -10317,6 +10332,9 @@
           <w:p>
             <w:pPr>
               <w:spacing w:line="360" w:lineRule="auto"/>
+              <w:rPr>
+                <w:lang w:eastAsia="zh-CN"/>
+              </w:rPr>
             </w:pPr>
           </w:p>
         </w:tc>
@@ -10347,14 +10365,12 @@
             <w:pPr>
               <w:spacing w:line="360" w:lineRule="auto"/>
             </w:pPr>
-            <w:proofErr w:type="spellStart"/>
             <w:r>
               <w:rPr>
                 <w:rFonts w:hint="eastAsia"/>
               </w:rPr>
               <w:t>是否有试用期</w:t>
             </w:r>
-            <w:proofErr w:type="spellEnd"/>
           </w:p>
         </w:tc>
         <w:tc>
@@ -10376,19 +10392,16 @@
           <w:p>
             <w:pPr>
               <w:spacing w:line="360" w:lineRule="auto"/>
+              <w:rPr>
+                <w:lang w:eastAsia="zh-CN"/>
+              </w:rPr>
             </w:pPr>
-            <w:r>
-              <w:rPr>
-                <w:rFonts w:hint="eastAsia"/>
-              </w:rPr>
-              <w:t>劳动（聘用）合同试用期</w:t>
-            </w:r>
             <w:r>
               <w:rPr>
                 <w:rFonts w:hint="eastAsia"/>
                 <w:lang w:eastAsia="zh-CN"/>
               </w:rPr>
-              <w:t>起止时间</w:t>
+              <w:t>劳动（聘用）合同试用期起止时间</w:t>
             </w:r>
           </w:p>
         </w:tc>
@@ -10403,6 +10416,9 @@
           <w:p>
             <w:pPr>
               <w:spacing w:line="360" w:lineRule="auto"/>
+              <w:rPr>
+                <w:lang w:eastAsia="zh-CN"/>
+              </w:rPr>
             </w:pPr>
           </w:p>
         </w:tc>
@@ -10599,36 +10615,32 @@
               <w:jc w:val="left"/>
               <w:rPr>
                 <w:b/>
+                <w:lang w:eastAsia="zh-CN"/>
               </w:rPr>
             </w:pPr>
-            <w:r>
-              <w:rPr>
-                <w:rFonts w:hint="eastAsia"/>
-                <w:b/>
-              </w:rPr>
-              <w:t>主申请人</w:t>
-            </w:r>
-            <w:r>
-              <w:rPr>
-                <w:rFonts w:ascii="宋体" w:eastAsia="宋体" w:hAnsi="宋体" w:hint="eastAsia"/>
-                <w:b/>
-              </w:rPr>
-              <w:t>-</w:t>
-            </w:r>
-            <w:r>
-              <w:rPr>
-                <w:rFonts w:hint="eastAsia"/>
-                <w:b/>
-              </w:rPr>
-              <w:t>主要科研成果（工作业绩）及专业特长</w:t>
-            </w:r>
             <w:r>
               <w:rPr>
                 <w:rFonts w:hint="eastAsia"/>
                 <w:b/>
                 <w:lang w:eastAsia="zh-CN"/>
               </w:rPr>
-              <w:t>（500字内概括）</w:t>
+              <w:t>主申请人</w:t>
+            </w:r>
+            <w:r>
+              <w:rPr>
+                <w:rFonts w:ascii="宋体" w:eastAsia="宋体" w:hAnsi="宋体" w:hint="eastAsia"/>
+                <w:b/>
+                <w:lang w:eastAsia="zh-CN"/>
+              </w:rPr>
+              <w:t>-</w:t>
+            </w:r>
+            <w:r>
+              <w:rPr>
+                <w:rFonts w:hint="eastAsia"/>
+                <w:b/>
+                <w:lang w:eastAsia="zh-CN"/>
+              </w:rPr>
+              <w:t>主要科研成果（工作业绩）及专业特长（500字内概括）</w:t>
             </w:r>
           </w:p>
         </w:tc>
@@ -10660,6 +10672,9 @@
             <w:pPr>
               <w:spacing w:line="360" w:lineRule="auto"/>
               <w:jc w:val="center"/>
+              <w:rPr>
+                <w:lang w:eastAsia="zh-CN"/>
+              </w:rPr>
             </w:pPr>
           </w:p>
         </w:tc>
@@ -10689,12 +10704,14 @@
               <w:spacing w:line="360" w:lineRule="auto"/>
               <w:rPr>
                 <w:b/>
+                <w:lang w:eastAsia="zh-CN"/>
               </w:rPr>
             </w:pPr>
             <w:r>
               <w:rPr>
                 <w:rFonts w:hint="eastAsia"/>
                 <w:b/>
+                <w:lang w:eastAsia="zh-CN"/>
               </w:rPr>
               <w:t>主申请人</w:t>
             </w:r>
@@ -10702,6 +10719,7 @@
               <w:rPr>
                 <w:rFonts w:ascii="宋体" w:eastAsia="宋体" w:hAnsi="宋体" w:hint="eastAsia"/>
                 <w:b/>
+                <w:lang w:eastAsia="zh-CN"/>
               </w:rPr>
               <w:t>-</w:t>
             </w:r>
@@ -10709,6 +10727,7 @@
               <w:rPr>
                 <w:rFonts w:hint="eastAsia"/>
                 <w:b/>
+                <w:lang w:eastAsia="zh-CN"/>
               </w:rPr>
               <w:t>专业技术职务任职资格</w:t>
             </w:r>
@@ -10842,12 +10861,14 @@
               <w:spacing w:line="360" w:lineRule="auto"/>
               <w:rPr>
                 <w:b/>
+                <w:lang w:eastAsia="zh-CN"/>
               </w:rPr>
             </w:pPr>
             <w:r>
               <w:rPr>
                 <w:rFonts w:hint="eastAsia"/>
                 <w:b/>
+                <w:lang w:eastAsia="zh-CN"/>
               </w:rPr>
               <w:t>主申请人</w:t>
             </w:r>
@@ -10855,6 +10876,7 @@
               <w:rPr>
                 <w:rFonts w:ascii="宋体" w:eastAsia="宋体" w:hAnsi="宋体" w:hint="eastAsia"/>
                 <w:b/>
+                <w:lang w:eastAsia="zh-CN"/>
               </w:rPr>
               <w:t>-</w:t>
             </w:r>
@@ -10862,6 +10884,7 @@
               <w:rPr>
                 <w:rFonts w:hint="eastAsia"/>
                 <w:b/>
+                <w:lang w:eastAsia="zh-CN"/>
               </w:rPr>
               <w:t>专业技术职业资格</w:t>
             </w:r>
@@ -11097,12 +11120,14 @@
               <w:spacing w:line="360" w:lineRule="auto"/>
               <w:rPr>
                 <w:b/>
+                <w:lang w:eastAsia="zh-CN"/>
               </w:rPr>
             </w:pPr>
             <w:r>
               <w:rPr>
                 <w:rFonts w:hint="eastAsia"/>
                 <w:b/>
+                <w:lang w:eastAsia="zh-CN"/>
               </w:rPr>
               <w:t>主申请人</w:t>
             </w:r>
@@ -11110,6 +11135,7 @@
               <w:rPr>
                 <w:rFonts w:ascii="宋体" w:eastAsia="宋体" w:hAnsi="宋体" w:hint="eastAsia"/>
                 <w:b/>
+                <w:lang w:eastAsia="zh-CN"/>
               </w:rPr>
               <w:t>-</w:t>
             </w:r>
@@ -11117,6 +11143,7 @@
               <w:rPr>
                 <w:rFonts w:hint="eastAsia"/>
                 <w:b/>
+                <w:lang w:eastAsia="zh-CN"/>
               </w:rPr>
               <w:t>职业技能工种</w:t>
             </w:r>
@@ -11250,7 +11277,7 @@
         <w:snapToGrid w:val="0"/>
         <w:spacing w:line="360" w:lineRule="auto"/>
         <w:rPr>
-          <w:rFonts w:asciiTheme="minorEastAsia" w:hAnsiTheme="minorEastAsia" w:hint="eastAsia"/>
+          <w:rFonts w:asciiTheme="minorEastAsia" w:hAnsiTheme="minorEastAsia"/>
         </w:rPr>
       </w:pPr>
     </w:p>
@@ -11260,29 +11287,28 @@
         <w:spacing w:before="200" w:after="200" w:line="360" w:lineRule="auto"/>
         <w:jc w:val="center"/>
         <w:rPr>
+          <w:sz w:val="32"/>
+          <w:szCs w:val="32"/>
+        </w:rPr>
+      </w:pPr>
+      <w:bookmarkStart w:id="22" w:name="_Toc223628877"/>
+      <w:r>
+        <w:rPr>
+          <w:rFonts w:asciiTheme="majorEastAsia" w:hAnsiTheme="majorEastAsia"/>
+          <w:sz w:val="32"/>
+          <w:szCs w:val="32"/>
+        </w:rPr>
+        <w:t>2</w:t>
+      </w:r>
+      <w:r>
+        <w:rPr>
           <w:rFonts w:hint="eastAsia"/>
           <w:sz w:val="32"/>
           <w:szCs w:val="32"/>
         </w:rPr>
-      </w:pPr>
-      <w:bookmarkStart w:id="21" w:name="_Toc223486245"/>
-      <w:r>
-        <w:rPr>
-          <w:rFonts w:asciiTheme="majorEastAsia" w:hAnsiTheme="majorEastAsia"/>
-          <w:sz w:val="32"/>
-          <w:szCs w:val="32"/>
-        </w:rPr>
-        <w:t>2</w:t>
-      </w:r>
-      <w:r>
-        <w:rPr>
-          <w:rFonts w:hint="eastAsia"/>
-          <w:sz w:val="32"/>
-          <w:szCs w:val="32"/>
-        </w:rPr>
         <w:t xml:space="preserve"> 这是第二章标题</w:t>
       </w:r>
-      <w:bookmarkEnd w:id="21"/>
+      <w:bookmarkEnd w:id="22"/>
     </w:p>
     <w:p>
       <w:pPr>
@@ -11296,39 +11322,36 @@
         </w:tabs>
         <w:ind w:left="1260" w:hanging="840"/>
       </w:pPr>
-      <w:bookmarkStart w:id="22" w:name="_Toc223486246"/>
+      <w:bookmarkStart w:id="23" w:name="_Toc223628878"/>
       <w:r>
         <w:rPr>
           <w:rFonts w:hint="eastAsia"/>
         </w:rPr>
         <w:t>混合公式</w:t>
       </w:r>
-      <w:bookmarkEnd w:id="22"/>
+      <w:bookmarkEnd w:id="23"/>
     </w:p>
     <w:p>
       <w:pPr>
         <w:pStyle w:val="3"/>
+      </w:pPr>
+      <w:bookmarkStart w:id="24" w:name="_Toc223628879"/>
+      <w:r>
         <w:rPr>
           <w:rFonts w:hint="eastAsia"/>
         </w:rPr>
-      </w:pPr>
-      <w:bookmarkStart w:id="23" w:name="_Toc223486247"/>
+        <w:t>2.1.1</w:t>
+      </w:r>
+      <w:r>
+        <w:tab/>
+      </w:r>
       <w:r>
         <w:rPr>
           <w:rFonts w:hint="eastAsia"/>
         </w:rPr>
-        <w:t>2.1.1</w:t>
-      </w:r>
-      <w:r>
-        <w:tab/>
-      </w:r>
-      <w:r>
-        <w:rPr>
-          <w:rFonts w:hint="eastAsia"/>
-        </w:rPr>
         <w:t>箭头</w:t>
       </w:r>
-      <w:bookmarkEnd w:id="23"/>
+      <w:bookmarkEnd w:id="24"/>
     </w:p>
     <w:p>
       <w:pPr>
@@ -11367,33 +11390,24 @@
     <w:p>
       <w:pPr>
         <w:pStyle w:val="3"/>
+      </w:pPr>
+      <w:bookmarkStart w:id="25" w:name="_Toc223628880"/>
+      <w:r>
         <w:rPr>
           <w:rFonts w:hint="eastAsia"/>
         </w:rPr>
-      </w:pPr>
-      <w:bookmarkStart w:id="24" w:name="_Toc223486248"/>
+        <w:t>2.1.2</w:t>
+      </w:r>
+      <w:r>
+        <w:tab/>
+      </w:r>
       <w:r>
         <w:rPr>
           <w:rFonts w:hint="eastAsia"/>
         </w:rPr>
-        <w:t>2.1.</w:t>
-      </w:r>
-      <w:r>
-        <w:rPr>
-          <w:rFonts w:hint="eastAsia"/>
-        </w:rPr>
-        <w:t>2</w:t>
-      </w:r>
-      <w:r>
-        <w:tab/>
-      </w:r>
-      <w:r>
-        <w:rPr>
-          <w:rFonts w:hint="eastAsia"/>
-        </w:rPr>
         <w:t>希腊字母</w:t>
       </w:r>
-      <w:bookmarkEnd w:id="24"/>
+      <w:bookmarkEnd w:id="25"/>
     </w:p>
     <w:p>
       <m:oMathPara>
@@ -11425,34 +11439,25 @@
     <w:p>
       <w:pPr>
         <w:pStyle w:val="3"/>
+      </w:pPr>
+      <w:bookmarkStart w:id="26" w:name="_Toc223628881"/>
+      <w:r>
         <w:rPr>
           <w:rFonts w:hint="eastAsia"/>
         </w:rPr>
-      </w:pPr>
-      <w:bookmarkStart w:id="25" w:name="_Toc223486249"/>
+        <w:lastRenderedPageBreak/>
+        <w:t>2.1.3</w:t>
+      </w:r>
+      <w:r>
+        <w:tab/>
+      </w:r>
       <w:r>
         <w:rPr>
           <w:rFonts w:hint="eastAsia"/>
         </w:rPr>
-        <w:lastRenderedPageBreak/>
-        <w:t>2.1.</w:t>
-      </w:r>
-      <w:r>
-        <w:rPr>
-          <w:rFonts w:hint="eastAsia"/>
-        </w:rPr>
-        <w:t>3</w:t>
-      </w:r>
-      <w:r>
-        <w:tab/>
-      </w:r>
-      <w:r>
-        <w:rPr>
-          <w:rFonts w:hint="eastAsia"/>
-        </w:rPr>
         <w:t>链接符号</w:t>
       </w:r>
-      <w:bookmarkEnd w:id="25"/>
+      <w:bookmarkEnd w:id="26"/>
     </w:p>
     <w:p>
       <m:oMathPara>
@@ -11461,35 +11466,12 @@
             <w:rPr>
               <w:rFonts w:ascii="Cambria Math" w:hAnsi="Cambria Math"/>
             </w:rPr>
-            <m:t>+-</m:t>
-          </m:r>
-          <m:r>
-            <w:rPr>
-              <w:rFonts w:ascii="Cambria Math" w:hAnsi="Cambria Math"/>
-            </w:rPr>
-            <m:t>÷×±∓∝</m:t>
-          </m:r>
-          <m:r>
-            <w:rPr>
-              <w:rFonts w:ascii="Cambria Math" w:hAnsi="Cambria Math"/>
-            </w:rPr>
-            <m:t>∕*</m:t>
-          </m:r>
-          <m:r>
-            <w:rPr>
-              <w:rFonts w:ascii="Cambria Math" w:hAnsi="Cambria Math"/>
-            </w:rPr>
-            <m:t>∘∙⋅∩∪⊎⊓⊔∧∨</m:t>
+            <m:t>+-÷×±∓∝∕*∘∙⋅∩∪⊎⊓⊔∧∨</m:t>
           </m:r>
         </m:oMath>
       </m:oMathPara>
     </w:p>
     <w:p>
-      <w:pPr>
-        <w:rPr>
-          <w:rFonts w:hint="eastAsia"/>
-        </w:rPr>
-      </w:pPr>
       <m:oMathPara>
         <m:oMath>
           <m:r>
@@ -11516,33 +11498,24 @@
     <w:p>
       <w:pPr>
         <w:pStyle w:val="3"/>
+      </w:pPr>
+      <w:bookmarkStart w:id="27" w:name="_Toc223628882"/>
+      <w:r>
         <w:rPr>
           <w:rFonts w:hint="eastAsia"/>
         </w:rPr>
-      </w:pPr>
-      <w:bookmarkStart w:id="26" w:name="_Toc223486250"/>
+        <w:t>2.1.4</w:t>
+      </w:r>
+      <w:r>
+        <w:tab/>
+      </w:r>
       <w:r>
         <w:rPr>
           <w:rFonts w:hint="eastAsia"/>
         </w:rPr>
-        <w:t>2.1.</w:t>
-      </w:r>
-      <w:r>
-        <w:rPr>
-          <w:rFonts w:hint="eastAsia"/>
-        </w:rPr>
-        <w:t>4</w:t>
-      </w:r>
-      <w:r>
-        <w:tab/>
-      </w:r>
-      <w:r>
-        <w:rPr>
-          <w:rFonts w:hint="eastAsia"/>
-        </w:rPr>
         <w:t>手写字母</w:t>
       </w:r>
-      <w:bookmarkEnd w:id="26"/>
+      <w:bookmarkEnd w:id="27"/>
     </w:p>
     <w:p>
       <m:oMathPara>
@@ -11577,27 +11550,24 @@
     <w:p>
       <w:pPr>
         <w:pStyle w:val="3"/>
+      </w:pPr>
+      <w:bookmarkStart w:id="28" w:name="_Toc223628883"/>
+      <w:r>
         <w:rPr>
           <w:rFonts w:hint="eastAsia"/>
         </w:rPr>
-      </w:pPr>
-      <w:bookmarkStart w:id="27" w:name="_Toc223486251"/>
+        <w:t>2.1.5</w:t>
+      </w:r>
+      <w:r>
+        <w:tab/>
+      </w:r>
       <w:r>
         <w:rPr>
           <w:rFonts w:hint="eastAsia"/>
         </w:rPr>
-        <w:t>2.1.5</w:t>
-      </w:r>
-      <w:r>
-        <w:tab/>
-      </w:r>
-      <w:r>
-        <w:rPr>
-          <w:rFonts w:hint="eastAsia"/>
-        </w:rPr>
         <w:t>德国哥特体字母</w:t>
       </w:r>
-      <w:bookmarkEnd w:id="27"/>
+      <w:bookmarkEnd w:id="28"/>
     </w:p>
     <w:p>
       <m:oMathPara>
@@ -11632,27 +11602,24 @@
     <w:p>
       <w:pPr>
         <w:pStyle w:val="3"/>
+      </w:pPr>
+      <w:bookmarkStart w:id="29" w:name="_Toc223628884"/>
+      <w:r>
         <w:rPr>
           <w:rFonts w:hint="eastAsia"/>
         </w:rPr>
-      </w:pPr>
-      <w:bookmarkStart w:id="28" w:name="_Toc223486252"/>
+        <w:t>2.1.6</w:t>
+      </w:r>
+      <w:r>
+        <w:tab/>
+      </w:r>
       <w:r>
         <w:rPr>
           <w:rFonts w:hint="eastAsia"/>
         </w:rPr>
-        <w:t>2.1.6</w:t>
-      </w:r>
-      <w:r>
-        <w:tab/>
-      </w:r>
-      <w:r>
-        <w:rPr>
-          <w:rFonts w:hint="eastAsia"/>
-        </w:rPr>
         <w:t>双线体字母</w:t>
       </w:r>
-      <w:bookmarkEnd w:id="28"/>
+      <w:bookmarkEnd w:id="29"/>
     </w:p>
     <w:p>
       <m:oMathPara>
@@ -11693,7 +11660,7 @@
       <w:pPr>
         <w:pStyle w:val="3"/>
       </w:pPr>
-      <w:bookmarkStart w:id="29" w:name="_Toc223486253"/>
+      <w:bookmarkStart w:id="30" w:name="_Toc223628885"/>
       <w:r>
         <w:rPr>
           <w:rFonts w:hint="eastAsia"/>
@@ -11709,14 +11676,9 @@
         </w:rPr>
         <w:t>公式示例</w:t>
       </w:r>
-      <w:bookmarkEnd w:id="29"/>
+      <w:bookmarkEnd w:id="30"/>
     </w:p>
     <w:p>
-      <w:pPr>
-        <w:rPr>
-          <w:rFonts w:hint="eastAsia"/>
-        </w:rPr>
-      </w:pPr>
       <m:oMathPara>
         <m:oMath>
           <m:nary>
@@ -12330,7 +12292,7 @@
         <w:spacing w:line="360" w:lineRule="auto"/>
         <w:jc w:val="left"/>
         <w:rPr>
-          <w:rFonts w:ascii="Times New Roman" w:hAnsi="Times New Roman" w:hint="eastAsia"/>
+          <w:rFonts w:ascii="Times New Roman" w:hAnsi="Times New Roman"/>
           <w:iCs/>
           <w:color w:val="000000"/>
           <w:kern w:val="24"/>
@@ -13022,7 +12984,7 @@
         <w:spacing w:line="360" w:lineRule="auto"/>
         <w:ind w:firstLineChars="200" w:firstLine="420"/>
         <w:rPr>
-          <w:rFonts w:asciiTheme="minorEastAsia" w:hAnsiTheme="minorEastAsia" w:hint="eastAsia"/>
+          <w:rFonts w:asciiTheme="minorEastAsia" w:hAnsiTheme="minorEastAsia"/>
         </w:rPr>
       </w:pPr>
       <m:oMathPara>
@@ -13868,19 +13830,7 @@
                 <w:rPr>
                   <w:rFonts w:ascii="Cambria Math" w:hAnsi="Cambria Math"/>
                 </w:rPr>
-                <m:t>)#(</m:t>
-              </m:r>
-              <m:r>
-                <w:rPr>
-                  <w:rFonts w:ascii="Cambria Math" w:hAnsi="Cambria Math"/>
-                </w:rPr>
-                <m:t>3</m:t>
-              </m:r>
-              <m:r>
-                <w:rPr>
-                  <w:rFonts w:ascii="Cambria Math" w:hAnsi="Cambria Math"/>
-                </w:rPr>
-                <m:t>)</m:t>
+                <m:t>)#(3)</m:t>
               </m:r>
             </m:e>
           </m:eqArr>
@@ -13891,7 +13841,7 @@
       <w:pPr>
         <w:spacing w:line="360" w:lineRule="auto"/>
         <w:rPr>
-          <w:rFonts w:asciiTheme="minorEastAsia" w:hAnsiTheme="minorEastAsia" w:hint="eastAsia"/>
+          <w:rFonts w:asciiTheme="minorEastAsia" w:hAnsiTheme="minorEastAsia"/>
         </w:rPr>
       </w:pPr>
       <m:oMathPara>
@@ -14161,19 +14111,7 @@
                 <w:rPr>
                   <w:rFonts w:ascii="Cambria Math" w:hAnsi="Cambria Math"/>
                 </w:rPr>
-                <m:t>#(</m:t>
-              </m:r>
-              <m:r>
-                <w:rPr>
-                  <w:rFonts w:ascii="Cambria Math" w:hAnsi="Cambria Math"/>
-                </w:rPr>
-                <m:t>4</m:t>
-              </m:r>
-              <m:r>
-                <w:rPr>
-                  <w:rFonts w:ascii="Cambria Math" w:hAnsi="Cambria Math"/>
-                </w:rPr>
-                <m:t>)</m:t>
+                <m:t>#(4)</m:t>
               </m:r>
             </m:e>
           </m:eqArr>
@@ -14192,7 +14130,7 @@
         </w:tabs>
         <w:ind w:left="1260" w:hanging="840"/>
       </w:pPr>
-      <w:bookmarkStart w:id="30" w:name="_Toc223486254"/>
+      <w:bookmarkStart w:id="31" w:name="_Toc223628886"/>
       <w:r>
         <w:rPr>
           <w:rFonts w:hint="eastAsia"/>
@@ -14200,7 +14138,7 @@
         <w:lastRenderedPageBreak/>
         <w:t>Table/Figure/Chart with caption</w:t>
       </w:r>
-      <w:bookmarkEnd w:id="30"/>
+      <w:bookmarkEnd w:id="31"/>
     </w:p>
     <w:p>
       <w:pPr>
@@ -14209,24 +14147,15 @@
           <w:ilvl w:val="2"/>
           <w:numId w:val="10"/>
         </w:numPr>
+      </w:pPr>
+      <w:bookmarkStart w:id="32" w:name="_Toc223628887"/>
+      <w:r>
         <w:rPr>
           <w:rFonts w:hint="eastAsia"/>
         </w:rPr>
-      </w:pPr>
-      <w:bookmarkStart w:id="31" w:name="_Toc223486255"/>
-      <w:r>
-        <w:rPr>
-          <w:rFonts w:hint="eastAsia"/>
-        </w:rPr>
-        <w:t>Figure</w:t>
-      </w:r>
-      <w:r>
-        <w:rPr>
-          <w:rFonts w:hint="eastAsia"/>
-        </w:rPr>
-        <w:t xml:space="preserve"> with caption</w:t>
-      </w:r>
-      <w:bookmarkEnd w:id="31"/>
+        <w:t>Figure with caption</w:t>
+      </w:r>
+      <w:bookmarkEnd w:id="32"/>
     </w:p>
     <w:p>
       <w:pPr>
@@ -14285,87 +14214,62 @@
       <w:pPr>
         <w:pStyle w:val="af"/>
         <w:ind w:left="465" w:firstLineChars="0" w:firstLine="0"/>
+      </w:pPr>
+      <w:r>
+        <w:t xml:space="preserve">Figure </w:t>
+      </w:r>
+      <w:fldSimple w:instr=" SEQ Figure \* ARABIC ">
+        <w:r>
+          <w:rPr>
+            <w:noProof/>
+          </w:rPr>
+          <w:t>1</w:t>
+        </w:r>
+      </w:fldSimple>
+      <w:r>
+        <w:t xml:space="preserve">: This is a cute </w:t>
+      </w:r>
+      <w:r>
+        <w:t>mascot</w:t>
+      </w:r>
+    </w:p>
+    <w:p/>
+    <w:p>
+      <w:pPr>
+        <w:pStyle w:val="3"/>
+      </w:pPr>
+      <w:bookmarkStart w:id="33" w:name="_Toc223628888"/>
+      <w:r>
+        <w:t>2</w:t>
+      </w:r>
+      <w:r>
         <w:rPr>
           <w:rFonts w:hint="eastAsia"/>
         </w:rPr>
-      </w:pPr>
-      <w:r>
-        <w:t xml:space="preserve">Figure </w:t>
-      </w:r>
-      <w:r>
-        <w:fldChar w:fldCharType="begin"/>
-      </w:r>
-      <w:r>
-        <w:instrText xml:space="preserve"> SEQ Figure \* ARABIC </w:instrText>
-      </w:r>
-      <w:r>
-        <w:fldChar w:fldCharType="separate"/>
-      </w:r>
-      <w:r>
-        <w:rPr>
-          <w:noProof/>
-        </w:rPr>
-        <w:t>1</w:t>
-      </w:r>
-      <w:r>
-        <w:rPr>
-          <w:noProof/>
-        </w:rPr>
-        <w:fldChar w:fldCharType="end"/>
-      </w:r>
-      <w:r>
-        <w:t xml:space="preserve">: This is a cute </w:t>
-      </w:r>
-      <w:r>
-        <w:t>mascot</w:t>
-      </w:r>
-    </w:p>
-    <w:p>
-      <w:pPr>
+        <w:t>.</w:t>
+      </w:r>
+      <w:r>
+        <w:t>2</w:t>
+      </w:r>
+      <w:r>
         <w:rPr>
           <w:rFonts w:hint="eastAsia"/>
         </w:rPr>
-      </w:pPr>
-    </w:p>
-    <w:p>
-      <w:pPr>
-        <w:pStyle w:val="3"/>
+        <w:t>.</w:t>
+      </w:r>
+      <w:r>
+        <w:t>2</w:t>
+      </w:r>
+      <w:r>
+        <w:tab/>
+      </w:r>
+      <w:r>
         <w:rPr>
           <w:rFonts w:hint="eastAsia"/>
         </w:rPr>
-      </w:pPr>
-      <w:bookmarkStart w:id="32" w:name="_Toc223486256"/>
-      <w:r>
-        <w:t>2</w:t>
-      </w:r>
-      <w:r>
-        <w:rPr>
-          <w:rFonts w:hint="eastAsia"/>
-        </w:rPr>
-        <w:t>.</w:t>
-      </w:r>
-      <w:r>
-        <w:t>2</w:t>
-      </w:r>
-      <w:r>
-        <w:rPr>
-          <w:rFonts w:hint="eastAsia"/>
-        </w:rPr>
-        <w:t>.</w:t>
-      </w:r>
-      <w:r>
-        <w:t>2</w:t>
-      </w:r>
-      <w:r>
-        <w:tab/>
-      </w:r>
-      <w:r>
-        <w:rPr>
-          <w:rFonts w:hint="eastAsia"/>
-        </w:rPr>
         <w:t>Table with caption</w:t>
       </w:r>
-      <w:bookmarkEnd w:id="32"/>
+      <w:bookmarkEnd w:id="33"/>
     </w:p>
     <w:tbl>
       <w:tblPr>
@@ -14688,49 +14592,40 @@
         <w:t>: This is an easy table</w:t>
       </w:r>
     </w:p>
+    <w:p/>
     <w:p>
       <w:pPr>
+        <w:pStyle w:val="3"/>
+      </w:pPr>
+      <w:bookmarkStart w:id="34" w:name="_Toc223628889"/>
+      <w:r>
+        <w:t>2</w:t>
+      </w:r>
+      <w:r>
         <w:rPr>
           <w:rFonts w:hint="eastAsia"/>
         </w:rPr>
-      </w:pPr>
-    </w:p>
-    <w:p>
-      <w:pPr>
-        <w:pStyle w:val="3"/>
+        <w:t>.</w:t>
+      </w:r>
+      <w:r>
+        <w:t>3</w:t>
+      </w:r>
+      <w:r>
         <w:rPr>
           <w:rFonts w:hint="eastAsia"/>
         </w:rPr>
-      </w:pPr>
-      <w:bookmarkStart w:id="33" w:name="_Toc223486257"/>
-      <w:r>
-        <w:t>2</w:t>
+        <w:t>.1</w:t>
+      </w:r>
+      <w:r>
+        <w:tab/>
       </w:r>
       <w:r>
         <w:rPr>
           <w:rFonts w:hint="eastAsia"/>
         </w:rPr>
-        <w:t>.</w:t>
-      </w:r>
-      <w:r>
-        <w:t>3</w:t>
-      </w:r>
-      <w:r>
-        <w:rPr>
-          <w:rFonts w:hint="eastAsia"/>
-        </w:rPr>
-        <w:t>.1</w:t>
-      </w:r>
-      <w:r>
-        <w:tab/>
-      </w:r>
-      <w:r>
-        <w:rPr>
-          <w:rFonts w:hint="eastAsia"/>
-        </w:rPr>
         <w:t>Chart with caption</w:t>
       </w:r>
-      <w:bookmarkEnd w:id="33"/>
+      <w:bookmarkEnd w:id="34"/>
     </w:p>
     <w:p>
       <w:pPr>
@@ -14748,7 +14643,7 @@
             <wp:cNvGraphicFramePr/>
             <a:graphic xmlns:a="http://schemas.openxmlformats.org/drawingml/2006/main">
               <a:graphicData uri="http://schemas.openxmlformats.org/drawingml/2006/chart">
-                <c:chart xmlns:c="http://schemas.openxmlformats.org/drawingml/2006/chart" xmlns:r="http://schemas.openxmlformats.org/officeDocument/2006/relationships" r:id="rId30"/>
+                <c:chart xmlns:c="http://schemas.openxmlformats.org/drawingml/2006/chart" xmlns:r="http://schemas.openxmlformats.org/officeDocument/2006/relationships" r:id="rId34"/>
               </a:graphicData>
             </a:graphic>
           </wp:inline>
@@ -14813,24 +14708,10 @@
       <w:pPr>
         <w:pStyle w:val="af"/>
         <w:ind w:firstLine="400"/>
-        <w:rPr>
-          <w:rFonts w:hint="eastAsia"/>
-        </w:rPr>
       </w:pPr>
     </w:p>
+    <w:p/>
     <w:p>
-      <w:pPr>
-        <w:rPr>
-          <w:rFonts w:hint="eastAsia"/>
-        </w:rPr>
-      </w:pPr>
-    </w:p>
-    <w:p>
-      <w:pPr>
-        <w:rPr>
-          <w:rFonts w:hint="eastAsia"/>
-        </w:rPr>
-      </w:pPr>
       <w:r>
         <w:rPr>
           <w:rFonts w:ascii="宋体" w:eastAsia="宋体" w:hAnsi="宋体" w:cs="宋体" w:hint="eastAsia"/>
@@ -14848,7 +14729,7 @@
             <wp:cNvGraphicFramePr/>
             <a:graphic xmlns:a="http://schemas.openxmlformats.org/drawingml/2006/main">
               <a:graphicData uri="http://schemas.openxmlformats.org/drawingml/2006/chart">
-                <c:chart xmlns:c="http://schemas.openxmlformats.org/drawingml/2006/chart" xmlns:r="http://schemas.openxmlformats.org/officeDocument/2006/relationships" r:id="rId31"/>
+                <c:chart xmlns:c="http://schemas.openxmlformats.org/drawingml/2006/chart" xmlns:r="http://schemas.openxmlformats.org/officeDocument/2006/relationships" r:id="rId35"/>
               </a:graphicData>
             </a:graphic>
           </wp:inline>
@@ -14860,7 +14741,7 @@
         <w:pStyle w:val="af"/>
         <w:ind w:firstLine="400"/>
         <w:rPr>
-          <w:rFonts w:ascii="Times New Roman" w:eastAsia="宋体" w:hAnsi="Times New Roman" w:cs="Times New Roman" w:hint="eastAsia"/>
+          <w:rFonts w:ascii="Times New Roman" w:eastAsia="宋体" w:hAnsi="Times New Roman" w:cs="Times New Roman"/>
         </w:rPr>
       </w:pPr>
       <w:r>
@@ -14900,10 +14781,7 @@
         <w:fldChar w:fldCharType="end"/>
       </w:r>
       <w:r>
-        <w:t xml:space="preserve">: </w:t>
-      </w:r>
-      <w:r>
-        <w:t xml:space="preserve">This is an easy </w:t>
+        <w:t xml:space="preserve">: This is an easy </w:t>
       </w:r>
       <w:r>
         <w:t>bar chart</w:t>
@@ -14923,13 +14801,13 @@
         <w:pStyle w:val="10"/>
         <w:spacing w:before="200" w:after="200" w:line="360" w:lineRule="auto"/>
         <w:rPr>
-          <w:rFonts w:asciiTheme="majorEastAsia" w:hAnsiTheme="majorEastAsia" w:hint="eastAsia"/>
+          <w:rFonts w:asciiTheme="majorEastAsia" w:hAnsiTheme="majorEastAsia"/>
           <w:bCs/>
           <w:sz w:val="32"/>
           <w:szCs w:val="32"/>
         </w:rPr>
       </w:pPr>
-      <w:bookmarkStart w:id="34" w:name="_Toc223486258"/>
+      <w:bookmarkStart w:id="35" w:name="_Toc223628890"/>
       <w:r>
         <w:rPr>
           <w:rFonts w:asciiTheme="majorEastAsia" w:hAnsiTheme="majorEastAsia"/>
@@ -14954,7 +14832,7 @@
         </w:rPr>
         <w:t>复杂嵌套多级列表</w:t>
       </w:r>
-      <w:bookmarkEnd w:id="34"/>
+      <w:bookmarkEnd w:id="35"/>
     </w:p>
     <w:p>
       <w:pPr>
@@ -14989,48 +14867,16 @@
         </w:rPr>
         <w:t>订立</w:t>
       </w:r>
-      <w:r>
-        <w:rPr>
-          <w:rFonts w:ascii="宋体" w:hAnsi="宋体" w:cs="宋体"/>
-          <w:szCs w:val="24"/>
-        </w:rPr>
-        <w:fldChar w:fldCharType="begin"/>
-      </w:r>
-      <w:r>
-        <w:rPr>
-          <w:rFonts w:ascii="宋体" w:hAnsi="宋体" w:cs="宋体" w:hint="eastAsia"/>
-          <w:szCs w:val="24"/>
-        </w:rPr>
-        <w:instrText>HYPERLINK "https://github.com/opendatalab/MinerU"</w:instrText>
-      </w:r>
-      <w:r>
-        <w:rPr>
-          <w:rFonts w:ascii="宋体" w:hAnsi="宋体" w:cs="宋体"/>
-          <w:szCs w:val="24"/>
-        </w:rPr>
-      </w:r>
-      <w:r>
-        <w:rPr>
-          <w:rFonts w:ascii="宋体" w:hAnsi="宋体" w:cs="宋体"/>
-          <w:szCs w:val="24"/>
-        </w:rPr>
-        <w:fldChar w:fldCharType="separate"/>
-      </w:r>
-      <w:r>
-        <w:rPr>
-          <w:rStyle w:val="ae"/>
-          <w:rFonts w:ascii="宋体" w:hAnsi="宋体" w:cs="宋体" w:hint="eastAsia"/>
-          <w:szCs w:val="24"/>
-        </w:rPr>
-        <w:t>补充合同</w:t>
-      </w:r>
-      <w:r>
-        <w:rPr>
-          <w:rFonts w:ascii="宋体" w:hAnsi="宋体" w:cs="宋体"/>
-          <w:szCs w:val="24"/>
-        </w:rPr>
-        <w:fldChar w:fldCharType="end"/>
-      </w:r>
+      <w:hyperlink r:id="rId36" w:history="1">
+        <w:r>
+          <w:rPr>
+            <w:rStyle w:val="ae"/>
+            <w:rFonts w:ascii="宋体" w:hAnsi="宋体" w:cs="宋体" w:hint="eastAsia"/>
+            <w:szCs w:val="24"/>
+          </w:rPr>
+          <w:t>补充合同</w:t>
+        </w:r>
+      </w:hyperlink>
       <w:r>
         <w:rPr>
           <w:rFonts w:ascii="宋体" w:hAnsi="宋体" w:cs="宋体" w:hint="eastAsia"/>
@@ -15094,7 +14940,7 @@
         </w:numPr>
         <w:spacing w:line="360" w:lineRule="auto"/>
         <w:rPr>
-          <w:rFonts w:ascii="宋体" w:hAnsi="宋体" w:cs="宋体" w:hint="eastAsia"/>
+          <w:rFonts w:ascii="宋体" w:hAnsi="宋体" w:cs="宋体"/>
           <w:szCs w:val="24"/>
         </w:rPr>
       </w:pPr>
@@ -15582,7 +15428,6 @@
           <w:szCs w:val="24"/>
         </w:rPr>
       </w:pPr>
-      <w:proofErr w:type="spellStart"/>
       <w:r>
         <w:rPr>
           <w:rFonts w:ascii="宋体" w:hAnsi="宋体" w:cs="宋体" w:hint="eastAsia"/>
@@ -15594,7 +15439,6 @@
         </w:rPr>
         <w:t>xyz</w:t>
       </w:r>
-      <w:proofErr w:type="spellEnd"/>
       <w:r>
         <w:rPr>
           <w:rFonts w:ascii="宋体" w:hAnsi="宋体" w:cs="宋体" w:hint="eastAsia"/>
@@ -15735,7 +15579,7 @@
         <w:lastRenderedPageBreak/>
         <w:t>文本</w:t>
       </w:r>
-      <w:hyperlink r:id="rId32" w:history="1">
+      <w:hyperlink r:id="rId37" w:history="1">
         <w:r>
           <w:rPr>
             <w:rStyle w:val="ae"/>
@@ -15927,22 +15771,22 @@
         </w:numPr>
         <w:spacing w:line="360" w:lineRule="auto"/>
         <w:rPr>
+          <w:rFonts w:ascii="宋体" w:hAnsi="宋体" w:cs="宋体"/>
+          <w:szCs w:val="24"/>
+        </w:rPr>
+      </w:pPr>
+      <w:r>
+        <w:rPr>
           <w:rFonts w:ascii="宋体" w:hAnsi="宋体" w:cs="宋体" w:hint="eastAsia"/>
           <w:szCs w:val="24"/>
         </w:rPr>
-      </w:pPr>
+        <w:t>本合同一式四份，</w:t>
+      </w:r>
       <w:r>
         <w:rPr>
           <w:rFonts w:ascii="宋体" w:hAnsi="宋体" w:cs="宋体" w:hint="eastAsia"/>
           <w:szCs w:val="24"/>
         </w:rPr>
-        <w:t>本合同一式四份，</w:t>
-      </w:r>
-      <w:r>
-        <w:rPr>
-          <w:rFonts w:ascii="宋体" w:hAnsi="宋体" w:cs="宋体" w:hint="eastAsia"/>
-          <w:szCs w:val="24"/>
-        </w:rPr>
         <w:t>省政府采购中心各一份</w:t>
       </w:r>
     </w:p>
@@ -15950,38 +15794,38 @@
       <w:pPr>
         <w:pStyle w:val="10"/>
         <w:spacing w:before="200" w:after="200" w:line="360" w:lineRule="auto"/>
+        <w:rPr>
+          <w:rFonts w:asciiTheme="majorEastAsia" w:hAnsiTheme="majorEastAsia"/>
+          <w:sz w:val="32"/>
+          <w:szCs w:val="32"/>
+        </w:rPr>
+      </w:pPr>
+      <w:bookmarkStart w:id="36" w:name="_Toc223628891"/>
+      <w:r>
+        <w:rPr>
+          <w:rFonts w:asciiTheme="majorEastAsia" w:hAnsiTheme="majorEastAsia"/>
+          <w:sz w:val="32"/>
+          <w:szCs w:val="32"/>
+        </w:rPr>
+        <w:t>4</w:t>
+      </w:r>
+      <w:r>
+        <w:rPr>
+          <w:rFonts w:asciiTheme="majorEastAsia" w:hAnsiTheme="majorEastAsia"/>
+          <w:sz w:val="32"/>
+          <w:szCs w:val="32"/>
+        </w:rPr>
+        <w:tab/>
+      </w:r>
+      <w:r>
         <w:rPr>
           <w:rFonts w:asciiTheme="majorEastAsia" w:hAnsiTheme="majorEastAsia" w:hint="eastAsia"/>
           <w:sz w:val="32"/>
           <w:szCs w:val="32"/>
         </w:rPr>
-      </w:pPr>
-      <w:bookmarkStart w:id="35" w:name="_Toc223486259"/>
-      <w:r>
-        <w:rPr>
-          <w:rFonts w:asciiTheme="majorEastAsia" w:hAnsiTheme="majorEastAsia"/>
-          <w:sz w:val="32"/>
-          <w:szCs w:val="32"/>
-        </w:rPr>
-        <w:t>4</w:t>
-      </w:r>
-      <w:r>
-        <w:rPr>
-          <w:rFonts w:asciiTheme="majorEastAsia" w:hAnsiTheme="majorEastAsia"/>
-          <w:sz w:val="32"/>
-          <w:szCs w:val="32"/>
-        </w:rPr>
-        <w:tab/>
-      </w:r>
-      <w:r>
-        <w:rPr>
-          <w:rFonts w:asciiTheme="majorEastAsia" w:hAnsiTheme="majorEastAsia" w:hint="eastAsia"/>
-          <w:sz w:val="32"/>
-          <w:szCs w:val="32"/>
-        </w:rPr>
         <w:t>参考文献</w:t>
       </w:r>
-      <w:bookmarkEnd w:id="35"/>
+      <w:bookmarkEnd w:id="36"/>
     </w:p>
     <w:p>
       <w:pPr>
@@ -16470,13 +16314,10 @@
         <w:snapToGrid w:val="0"/>
         <w:spacing w:line="360" w:lineRule="auto"/>
         <w:ind w:left="565"/>
-        <w:rPr>
-          <w:rFonts w:hint="eastAsia"/>
-        </w:rPr>
       </w:pPr>
     </w:p>
     <w:sectPr>
-      <w:footerReference w:type="default" r:id="rId33"/>
+      <w:footerReference w:type="default" r:id="rId38"/>
       <w:pgSz w:w="11906" w:h="16838"/>
       <w:pgMar w:top="1440" w:right="1800" w:bottom="1440" w:left="1800" w:header="851" w:footer="992" w:gutter="0"/>
       <w:pgNumType w:start="1"/>
@@ -16685,9 +16526,6 @@
   <w:p>
     <w:pPr>
       <w:pStyle w:val="af2"/>
-      <w:rPr>
-        <w:rFonts w:hint="eastAsia"/>
-      </w:rPr>
     </w:pPr>
   </w:p>
 </w:ftr>
@@ -16818,9 +16656,6 @@
   <w:p>
     <w:pPr>
       <w:pStyle w:val="af2"/>
-      <w:rPr>
-        <w:rFonts w:hint="eastAsia"/>
-      </w:rPr>
     </w:pPr>
     <w:r>
       <w:rPr>
@@ -16898,25 +16733,12 @@
   <w:p>
     <w:pPr>
       <w:pStyle w:val="af0"/>
-    </w:pPr>
-  </w:p>
-</w:hdr>
-</file>
-
-<file path=word/header2.xml><?xml version="1.0" encoding="utf-8"?>
-<w:hdr xmlns:wpc="http://schemas.microsoft.com/office/word/2010/wordprocessingCanvas" xmlns:cx="http://schemas.microsoft.com/office/drawing/2014/chartex" xmlns:cx1="http://schemas.microsoft.com/office/drawing/2015/9/8/chartex" xmlns:cx2="http://schemas.microsoft.com/office/drawing/2015/10/21/chartex" xmlns:cx3="http://schemas.microsoft.com/office/drawing/2016/5/9/chartex" xmlns:cx4="http://schemas.microsoft.com/office/drawing/2016/5/10/chartex" xmlns:cx5="http://schemas.microsoft.com/office/drawing/2016/5/11/chartex" xmlns:cx6="http://schemas.microsoft.com/office/drawing/2016/5/12/chartex" xmlns:cx7="http://schemas.microsoft.com/office/drawing/2016/5/13/chartex" xmlns:cx8="http://schemas.microsoft.com/office/drawing/2016/5/14/chartex" xmlns:mc="http://schemas.openxmlformats.org/markup-compatibility/2006" xmlns:aink="http://schemas.microsoft.com/office/drawing/2016/ink" xmlns:am3d="http://schemas.microsoft.com/office/drawing/2017/model3d" xmlns:o="urn:schemas-microsoft-com:office:office" xmlns:oel="http://schemas.microsoft.com/office/2019/extlst" xmlns:r="http://schemas.openxmlformats.org/officeDocument/2006/relationships" xmlns:m="http://schemas.openxmlformats.org/officeDocument/2006/math" xmlns:v="urn:schemas-microsoft-com:vml" xmlns:wp14="http://schemas.microsoft.com/office/word/2010/wordprocessingDrawing" xmlns:wp="http://schemas.openxmlformats.org/drawingml/2006/wordprocessingDrawing" xmlns:w10="urn:schemas-microsoft-com:office:word" xmlns:w="http://schemas.openxmlformats.org/wordprocessingml/2006/main" xmlns:w14="http://schemas.microsoft.com/office/word/2010/wordml" xmlns:w15="http://schemas.microsoft.com/office/word/2012/wordml" xmlns:w16cex="http://schemas.microsoft.com/office/word/2018/wordml/cex" xmlns:w16cid="http://schemas.microsoft.com/office/word/2016/wordml/cid" xmlns:w16="http://schemas.microsoft.com/office/word/2018/wordml" xmlns:w16du="http://schemas.microsoft.com/office/word/2023/wordml/word16du" xmlns:w16sdtdh="http://schemas.microsoft.com/office/word/2020/wordml/sdtdatahash" xmlns:w16sdtfl="http://schemas.microsoft.com/office/word/2024/wordml/sdtformatlock" xmlns:w16se="http://schemas.microsoft.com/office/word/2015/wordml/symex" xmlns:wpg="http://schemas.microsoft.com/office/word/2010/wordprocessingGroup" xmlns:wpi="http://schemas.microsoft.com/office/word/2010/wordprocessingInk" xmlns:wne="http://schemas.microsoft.com/office/word/2006/wordml" xmlns:wps="http://schemas.microsoft.com/office/word/2010/wordprocessingShape" mc:Ignorable="w14 w15 w16se w16cid w16 w16cex w16sdtdh w16sdtfl w16du wp14">
-  <w:p>
-    <w:pPr>
-      <w:pStyle w:val="af0"/>
       <w:jc w:val="left"/>
     </w:pPr>
+    <w:r>
+      <w:t>这是带公式和超链接的页眉</w:t>
+    </w:r>
     <m:oMath>
-      <m:r>
-        <w:rPr>
-          <w:rFonts w:ascii="Cambria Math" w:hAnsi="Cambria Math" w:hint="eastAsia"/>
-        </w:rPr>
-        <m:t>这是带公式和超链接的页眉</m:t>
-      </m:r>
       <m:sSup>
         <m:sSupPr>
           <m:ctrlPr>
@@ -17011,28 +16833,14 @@
           <w:rStyle w:val="ae"/>
           <w:rFonts w:hint="eastAsia"/>
         </w:rPr>
-        <w:t>Miner</w:t>
-      </w:r>
-      <w:r>
-        <w:rPr>
-          <w:rStyle w:val="ae"/>
-          <w:rFonts w:hint="eastAsia"/>
-        </w:rPr>
-        <w:t>U</w:t>
-      </w:r>
-      <w:r>
-        <w:rPr>
-          <w:rStyle w:val="ae"/>
-          <w:rFonts w:hint="eastAsia"/>
-        </w:rPr>
-        <w:t>官网</w:t>
+        <w:t>MinerU官网</w:t>
       </w:r>
     </w:hyperlink>
   </w:p>
 </w:hdr>
 </file>
 
-<file path=word/header3.xml><?xml version="1.0" encoding="utf-8"?>
+<file path=word/header2.xml><?xml version="1.0" encoding="utf-8"?>
 <w:hdr xmlns:wpc="http://schemas.microsoft.com/office/word/2010/wordprocessingCanvas" xmlns:cx="http://schemas.microsoft.com/office/drawing/2014/chartex" xmlns:cx1="http://schemas.microsoft.com/office/drawing/2015/9/8/chartex" xmlns:cx2="http://schemas.microsoft.com/office/drawing/2015/10/21/chartex" xmlns:cx3="http://schemas.microsoft.com/office/drawing/2016/5/9/chartex" xmlns:cx4="http://schemas.microsoft.com/office/drawing/2016/5/10/chartex" xmlns:cx5="http://schemas.microsoft.com/office/drawing/2016/5/11/chartex" xmlns:cx6="http://schemas.microsoft.com/office/drawing/2016/5/12/chartex" xmlns:cx7="http://schemas.microsoft.com/office/drawing/2016/5/13/chartex" xmlns:cx8="http://schemas.microsoft.com/office/drawing/2016/5/14/chartex" xmlns:mc="http://schemas.openxmlformats.org/markup-compatibility/2006" xmlns:aink="http://schemas.microsoft.com/office/drawing/2016/ink" xmlns:am3d="http://schemas.microsoft.com/office/drawing/2017/model3d" xmlns:o="urn:schemas-microsoft-com:office:office" xmlns:oel="http://schemas.microsoft.com/office/2019/extlst" xmlns:r="http://schemas.openxmlformats.org/officeDocument/2006/relationships" xmlns:m="http://schemas.openxmlformats.org/officeDocument/2006/math" xmlns:v="urn:schemas-microsoft-com:vml" xmlns:wp14="http://schemas.microsoft.com/office/word/2010/wordprocessingDrawing" xmlns:wp="http://schemas.openxmlformats.org/drawingml/2006/wordprocessingDrawing" xmlns:w10="urn:schemas-microsoft-com:office:word" xmlns:w="http://schemas.openxmlformats.org/wordprocessingml/2006/main" xmlns:w14="http://schemas.microsoft.com/office/word/2010/wordml" xmlns:w15="http://schemas.microsoft.com/office/word/2012/wordml" xmlns:w16cex="http://schemas.microsoft.com/office/word/2018/wordml/cex" xmlns:w16cid="http://schemas.microsoft.com/office/word/2016/wordml/cid" xmlns:w16="http://schemas.microsoft.com/office/word/2018/wordml" xmlns:w16du="http://schemas.microsoft.com/office/word/2023/wordml/word16du" xmlns:w16sdtdh="http://schemas.microsoft.com/office/word/2020/wordml/sdtdatahash" xmlns:w16sdtfl="http://schemas.microsoft.com/office/word/2024/wordml/sdtformatlock" xmlns:w16se="http://schemas.microsoft.com/office/word/2015/wordml/symex" xmlns:wpg="http://schemas.microsoft.com/office/word/2010/wordprocessingGroup" xmlns:wpi="http://schemas.microsoft.com/office/word/2010/wordprocessingInk" xmlns:wne="http://schemas.microsoft.com/office/word/2006/wordml" xmlns:wps="http://schemas.microsoft.com/office/word/2010/wordprocessingShape" mc:Ignorable="w14 w15 w16se w16cid w16 w16cex w16sdtdh w16sdtfl w16du wp14">
   <w:p>
     <w:pPr>
@@ -20389,6 +20197,7 @@
   <w:style w:type="character" w:default="1" w:styleId="a0">
     <w:name w:val="Default Paragraph Font"/>
     <w:uiPriority w:val="1"/>
+    <w:semiHidden/>
     <w:unhideWhenUsed/>
   </w:style>
   <w:style w:type="table" w:default="1" w:styleId="a1">

</xml_diff>

<commit_message>
fix: update markdown style application order for better formatting
</commit_message>
<xml_diff>
--- a/demo/docx/demo1.docx
+++ b/demo/docx/demo1.docx
@@ -13,8 +13,13 @@
       <w:pPr>
         <w:pStyle w:val="a3"/>
       </w:pPr>
-      <w:r>
-        <w:t>MinerU supports DOCX document parsing</w:t>
+      <w:proofErr w:type="spellStart"/>
+      <w:r>
+        <w:t>MinerU</w:t>
+      </w:r>
+      <w:proofErr w:type="spellEnd"/>
+      <w:r>
+        <w:t xml:space="preserve"> supports DOCX document parsing</w:t>
       </w:r>
       <w:r>
         <w:rPr>
@@ -143,6 +148,7 @@
           <w:szCs w:val="30"/>
         </w:rPr>
       </w:pPr>
+      <w:proofErr w:type="spellStart"/>
       <w:r>
         <w:rPr>
           <w:rFonts w:eastAsia="楷体_GB2312" w:hint="eastAsia"/>
@@ -150,7 +156,17 @@
           <w:sz w:val="30"/>
           <w:szCs w:val="30"/>
         </w:rPr>
-        <w:t>MinerU Team</w:t>
+        <w:t>MinerU</w:t>
+      </w:r>
+      <w:proofErr w:type="spellEnd"/>
+      <w:r>
+        <w:rPr>
+          <w:rFonts w:eastAsia="楷体_GB2312" w:hint="eastAsia"/>
+          <w:kern w:val="32"/>
+          <w:sz w:val="30"/>
+          <w:szCs w:val="30"/>
+        </w:rPr>
+        <w:t xml:space="preserve"> Team</w:t>
       </w:r>
     </w:p>
     <w:p>
@@ -350,7 +366,7 @@
             </w:rPr>
             <w:fldChar w:fldCharType="separate"/>
           </w:r>
-          <w:hyperlink w:anchor="_Toc223628856" w:history="1">
+          <w:hyperlink w:anchor="_Toc223630197" w:history="1">
             <w:r>
               <w:rPr>
                 <w:rStyle w:val="ae"/>
@@ -398,7 +414,7 @@
                 <w:noProof/>
                 <w:webHidden/>
               </w:rPr>
-              <w:instrText xml:space="preserve"> PAGEREF _Toc223628856 \h </w:instrText>
+              <w:instrText xml:space="preserve"> PAGEREF _Toc223630197 \h </w:instrText>
             </w:r>
             <w:r>
               <w:rPr>
@@ -443,7 +459,7 @@
               <w14:ligatures w14:val="standardContextual"/>
             </w:rPr>
           </w:pPr>
-          <w:hyperlink w:anchor="_Toc223628857" w:history="1">
+          <w:hyperlink w:anchor="_Toc223630198" w:history="1">
             <w:r>
               <w:rPr>
                 <w:rStyle w:val="ae"/>
@@ -491,7 +507,7 @@
                 <w:noProof/>
                 <w:webHidden/>
               </w:rPr>
-              <w:instrText xml:space="preserve"> PAGEREF _Toc223628857 \h </w:instrText>
+              <w:instrText xml:space="preserve"> PAGEREF _Toc223630198 \h </w:instrText>
             </w:r>
             <w:r>
               <w:rPr>
@@ -536,7 +552,7 @@
               <w14:ligatures w14:val="standardContextual"/>
             </w:rPr>
           </w:pPr>
-          <w:hyperlink w:anchor="_Toc223628858" w:history="1">
+          <w:hyperlink w:anchor="_Toc223630199" w:history="1">
             <w:r>
               <w:rPr>
                 <w:rStyle w:val="ae"/>
@@ -584,7 +600,7 @@
                 <w:noProof/>
                 <w:webHidden/>
               </w:rPr>
-              <w:instrText xml:space="preserve"> PAGEREF _Toc223628858 \h </w:instrText>
+              <w:instrText xml:space="preserve"> PAGEREF _Toc223630199 \h </w:instrText>
             </w:r>
             <w:r>
               <w:rPr>
@@ -629,7 +645,7 @@
               <w14:ligatures w14:val="standardContextual"/>
             </w:rPr>
           </w:pPr>
-          <w:hyperlink w:anchor="_Toc223628859" w:history="1">
+          <w:hyperlink w:anchor="_Toc223630200" w:history="1">
             <w:r>
               <w:rPr>
                 <w:rStyle w:val="ae"/>
@@ -677,7 +693,7 @@
                 <w:noProof/>
                 <w:webHidden/>
               </w:rPr>
-              <w:instrText xml:space="preserve"> PAGEREF _Toc223628859 \h </w:instrText>
+              <w:instrText xml:space="preserve"> PAGEREF _Toc223630200 \h </w:instrText>
             </w:r>
             <w:r>
               <w:rPr>
@@ -722,7 +738,7 @@
               <w14:ligatures w14:val="standardContextual"/>
             </w:rPr>
           </w:pPr>
-          <w:hyperlink w:anchor="_Toc223628860" w:history="1">
+          <w:hyperlink w:anchor="_Toc223630201" w:history="1">
             <w:r>
               <w:rPr>
                 <w:rStyle w:val="ae"/>
@@ -770,7 +786,7 @@
                 <w:noProof/>
                 <w:webHidden/>
               </w:rPr>
-              <w:instrText xml:space="preserve"> PAGEREF _Toc223628860 \h </w:instrText>
+              <w:instrText xml:space="preserve"> PAGEREF _Toc223630201 \h </w:instrText>
             </w:r>
             <w:r>
               <w:rPr>
@@ -817,7 +833,7 @@
               <w14:ligatures w14:val="standardContextual"/>
             </w:rPr>
           </w:pPr>
-          <w:hyperlink w:anchor="_Toc223628861" w:history="1">
+          <w:hyperlink w:anchor="_Toc223630202" w:history="1">
             <w:r>
               <w:rPr>
                 <w:rStyle w:val="ae"/>
@@ -966,7 +982,7 @@
                 <w:noProof/>
                 <w:webHidden/>
               </w:rPr>
-              <w:instrText xml:space="preserve"> PAGEREF _Toc223628861 \h </w:instrText>
+              <w:instrText xml:space="preserve"> PAGEREF _Toc223630202 \h </w:instrText>
             </w:r>
             <w:r>
               <w:rPr>
@@ -1011,7 +1027,7 @@
               <w14:ligatures w14:val="standardContextual"/>
             </w:rPr>
           </w:pPr>
-          <w:hyperlink w:anchor="_Toc223628862" w:history="1">
+          <w:hyperlink w:anchor="_Toc223630203" w:history="1">
             <w:r>
               <w:rPr>
                 <w:rStyle w:val="ae"/>
@@ -1059,7 +1075,7 @@
                 <w:noProof/>
                 <w:webHidden/>
               </w:rPr>
-              <w:instrText xml:space="preserve"> PAGEREF _Toc223628862 \h </w:instrText>
+              <w:instrText xml:space="preserve"> PAGEREF _Toc223630203 \h </w:instrText>
             </w:r>
             <w:r>
               <w:rPr>
@@ -1104,7 +1120,7 @@
               <w14:ligatures w14:val="standardContextual"/>
             </w:rPr>
           </w:pPr>
-          <w:hyperlink w:anchor="_Toc223628863" w:history="1">
+          <w:hyperlink w:anchor="_Toc223630204" w:history="1">
             <w:r>
               <w:rPr>
                 <w:rStyle w:val="ae"/>
@@ -1161,16 +1177,7 @@
                 <w:iCs/>
                 <w:noProof/>
               </w:rPr>
-              <w:t xml:space="preserve">斜体 </w:t>
-            </w:r>
-            <w:r>
-              <w:rPr>
-                <w:rStyle w:val="ae"/>
-                <w:rFonts w:cs="宋体"/>
-                <w:b/>
-                <w:noProof/>
-              </w:rPr>
-              <w:t>下划线</w:t>
+              <w:t>斜体</w:t>
             </w:r>
             <w:r>
               <w:rPr>
@@ -1191,7 +1198,7 @@
                 <w:noProof/>
                 <w:webHidden/>
               </w:rPr>
-              <w:instrText xml:space="preserve"> PAGEREF _Toc223628863 \h </w:instrText>
+              <w:instrText xml:space="preserve"> PAGEREF _Toc223630204 \h </w:instrText>
             </w:r>
             <w:r>
               <w:rPr>
@@ -1236,7 +1243,7 @@
               <w14:ligatures w14:val="standardContextual"/>
             </w:rPr>
           </w:pPr>
-          <w:hyperlink w:anchor="_Toc223628864" w:history="1">
+          <w:hyperlink w:anchor="_Toc223630205" w:history="1">
             <w:r>
               <w:rPr>
                 <w:rStyle w:val="ae"/>
@@ -1303,7 +1310,7 @@
                 <w:noProof/>
                 <w:webHidden/>
               </w:rPr>
-              <w:instrText xml:space="preserve"> PAGEREF _Toc223628864 \h </w:instrText>
+              <w:instrText xml:space="preserve"> PAGEREF _Toc223630205 \h </w:instrText>
             </w:r>
             <w:r>
               <w:rPr>
@@ -1348,7 +1355,7 @@
               <w14:ligatures w14:val="standardContextual"/>
             </w:rPr>
           </w:pPr>
-          <w:hyperlink w:anchor="_Toc223628865" w:history="1">
+          <w:hyperlink w:anchor="_Toc223630206" w:history="1">
             <w:r>
               <w:rPr>
                 <w:rStyle w:val="ae"/>
@@ -1414,7 +1421,7 @@
                 <w:noProof/>
                 <w:webHidden/>
               </w:rPr>
-              <w:instrText xml:space="preserve"> PAGEREF _Toc223628865 \h </w:instrText>
+              <w:instrText xml:space="preserve"> PAGEREF _Toc223630206 \h </w:instrText>
             </w:r>
             <w:r>
               <w:rPr>
@@ -1460,7 +1467,7 @@
               <w14:ligatures w14:val="standardContextual"/>
             </w:rPr>
           </w:pPr>
-          <w:hyperlink w:anchor="_Toc223628866" w:history="1">
+          <w:hyperlink w:anchor="_Toc223630207" w:history="1">
             <w:r>
               <w:rPr>
                 <w:rStyle w:val="ae"/>
@@ -1488,7 +1495,7 @@
                 <w:noProof/>
                 <w:webHidden/>
               </w:rPr>
-              <w:instrText xml:space="preserve"> PAGEREF _Toc223628866 \h </w:instrText>
+              <w:instrText xml:space="preserve"> PAGEREF _Toc223630207 \h </w:instrText>
             </w:r>
             <w:r>
               <w:rPr>
@@ -1534,7 +1541,7 @@
               <w14:ligatures w14:val="standardContextual"/>
             </w:rPr>
           </w:pPr>
-          <w:hyperlink w:anchor="_Toc223628867" w:history="1">
+          <w:hyperlink w:anchor="_Toc223630208" w:history="1">
             <w:r>
               <w:rPr>
                 <w:rStyle w:val="ae"/>
@@ -1570,7 +1577,7 @@
                 <w:noProof/>
                 <w:webHidden/>
               </w:rPr>
-              <w:instrText xml:space="preserve"> PAGEREF _Toc223628867 \h </w:instrText>
+              <w:instrText xml:space="preserve"> PAGEREF _Toc223630208 \h </w:instrText>
             </w:r>
             <w:r>
               <w:rPr>
@@ -1615,7 +1622,7 @@
               <w14:ligatures w14:val="standardContextual"/>
             </w:rPr>
           </w:pPr>
-          <w:hyperlink w:anchor="_Toc223628868" w:history="1">
+          <w:hyperlink w:anchor="_Toc223630209" w:history="1">
             <w:r>
               <w:rPr>
                 <w:rStyle w:val="ae"/>
@@ -1659,7 +1666,7 @@
                 <w:noProof/>
                 <w:webHidden/>
               </w:rPr>
-              <w:instrText xml:space="preserve"> PAGEREF _Toc223628868 \h </w:instrText>
+              <w:instrText xml:space="preserve"> PAGEREF _Toc223630209 \h </w:instrText>
             </w:r>
             <w:r>
               <w:rPr>
@@ -1706,7 +1713,7 @@
               <w14:ligatures w14:val="standardContextual"/>
             </w:rPr>
           </w:pPr>
-          <w:hyperlink w:anchor="_Toc223628869" w:history="1">
+          <w:hyperlink w:anchor="_Toc223630210" w:history="1">
             <w:r>
               <w:rPr>
                 <w:rStyle w:val="ae"/>
@@ -1750,7 +1757,7 @@
                 <w:noProof/>
                 <w:webHidden/>
               </w:rPr>
-              <w:instrText xml:space="preserve"> PAGEREF _Toc223628869 \h </w:instrText>
+              <w:instrText xml:space="preserve"> PAGEREF _Toc223630210 \h </w:instrText>
             </w:r>
             <w:r>
               <w:rPr>
@@ -1797,7 +1804,7 @@
               <w14:ligatures w14:val="standardContextual"/>
             </w:rPr>
           </w:pPr>
-          <w:hyperlink w:anchor="_Toc223628870" w:history="1">
+          <w:hyperlink w:anchor="_Toc223630211" w:history="1">
             <w:r>
               <w:rPr>
                 <w:rStyle w:val="ae"/>
@@ -1841,7 +1848,7 @@
                 <w:noProof/>
                 <w:webHidden/>
               </w:rPr>
-              <w:instrText xml:space="preserve"> PAGEREF _Toc223628870 \h </w:instrText>
+              <w:instrText xml:space="preserve"> PAGEREF _Toc223630211 \h </w:instrText>
             </w:r>
             <w:r>
               <w:rPr>
@@ -1886,7 +1893,7 @@
               <w14:ligatures w14:val="standardContextual"/>
             </w:rPr>
           </w:pPr>
-          <w:hyperlink w:anchor="_Toc223628871" w:history="1">
+          <w:hyperlink w:anchor="_Toc223630212" w:history="1">
             <w:r>
               <w:rPr>
                 <w:rStyle w:val="ae"/>
@@ -1930,7 +1937,7 @@
                 <w:noProof/>
                 <w:webHidden/>
               </w:rPr>
-              <w:instrText xml:space="preserve"> PAGEREF _Toc223628871 \h </w:instrText>
+              <w:instrText xml:space="preserve"> PAGEREF _Toc223630212 \h </w:instrText>
             </w:r>
             <w:r>
               <w:rPr>
@@ -1977,7 +1984,7 @@
               <w14:ligatures w14:val="standardContextual"/>
             </w:rPr>
           </w:pPr>
-          <w:hyperlink w:anchor="_Toc223628872" w:history="1">
+          <w:hyperlink w:anchor="_Toc223630213" w:history="1">
             <w:r>
               <w:rPr>
                 <w:rStyle w:val="ae"/>
@@ -2021,7 +2028,7 @@
                 <w:noProof/>
                 <w:webHidden/>
               </w:rPr>
-              <w:instrText xml:space="preserve"> PAGEREF _Toc223628872 \h </w:instrText>
+              <w:instrText xml:space="preserve"> PAGEREF _Toc223630213 \h </w:instrText>
             </w:r>
             <w:r>
               <w:rPr>
@@ -2068,7 +2075,7 @@
               <w14:ligatures w14:val="standardContextual"/>
             </w:rPr>
           </w:pPr>
-          <w:hyperlink w:anchor="_Toc223628873" w:history="1">
+          <w:hyperlink w:anchor="_Toc223630214" w:history="1">
             <w:r>
               <w:rPr>
                 <w:rStyle w:val="ae"/>
@@ -2112,7 +2119,7 @@
                 <w:noProof/>
                 <w:webHidden/>
               </w:rPr>
-              <w:instrText xml:space="preserve"> PAGEREF _Toc223628873 \h </w:instrText>
+              <w:instrText xml:space="preserve"> PAGEREF _Toc223630214 \h </w:instrText>
             </w:r>
             <w:r>
               <w:rPr>
@@ -2159,7 +2166,7 @@
               <w14:ligatures w14:val="standardContextual"/>
             </w:rPr>
           </w:pPr>
-          <w:hyperlink w:anchor="_Toc223628874" w:history="1">
+          <w:hyperlink w:anchor="_Toc223630215" w:history="1">
             <w:r>
               <w:rPr>
                 <w:rStyle w:val="ae"/>
@@ -2203,7 +2210,7 @@
                 <w:noProof/>
                 <w:webHidden/>
               </w:rPr>
-              <w:instrText xml:space="preserve"> PAGEREF _Toc223628874 \h </w:instrText>
+              <w:instrText xml:space="preserve"> PAGEREF _Toc223630215 \h </w:instrText>
             </w:r>
             <w:r>
               <w:rPr>
@@ -2250,7 +2257,7 @@
               <w14:ligatures w14:val="standardContextual"/>
             </w:rPr>
           </w:pPr>
-          <w:hyperlink w:anchor="_Toc223628875" w:history="1">
+          <w:hyperlink w:anchor="_Toc223630216" w:history="1">
             <w:r>
               <w:rPr>
                 <w:rStyle w:val="ae"/>
@@ -2294,7 +2301,7 @@
                 <w:noProof/>
                 <w:webHidden/>
               </w:rPr>
-              <w:instrText xml:space="preserve"> PAGEREF _Toc223628875 \h </w:instrText>
+              <w:instrText xml:space="preserve"> PAGEREF _Toc223630216 \h </w:instrText>
             </w:r>
             <w:r>
               <w:rPr>
@@ -2341,7 +2348,7 @@
               <w14:ligatures w14:val="standardContextual"/>
             </w:rPr>
           </w:pPr>
-          <w:hyperlink w:anchor="_Toc223628876" w:history="1">
+          <w:hyperlink w:anchor="_Toc223630217" w:history="1">
             <w:r>
               <w:rPr>
                 <w:rStyle w:val="ae"/>
@@ -2385,7 +2392,7 @@
                 <w:noProof/>
                 <w:webHidden/>
               </w:rPr>
-              <w:instrText xml:space="preserve"> PAGEREF _Toc223628876 \h </w:instrText>
+              <w:instrText xml:space="preserve"> PAGEREF _Toc223630217 \h </w:instrText>
             </w:r>
             <w:r>
               <w:rPr>
@@ -2431,7 +2438,7 @@
               <w14:ligatures w14:val="standardContextual"/>
             </w:rPr>
           </w:pPr>
-          <w:hyperlink w:anchor="_Toc223628877" w:history="1">
+          <w:hyperlink w:anchor="_Toc223630218" w:history="1">
             <w:r>
               <w:rPr>
                 <w:rStyle w:val="ae"/>
@@ -2466,7 +2473,7 @@
                 <w:noProof/>
                 <w:webHidden/>
               </w:rPr>
-              <w:instrText xml:space="preserve"> PAGEREF _Toc223628877 \h </w:instrText>
+              <w:instrText xml:space="preserve"> PAGEREF _Toc223630218 \h </w:instrText>
             </w:r>
             <w:r>
               <w:rPr>
@@ -2511,7 +2518,7 @@
               <w14:ligatures w14:val="standardContextual"/>
             </w:rPr>
           </w:pPr>
-          <w:hyperlink w:anchor="_Toc223628878" w:history="1">
+          <w:hyperlink w:anchor="_Toc223630219" w:history="1">
             <w:r>
               <w:rPr>
                 <w:rStyle w:val="ae"/>
@@ -2555,7 +2562,7 @@
                 <w:noProof/>
                 <w:webHidden/>
               </w:rPr>
-              <w:instrText xml:space="preserve"> PAGEREF _Toc223628878 \h </w:instrText>
+              <w:instrText xml:space="preserve"> PAGEREF _Toc223630219 \h </w:instrText>
             </w:r>
             <w:r>
               <w:rPr>
@@ -2602,7 +2609,7 @@
               <w14:ligatures w14:val="standardContextual"/>
             </w:rPr>
           </w:pPr>
-          <w:hyperlink w:anchor="_Toc223628879" w:history="1">
+          <w:hyperlink w:anchor="_Toc223630220" w:history="1">
             <w:r>
               <w:rPr>
                 <w:rStyle w:val="ae"/>
@@ -2646,7 +2653,7 @@
                 <w:noProof/>
                 <w:webHidden/>
               </w:rPr>
-              <w:instrText xml:space="preserve"> PAGEREF _Toc223628879 \h </w:instrText>
+              <w:instrText xml:space="preserve"> PAGEREF _Toc223630220 \h </w:instrText>
             </w:r>
             <w:r>
               <w:rPr>
@@ -2693,7 +2700,7 @@
               <w14:ligatures w14:val="standardContextual"/>
             </w:rPr>
           </w:pPr>
-          <w:hyperlink w:anchor="_Toc223628880" w:history="1">
+          <w:hyperlink w:anchor="_Toc223630221" w:history="1">
             <w:r>
               <w:rPr>
                 <w:rStyle w:val="ae"/>
@@ -2737,7 +2744,7 @@
                 <w:noProof/>
                 <w:webHidden/>
               </w:rPr>
-              <w:instrText xml:space="preserve"> PAGEREF _Toc223628880 \h </w:instrText>
+              <w:instrText xml:space="preserve"> PAGEREF _Toc223630221 \h </w:instrText>
             </w:r>
             <w:r>
               <w:rPr>
@@ -2784,7 +2791,7 @@
               <w14:ligatures w14:val="standardContextual"/>
             </w:rPr>
           </w:pPr>
-          <w:hyperlink w:anchor="_Toc223628881" w:history="1">
+          <w:hyperlink w:anchor="_Toc223630222" w:history="1">
             <w:r>
               <w:rPr>
                 <w:rStyle w:val="ae"/>
@@ -2828,7 +2835,7 @@
                 <w:noProof/>
                 <w:webHidden/>
               </w:rPr>
-              <w:instrText xml:space="preserve"> PAGEREF _Toc223628881 \h </w:instrText>
+              <w:instrText xml:space="preserve"> PAGEREF _Toc223630222 \h </w:instrText>
             </w:r>
             <w:r>
               <w:rPr>
@@ -2875,7 +2882,7 @@
               <w14:ligatures w14:val="standardContextual"/>
             </w:rPr>
           </w:pPr>
-          <w:hyperlink w:anchor="_Toc223628882" w:history="1">
+          <w:hyperlink w:anchor="_Toc223630223" w:history="1">
             <w:r>
               <w:rPr>
                 <w:rStyle w:val="ae"/>
@@ -2919,7 +2926,7 @@
                 <w:noProof/>
                 <w:webHidden/>
               </w:rPr>
-              <w:instrText xml:space="preserve"> PAGEREF _Toc223628882 \h </w:instrText>
+              <w:instrText xml:space="preserve"> PAGEREF _Toc223630223 \h </w:instrText>
             </w:r>
             <w:r>
               <w:rPr>
@@ -2966,7 +2973,7 @@
               <w14:ligatures w14:val="standardContextual"/>
             </w:rPr>
           </w:pPr>
-          <w:hyperlink w:anchor="_Toc223628883" w:history="1">
+          <w:hyperlink w:anchor="_Toc223630224" w:history="1">
             <w:r>
               <w:rPr>
                 <w:rStyle w:val="ae"/>
@@ -3010,7 +3017,7 @@
                 <w:noProof/>
                 <w:webHidden/>
               </w:rPr>
-              <w:instrText xml:space="preserve"> PAGEREF _Toc223628883 \h </w:instrText>
+              <w:instrText xml:space="preserve"> PAGEREF _Toc223630224 \h </w:instrText>
             </w:r>
             <w:r>
               <w:rPr>
@@ -3057,7 +3064,7 @@
               <w14:ligatures w14:val="standardContextual"/>
             </w:rPr>
           </w:pPr>
-          <w:hyperlink w:anchor="_Toc223628884" w:history="1">
+          <w:hyperlink w:anchor="_Toc223630225" w:history="1">
             <w:r>
               <w:rPr>
                 <w:rStyle w:val="ae"/>
@@ -3101,7 +3108,7 @@
                 <w:noProof/>
                 <w:webHidden/>
               </w:rPr>
-              <w:instrText xml:space="preserve"> PAGEREF _Toc223628884 \h </w:instrText>
+              <w:instrText xml:space="preserve"> PAGEREF _Toc223630225 \h </w:instrText>
             </w:r>
             <w:r>
               <w:rPr>
@@ -3148,7 +3155,7 @@
               <w14:ligatures w14:val="standardContextual"/>
             </w:rPr>
           </w:pPr>
-          <w:hyperlink w:anchor="_Toc223628885" w:history="1">
+          <w:hyperlink w:anchor="_Toc223630226" w:history="1">
             <w:r>
               <w:rPr>
                 <w:rStyle w:val="ae"/>
@@ -3192,7 +3199,7 @@
                 <w:noProof/>
                 <w:webHidden/>
               </w:rPr>
-              <w:instrText xml:space="preserve"> PAGEREF _Toc223628885 \h </w:instrText>
+              <w:instrText xml:space="preserve"> PAGEREF _Toc223630226 \h </w:instrText>
             </w:r>
             <w:r>
               <w:rPr>
@@ -3237,7 +3244,7 @@
               <w14:ligatures w14:val="standardContextual"/>
             </w:rPr>
           </w:pPr>
-          <w:hyperlink w:anchor="_Toc223628886" w:history="1">
+          <w:hyperlink w:anchor="_Toc223630227" w:history="1">
             <w:r>
               <w:rPr>
                 <w:rStyle w:val="ae"/>
@@ -3281,7 +3288,7 @@
                 <w:noProof/>
                 <w:webHidden/>
               </w:rPr>
-              <w:instrText xml:space="preserve"> PAGEREF _Toc223628886 \h </w:instrText>
+              <w:instrText xml:space="preserve"> PAGEREF _Toc223630227 \h </w:instrText>
             </w:r>
             <w:r>
               <w:rPr>
@@ -3328,7 +3335,7 @@
               <w14:ligatures w14:val="standardContextual"/>
             </w:rPr>
           </w:pPr>
-          <w:hyperlink w:anchor="_Toc223628887" w:history="1">
+          <w:hyperlink w:anchor="_Toc223630228" w:history="1">
             <w:r>
               <w:rPr>
                 <w:rStyle w:val="ae"/>
@@ -3372,7 +3379,7 @@
                 <w:noProof/>
                 <w:webHidden/>
               </w:rPr>
-              <w:instrText xml:space="preserve"> PAGEREF _Toc223628887 \h </w:instrText>
+              <w:instrText xml:space="preserve"> PAGEREF _Toc223630228 \h </w:instrText>
             </w:r>
             <w:r>
               <w:rPr>
@@ -3419,7 +3426,7 @@
               <w14:ligatures w14:val="standardContextual"/>
             </w:rPr>
           </w:pPr>
-          <w:hyperlink w:anchor="_Toc223628888" w:history="1">
+          <w:hyperlink w:anchor="_Toc223630229" w:history="1">
             <w:r>
               <w:rPr>
                 <w:rStyle w:val="ae"/>
@@ -3463,7 +3470,7 @@
                 <w:noProof/>
                 <w:webHidden/>
               </w:rPr>
-              <w:instrText xml:space="preserve"> PAGEREF _Toc223628888 \h </w:instrText>
+              <w:instrText xml:space="preserve"> PAGEREF _Toc223630229 \h </w:instrText>
             </w:r>
             <w:r>
               <w:rPr>
@@ -3510,7 +3517,7 @@
               <w14:ligatures w14:val="standardContextual"/>
             </w:rPr>
           </w:pPr>
-          <w:hyperlink w:anchor="_Toc223628889" w:history="1">
+          <w:hyperlink w:anchor="_Toc223630230" w:history="1">
             <w:r>
               <w:rPr>
                 <w:rStyle w:val="ae"/>
@@ -3554,7 +3561,7 @@
                 <w:noProof/>
                 <w:webHidden/>
               </w:rPr>
-              <w:instrText xml:space="preserve"> PAGEREF _Toc223628889 \h </w:instrText>
+              <w:instrText xml:space="preserve"> PAGEREF _Toc223630230 \h </w:instrText>
             </w:r>
             <w:r>
               <w:rPr>
@@ -3601,7 +3608,7 @@
               <w14:ligatures w14:val="standardContextual"/>
             </w:rPr>
           </w:pPr>
-          <w:hyperlink w:anchor="_Toc223628890" w:history="1">
+          <w:hyperlink w:anchor="_Toc223630231" w:history="1">
             <w:r>
               <w:rPr>
                 <w:rStyle w:val="ae"/>
@@ -3647,7 +3654,7 @@
                 <w:noProof/>
                 <w:webHidden/>
               </w:rPr>
-              <w:instrText xml:space="preserve"> PAGEREF _Toc223628890 \h </w:instrText>
+              <w:instrText xml:space="preserve"> PAGEREF _Toc223630231 \h </w:instrText>
             </w:r>
             <w:r>
               <w:rPr>
@@ -3694,7 +3701,7 @@
               <w14:ligatures w14:val="standardContextual"/>
             </w:rPr>
           </w:pPr>
-          <w:hyperlink w:anchor="_Toc223628891" w:history="1">
+          <w:hyperlink w:anchor="_Toc223630232" w:history="1">
             <w:r>
               <w:rPr>
                 <w:rStyle w:val="ae"/>
@@ -3740,7 +3747,7 @@
                 <w:noProof/>
                 <w:webHidden/>
               </w:rPr>
-              <w:instrText xml:space="preserve"> PAGEREF _Toc223628891 \h </w:instrText>
+              <w:instrText xml:space="preserve"> PAGEREF _Toc223630232 \h </w:instrText>
             </w:r>
             <w:r>
               <w:rPr>
@@ -3838,7 +3845,7 @@
           <w:sz w:val="32"/>
         </w:rPr>
       </w:pPr>
-      <w:bookmarkStart w:id="0" w:name="_Toc223628856"/>
+      <w:bookmarkStart w:id="0" w:name="_Toc223630197"/>
       <w:r>
         <w:rPr>
           <w:rFonts w:ascii="宋体" w:eastAsia="宋体" w:hAnsi="宋体" w:cs="宋体" w:hint="eastAsia"/>
@@ -3864,7 +3871,7 @@
           <w:sz w:val="32"/>
         </w:rPr>
       </w:pPr>
-      <w:bookmarkStart w:id="1" w:name="_Toc223628857"/>
+      <w:bookmarkStart w:id="1" w:name="_Toc223630198"/>
       <w:r>
         <w:rPr>
           <w:rFonts w:ascii="宋体" w:eastAsia="宋体" w:hAnsi="宋体" w:cs="宋体" w:hint="eastAsia"/>
@@ -4036,7 +4043,7 @@
           <w:sz w:val="32"/>
         </w:rPr>
       </w:pPr>
-      <w:bookmarkStart w:id="2" w:name="_Toc223628858"/>
+      <w:bookmarkStart w:id="2" w:name="_Toc223630199"/>
       <w:r>
         <w:rPr>
           <w:rFonts w:ascii="宋体" w:eastAsia="宋体" w:hAnsi="宋体" w:cs="宋体" w:hint="eastAsia"/>
@@ -4314,7 +4321,7 @@
           <w:sz w:val="32"/>
         </w:rPr>
       </w:pPr>
-      <w:bookmarkStart w:id="3" w:name="_Toc223628859"/>
+      <w:bookmarkStart w:id="3" w:name="_Toc223630200"/>
       <w:r>
         <w:rPr>
           <w:rFonts w:ascii="宋体" w:eastAsia="宋体" w:hAnsi="宋体" w:cs="宋体" w:hint="eastAsia"/>
@@ -4496,6 +4503,7 @@
         </w:rPr>
         <w:t xml:space="preserve"> </w:t>
       </w:r>
+      <w:proofErr w:type="gramStart"/>
       <w:r>
         <w:rPr>
           <w:strike/>
@@ -4509,6 +4517,7 @@
         </w:rPr>
         <w:t>h</w:t>
       </w:r>
+      <w:proofErr w:type="gramEnd"/>
     </w:p>
     <w:p>
       <w:pPr>
@@ -4559,7 +4568,7 @@
           <w:sz w:val="32"/>
         </w:rPr>
       </w:pPr>
-      <w:bookmarkStart w:id="4" w:name="_Toc223628860"/>
+      <w:bookmarkStart w:id="4" w:name="_Toc223630201"/>
       <w:r>
         <w:rPr>
           <w:rFonts w:ascii="宋体" w:eastAsia="宋体" w:hAnsi="宋体" w:cs="宋体" w:hint="eastAsia"/>
@@ -4671,24 +4680,56 @@
         </w:rPr>
         <w:t>无序列表项3：</w:t>
       </w:r>
-      <w:hyperlink r:id="rId19" w:history="1">
-        <w:r>
-          <w:rPr>
-            <w:rStyle w:val="ae"/>
-            <w:rFonts w:ascii="宋体" w:eastAsia="宋体" w:hAnsi="宋体" w:cs="宋体"/>
-            <w:sz w:val="22"/>
-          </w:rPr>
-          <w:t>hyperlink</w:t>
-        </w:r>
-        <w:r>
-          <w:rPr>
-            <w:rStyle w:val="ae"/>
-            <w:rFonts w:ascii="宋体" w:eastAsia="宋体" w:hAnsi="宋体" w:cs="宋体" w:hint="eastAsia"/>
-            <w:sz w:val="22"/>
-          </w:rPr>
-          <w:t>超链接文本</w:t>
-        </w:r>
-      </w:hyperlink>
+      <w:r>
+        <w:rPr>
+          <w:rFonts w:ascii="宋体" w:eastAsia="宋体" w:hAnsi="宋体" w:cs="宋体"/>
+          <w:sz w:val="22"/>
+        </w:rPr>
+        <w:fldChar w:fldCharType="begin"/>
+      </w:r>
+      <w:r>
+        <w:rPr>
+          <w:rFonts w:ascii="宋体" w:eastAsia="宋体" w:hAnsi="宋体" w:cs="宋体"/>
+          <w:sz w:val="22"/>
+        </w:rPr>
+        <w:instrText>HYPERLINK "https://github.com/opendatalab/MinerU"</w:instrText>
+      </w:r>
+      <w:r>
+        <w:rPr>
+          <w:rFonts w:ascii="宋体" w:eastAsia="宋体" w:hAnsi="宋体" w:cs="宋体"/>
+          <w:sz w:val="22"/>
+        </w:rPr>
+      </w:r>
+      <w:r>
+        <w:rPr>
+          <w:rFonts w:ascii="宋体" w:eastAsia="宋体" w:hAnsi="宋体" w:cs="宋体"/>
+          <w:sz w:val="22"/>
+        </w:rPr>
+        <w:fldChar w:fldCharType="separate"/>
+      </w:r>
+      <w:r>
+        <w:rPr>
+          <w:rStyle w:val="ae"/>
+          <w:rFonts w:ascii="宋体" w:eastAsia="宋体" w:hAnsi="宋体" w:cs="宋体"/>
+          <w:sz w:val="22"/>
+        </w:rPr>
+        <w:t>hyperlink</w:t>
+      </w:r>
+      <w:r>
+        <w:rPr>
+          <w:rStyle w:val="ae"/>
+          <w:rFonts w:ascii="宋体" w:eastAsia="宋体" w:hAnsi="宋体" w:cs="宋体" w:hint="eastAsia"/>
+          <w:sz w:val="22"/>
+        </w:rPr>
+        <w:t>超链接文本</w:t>
+      </w:r>
+      <w:r>
+        <w:rPr>
+          <w:rFonts w:ascii="宋体" w:eastAsia="宋体" w:hAnsi="宋体" w:cs="宋体"/>
+          <w:sz w:val="22"/>
+        </w:rPr>
+        <w:fldChar w:fldCharType="end"/>
+      </w:r>
     </w:p>
     <w:p>
       <w:pPr>
@@ -4846,7 +4887,7 @@
         </w:rPr>
         <w:t xml:space="preserve"> </w:t>
       </w:r>
-      <w:hyperlink r:id="rId20" w:history="1">
+      <w:hyperlink r:id="rId19" w:history="1">
         <w:r>
           <w:rPr>
             <w:rStyle w:val="ae"/>
@@ -4894,19 +4935,29 @@
         </w:rPr>
         <w:t>无序列表项7：</w:t>
       </w:r>
-      <w:hyperlink r:id="rId21" w:history="1">
-        <w:r>
-          <w:rPr>
-            <w:rStyle w:val="ae"/>
-            <w:b/>
-            <w:bCs/>
-            <w:i/>
-            <w:iCs/>
-            <w:strike/>
-          </w:rPr>
-          <w:t>italic bold underline strikethrough hyperlink</w:t>
-        </w:r>
-      </w:hyperlink>
+      <w:r>
+        <w:fldChar w:fldCharType="begin"/>
+      </w:r>
+      <w:r>
+        <w:instrText>HYPERLINK "https://mineru.net/"</w:instrText>
+      </w:r>
+      <w:r>
+        <w:fldChar w:fldCharType="separate"/>
+      </w:r>
+      <w:r>
+        <w:rPr>
+          <w:rStyle w:val="ae"/>
+          <w:b/>
+          <w:bCs/>
+          <w:i/>
+          <w:iCs/>
+          <w:strike/>
+        </w:rPr>
+        <w:t>italic bold underline strikethrough hyperlink</w:t>
+      </w:r>
+      <w:r>
+        <w:fldChar w:fldCharType="end"/>
+      </w:r>
     </w:p>
     <w:p>
       <w:pPr>
@@ -4923,7 +4974,7 @@
           <w:sz w:val="32"/>
         </w:rPr>
       </w:pPr>
-      <w:bookmarkStart w:id="6" w:name="_Toc223628861"/>
+      <w:bookmarkStart w:id="6" w:name="_Toc223630202"/>
       <w:bookmarkEnd w:id="5"/>
       <w:r>
         <w:rPr>
@@ -5090,7 +5141,7 @@
           <w:sz w:val="32"/>
         </w:rPr>
       </w:pPr>
-      <w:bookmarkStart w:id="7" w:name="_Toc223628862"/>
+      <w:bookmarkStart w:id="7" w:name="_Toc223630203"/>
       <w:r>
         <w:rPr>
           <w:rFonts w:ascii="宋体" w:eastAsia="宋体" w:hAnsi="宋体" w:cs="宋体" w:hint="eastAsia"/>
@@ -5099,18 +5150,55 @@
         </w:rPr>
         <w:t>标题内包含超链接</w:t>
       </w:r>
-      <w:hyperlink r:id="rId22" w:history="1">
-        <w:r>
-          <w:rPr>
-            <w:rStyle w:val="ae"/>
-            <w:rFonts w:ascii="宋体" w:eastAsia="宋体" w:hAnsi="宋体" w:cs="宋体"/>
-            <w:b/>
-            <w:sz w:val="32"/>
-          </w:rPr>
-          <w:t>hyperlink</w:t>
-        </w:r>
-        <w:bookmarkEnd w:id="7"/>
-      </w:hyperlink>
+      <w:r>
+        <w:rPr>
+          <w:rFonts w:ascii="宋体" w:eastAsia="宋体" w:hAnsi="宋体" w:cs="宋体"/>
+          <w:b/>
+          <w:sz w:val="32"/>
+        </w:rPr>
+        <w:fldChar w:fldCharType="begin"/>
+      </w:r>
+      <w:r>
+        <w:rPr>
+          <w:rFonts w:ascii="宋体" w:eastAsia="宋体" w:hAnsi="宋体" w:cs="宋体"/>
+          <w:b/>
+          <w:sz w:val="32"/>
+        </w:rPr>
+        <w:instrText>HYPERLINK "https://mineru.net/"</w:instrText>
+      </w:r>
+      <w:r>
+        <w:rPr>
+          <w:rFonts w:ascii="宋体" w:eastAsia="宋体" w:hAnsi="宋体" w:cs="宋体"/>
+          <w:b/>
+          <w:sz w:val="32"/>
+        </w:rPr>
+      </w:r>
+      <w:r>
+        <w:rPr>
+          <w:rFonts w:ascii="宋体" w:eastAsia="宋体" w:hAnsi="宋体" w:cs="宋体"/>
+          <w:b/>
+          <w:sz w:val="32"/>
+        </w:rPr>
+        <w:fldChar w:fldCharType="separate"/>
+      </w:r>
+      <w:r>
+        <w:rPr>
+          <w:rStyle w:val="ae"/>
+          <w:rFonts w:ascii="宋体" w:eastAsia="宋体" w:hAnsi="宋体" w:cs="宋体"/>
+          <w:b/>
+          <w:sz w:val="32"/>
+        </w:rPr>
+        <w:t>hyperlink</w:t>
+      </w:r>
+      <w:bookmarkEnd w:id="7"/>
+      <w:r>
+        <w:rPr>
+          <w:rFonts w:ascii="宋体" w:eastAsia="宋体" w:hAnsi="宋体" w:cs="宋体"/>
+          <w:b/>
+          <w:sz w:val="32"/>
+        </w:rPr>
+        <w:fldChar w:fldCharType="end"/>
+      </w:r>
     </w:p>
     <w:p>
       <w:pPr>
@@ -5127,7 +5215,7 @@
           <w:sz w:val="32"/>
         </w:rPr>
       </w:pPr>
-      <w:bookmarkStart w:id="8" w:name="_Toc223628863"/>
+      <w:bookmarkStart w:id="8" w:name="_Toc223630204"/>
       <w:r>
         <w:rPr>
           <w:rFonts w:ascii="宋体" w:eastAsia="宋体" w:hAnsi="宋体" w:cs="宋体" w:hint="eastAsia"/>
@@ -5170,25 +5258,6 @@
           <w:sz w:val="32"/>
         </w:rPr>
         <w:t>斜体</w:t>
-      </w:r>
-      <w:r>
-        <w:rPr>
-          <w:rFonts w:ascii="宋体" w:eastAsia="宋体" w:hAnsi="宋体" w:cs="宋体" w:hint="eastAsia"/>
-          <w:b/>
-          <w:i/>
-          <w:iCs/>
-          <w:sz w:val="32"/>
-        </w:rPr>
-        <w:t xml:space="preserve"> </w:t>
-      </w:r>
-      <w:r>
-        <w:rPr>
-          <w:rFonts w:ascii="宋体" w:eastAsia="宋体" w:hAnsi="宋体" w:cs="宋体" w:hint="eastAsia"/>
-          <w:b/>
-          <w:sz w:val="32"/>
-          <w:u w:val="words"/>
-        </w:rPr>
-        <w:t>下划线</w:t>
       </w:r>
       <w:bookmarkEnd w:id="8"/>
     </w:p>
@@ -5207,7 +5276,7 @@
           <w:sz w:val="32"/>
         </w:rPr>
       </w:pPr>
-      <w:bookmarkStart w:id="9" w:name="_Toc223628864"/>
+      <w:bookmarkStart w:id="9" w:name="_Toc223630205"/>
       <w:r>
         <w:rPr>
           <w:rFonts w:ascii="宋体" w:eastAsia="宋体" w:hAnsi="宋体" w:cs="宋体" w:hint="eastAsia"/>
@@ -5324,7 +5393,7 @@
         </w:rPr>
         <w:t>和超链接</w:t>
       </w:r>
-      <w:hyperlink r:id="rId23" w:history="1">
+      <w:hyperlink r:id="rId20" w:history="1">
         <w:r>
           <w:rPr>
             <w:rStyle w:val="ae"/>
@@ -5352,7 +5421,7 @@
           <w:sz w:val="32"/>
         </w:rPr>
       </w:pPr>
-      <w:bookmarkStart w:id="10" w:name="_Toc223628865"/>
+      <w:bookmarkStart w:id="10" w:name="_Toc223630206"/>
       <w:r>
         <w:rPr>
           <w:rFonts w:ascii="宋体" w:eastAsia="宋体" w:hAnsi="宋体" w:cs="宋体" w:hint="eastAsia"/>
@@ -5557,7 +5626,7 @@
           <w:szCs w:val="32"/>
         </w:rPr>
         <w:sectPr>
-          <w:footerReference w:type="default" r:id="rId24"/>
+          <w:footerReference w:type="default" r:id="rId21"/>
           <w:pgSz w:w="11906" w:h="16838"/>
           <w:pgMar w:top="1440" w:right="1800" w:bottom="1440" w:left="1800" w:header="851" w:footer="992" w:gutter="0"/>
           <w:pgNumType w:fmt="lowerRoman" w:start="1"/>
@@ -5576,7 +5645,7 @@
           <w:szCs w:val="32"/>
         </w:rPr>
       </w:pPr>
-      <w:bookmarkStart w:id="11" w:name="_Toc223628866"/>
+      <w:bookmarkStart w:id="11" w:name="_Toc223630207"/>
       <w:r>
         <w:rPr>
           <w:rFonts w:asciiTheme="majorEastAsia" w:hAnsiTheme="majorEastAsia" w:hint="eastAsia"/>
@@ -5620,7 +5689,7 @@
           <w:szCs w:val="32"/>
         </w:rPr>
       </w:pPr>
-      <w:bookmarkStart w:id="12" w:name="_Toc223628867"/>
+      <w:bookmarkStart w:id="12" w:name="_Toc223630208"/>
       <w:r>
         <w:rPr>
           <w:rFonts w:asciiTheme="majorEastAsia" w:hAnsiTheme="majorEastAsia" w:hint="eastAsia"/>
@@ -5656,7 +5725,7 @@
         </w:numPr>
         <w:ind w:left="880" w:hanging="440"/>
       </w:pPr>
-      <w:bookmarkStart w:id="13" w:name="_Toc223628868"/>
+      <w:bookmarkStart w:id="13" w:name="_Toc223630209"/>
       <w:r>
         <w:rPr>
           <w:rFonts w:hint="eastAsia"/>
@@ -5682,7 +5751,7 @@
           <w:numId w:val="4"/>
         </w:numPr>
       </w:pPr>
-      <w:bookmarkStart w:id="14" w:name="_Toc223628869"/>
+      <w:bookmarkStart w:id="14" w:name="_Toc223630210"/>
       <w:r>
         <w:t>Grouped image</w:t>
       </w:r>
@@ -5735,7 +5804,7 @@
                           </pic:cNvPicPr>
                         </pic:nvPicPr>
                         <pic:blipFill>
-                          <a:blip r:embed="rId25" cstate="print">
+                          <a:blip r:embed="rId22" cstate="print">
                             <a:extLst>
                               <a:ext uri="{28A0092B-C50C-407E-A947-70E740481C1C}">
                                 <a14:useLocalDpi xmlns:a14="http://schemas.microsoft.com/office/drawing/2010/main" val="0"/>
@@ -5768,7 +5837,7 @@
                           </pic:cNvPicPr>
                         </pic:nvPicPr>
                         <pic:blipFill>
-                          <a:blip r:embed="rId26">
+                          <a:blip r:embed="rId23">
                             <a:extLst>
                               <a:ext uri="{28A0092B-C50C-407E-A947-70E740481C1C}">
                                 <a14:useLocalDpi xmlns:a14="http://schemas.microsoft.com/office/drawing/2010/main" val="0"/>
@@ -5823,11 +5892,11 @@
                   <o:lock v:ext="edit" aspectratio="t"/>
                 </v:shapetype>
                 <v:shape id="Picture 1" o:spid="_x0000_s1027" type="#_x0000_t75" style="position:absolute;width:10604;height:10604;visibility:visible;mso-wrap-style:square" o:gfxdata="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" stroked="t" strokecolor="#156082 [3204]">
-                  <v:imagedata r:id="rId27" o:title=""/>
+                  <v:imagedata r:id="rId24" o:title=""/>
                   <v:path arrowok="t"/>
                 </v:shape>
                 <v:shape id="Picture 2" o:spid="_x0000_s1028" type="#_x0000_t75" style="position:absolute;left:10951;width:10605;height:10604;visibility:visible;mso-wrap-style:square" o:gfxdata="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" stroked="t" strokecolor="#156082 [3204]">
-                  <v:imagedata r:id="rId28" o:title=""/>
+                  <v:imagedata r:id="rId25" o:title=""/>
                   <v:path arrowok="t"/>
                 </v:shape>
                 <w10:wrap type="topAndBottom"/>
@@ -5848,7 +5917,7 @@
           <w:numId w:val="4"/>
         </w:numPr>
       </w:pPr>
-      <w:bookmarkStart w:id="15" w:name="_Toc223628870"/>
+      <w:bookmarkStart w:id="15" w:name="_Toc223630211"/>
       <w:r>
         <w:rPr>
           <w:rFonts w:hint="eastAsia"/>
@@ -5909,7 +5978,7 @@
                     <pic:cNvPicPr/>
                   </pic:nvPicPr>
                   <pic:blipFill>
-                    <a:blip r:embed="rId29" cstate="print">
+                    <a:blip r:embed="rId26" cstate="print">
                       <a:extLst>
                         <a:ext uri="{28A0092B-C50C-407E-A947-70E740481C1C}">
                           <a14:useLocalDpi xmlns:a14="http://schemas.microsoft.com/office/drawing/2010/main" val="0"/>
@@ -5957,7 +6026,7 @@
                     <pic:cNvPicPr/>
                   </pic:nvPicPr>
                   <pic:blipFill>
-                    <a:blip r:embed="rId30" cstate="print">
+                    <a:blip r:embed="rId27" cstate="print">
                       <a:extLst>
                         <a:ext uri="{28A0092B-C50C-407E-A947-70E740481C1C}">
                           <a14:useLocalDpi xmlns:a14="http://schemas.microsoft.com/office/drawing/2010/main" val="0"/>
@@ -5993,7 +6062,7 @@
         </w:numPr>
         <w:ind w:left="880" w:hanging="440"/>
       </w:pPr>
-      <w:bookmarkStart w:id="16" w:name="_Toc223628871"/>
+      <w:bookmarkStart w:id="16" w:name="_Toc223630212"/>
       <w:r>
         <w:rPr>
           <w:rFonts w:hint="eastAsia"/>
@@ -6010,7 +6079,7 @@
           <w:numId w:val="4"/>
         </w:numPr>
       </w:pPr>
-      <w:bookmarkStart w:id="17" w:name="_Toc223628872"/>
+      <w:bookmarkStart w:id="17" w:name="_Toc223630213"/>
       <w:r>
         <w:t>Table with rich cell</w:t>
       </w:r>
@@ -6338,7 +6407,7 @@
       <w:pPr>
         <w:pStyle w:val="3"/>
       </w:pPr>
-      <w:bookmarkStart w:id="18" w:name="_Toc223628873"/>
+      <w:bookmarkStart w:id="18" w:name="_Toc223630214"/>
       <w:r>
         <w:rPr>
           <w:rFonts w:hint="eastAsia"/>
@@ -6791,7 +6860,7 @@
       <w:pPr>
         <w:pStyle w:val="3"/>
       </w:pPr>
-      <w:bookmarkStart w:id="19" w:name="_Toc223628874"/>
+      <w:bookmarkStart w:id="19" w:name="_Toc223630215"/>
       <w:r>
         <w:rPr>
           <w:rFonts w:hint="eastAsia"/>
@@ -6885,7 +6954,7 @@
                           </pic:cNvPicPr>
                         </pic:nvPicPr>
                         <pic:blipFill>
-                          <a:blip r:embed="rId31" cstate="print">
+                          <a:blip r:embed="rId28" cstate="print">
                             <a:extLst>
                               <a:ext uri="{28A0092B-C50C-407E-A947-70E740481C1C}">
                                 <a14:useLocalDpi xmlns:a14="http://schemas.microsoft.com/office/drawing/2010/main" val="0"/>
@@ -6963,7 +7032,7 @@
                           </pic:cNvPicPr>
                         </pic:nvPicPr>
                         <pic:blipFill>
-                          <a:blip r:embed="rId32" cstate="print">
+                          <a:blip r:embed="rId29" cstate="print">
                             <a:extLst>
                               <a:ext uri="{28A0092B-C50C-407E-A947-70E740481C1C}">
                                 <a14:useLocalDpi xmlns:a14="http://schemas.microsoft.com/office/drawing/2010/main" val="0"/>
@@ -7017,7 +7086,7 @@
           <w:szCs w:val="21"/>
         </w:rPr>
       </w:pPr>
-      <w:bookmarkStart w:id="20" w:name="_Toc223628875"/>
+      <w:bookmarkStart w:id="20" w:name="_Toc223630216"/>
       <w:r>
         <w:rPr>
           <w:rFonts w:hint="eastAsia"/>
@@ -7373,7 +7442,7 @@
       <w:pPr>
         <w:pStyle w:val="3"/>
       </w:pPr>
-      <w:bookmarkStart w:id="21" w:name="_Toc223628876"/>
+      <w:bookmarkStart w:id="21" w:name="_Toc223630217"/>
       <w:r>
         <w:rPr>
           <w:rFonts w:hint="eastAsia"/>
@@ -7797,6 +7866,7 @@
                 <w:b/>
               </w:rPr>
             </w:pPr>
+            <w:proofErr w:type="spellStart"/>
             <w:r>
               <w:rPr>
                 <w:rFonts w:hint="eastAsia"/>
@@ -7818,6 +7888,7 @@
               </w:rPr>
               <w:t>基本情况</w:t>
             </w:r>
+            <w:proofErr w:type="spellEnd"/>
           </w:p>
         </w:tc>
       </w:tr>
@@ -7865,6 +7936,7 @@
               <w:spacing w:line="360" w:lineRule="auto"/>
               <w:jc w:val="center"/>
             </w:pPr>
+            <w:proofErr w:type="spellStart"/>
             <w:r>
               <w:rPr>
                 <w:rFonts w:hint="eastAsia"/>
@@ -7872,6 +7944,7 @@
               </w:rPr>
               <w:t>MinerU</w:t>
             </w:r>
+            <w:proofErr w:type="spellEnd"/>
           </w:p>
         </w:tc>
         <w:tc>
@@ -8003,7 +8076,7 @@
                           <pic:cNvPicPr/>
                         </pic:nvPicPr>
                         <pic:blipFill>
-                          <a:blip r:embed="rId33">
+                          <a:blip r:embed="rId30">
                             <a:extLst>
                               <a:ext uri="{28A0092B-C50C-407E-A947-70E740481C1C}">
                                 <a14:useLocalDpi xmlns:a14="http://schemas.microsoft.com/office/drawing/2010/main" val="0"/>
@@ -9740,12 +9813,28 @@
               <w:spacing w:line="360" w:lineRule="auto"/>
               <w:jc w:val="center"/>
             </w:pPr>
+            <w:proofErr w:type="spellStart"/>
             <w:r>
               <w:rPr>
                 <w:rFonts w:hint="eastAsia"/>
               </w:rPr>
-              <w:t>省份/城市</w:t>
-            </w:r>
+              <w:t>省份</w:t>
+            </w:r>
+            <w:proofErr w:type="spellEnd"/>
+            <w:r>
+              <w:rPr>
+                <w:rFonts w:hint="eastAsia"/>
+              </w:rPr>
+              <w:t>/</w:t>
+            </w:r>
+            <w:proofErr w:type="spellStart"/>
+            <w:r>
+              <w:rPr>
+                <w:rFonts w:hint="eastAsia"/>
+              </w:rPr>
+              <w:t>城市</w:t>
+            </w:r>
+            <w:proofErr w:type="spellEnd"/>
           </w:p>
         </w:tc>
         <w:tc>
@@ -9796,12 +9885,14 @@
               <w:spacing w:line="360" w:lineRule="auto"/>
               <w:jc w:val="center"/>
             </w:pPr>
+            <w:proofErr w:type="spellStart"/>
             <w:r>
               <w:rPr>
                 <w:rFonts w:hint="eastAsia"/>
               </w:rPr>
               <w:t>部门、岗位或职务</w:t>
             </w:r>
+            <w:proofErr w:type="spellEnd"/>
           </w:p>
         </w:tc>
         <w:tc>
@@ -10365,12 +10456,14 @@
             <w:pPr>
               <w:spacing w:line="360" w:lineRule="auto"/>
             </w:pPr>
+            <w:proofErr w:type="spellStart"/>
             <w:r>
               <w:rPr>
                 <w:rFonts w:hint="eastAsia"/>
               </w:rPr>
               <w:t>是否有试用期</w:t>
             </w:r>
+            <w:proofErr w:type="spellEnd"/>
           </w:p>
         </w:tc>
         <w:tc>
@@ -11291,7 +11384,7 @@
           <w:szCs w:val="32"/>
         </w:rPr>
       </w:pPr>
-      <w:bookmarkStart w:id="22" w:name="_Toc223628877"/>
+      <w:bookmarkStart w:id="22" w:name="_Toc223630218"/>
       <w:r>
         <w:rPr>
           <w:rFonts w:asciiTheme="majorEastAsia" w:hAnsiTheme="majorEastAsia"/>
@@ -11322,7 +11415,7 @@
         </w:tabs>
         <w:ind w:left="1260" w:hanging="840"/>
       </w:pPr>
-      <w:bookmarkStart w:id="23" w:name="_Toc223628878"/>
+      <w:bookmarkStart w:id="23" w:name="_Toc223630219"/>
       <w:r>
         <w:rPr>
           <w:rFonts w:hint="eastAsia"/>
@@ -11335,7 +11428,7 @@
       <w:pPr>
         <w:pStyle w:val="3"/>
       </w:pPr>
-      <w:bookmarkStart w:id="24" w:name="_Toc223628879"/>
+      <w:bookmarkStart w:id="24" w:name="_Toc223630220"/>
       <w:r>
         <w:rPr>
           <w:rFonts w:hint="eastAsia"/>
@@ -11391,7 +11484,7 @@
       <w:pPr>
         <w:pStyle w:val="3"/>
       </w:pPr>
-      <w:bookmarkStart w:id="25" w:name="_Toc223628880"/>
+      <w:bookmarkStart w:id="25" w:name="_Toc223630221"/>
       <w:r>
         <w:rPr>
           <w:rFonts w:hint="eastAsia"/>
@@ -11440,7 +11533,7 @@
       <w:pPr>
         <w:pStyle w:val="3"/>
       </w:pPr>
-      <w:bookmarkStart w:id="26" w:name="_Toc223628881"/>
+      <w:bookmarkStart w:id="26" w:name="_Toc223630222"/>
       <w:r>
         <w:rPr>
           <w:rFonts w:hint="eastAsia"/>
@@ -11499,7 +11592,7 @@
       <w:pPr>
         <w:pStyle w:val="3"/>
       </w:pPr>
-      <w:bookmarkStart w:id="27" w:name="_Toc223628882"/>
+      <w:bookmarkStart w:id="27" w:name="_Toc223630223"/>
       <w:r>
         <w:rPr>
           <w:rFonts w:hint="eastAsia"/>
@@ -11551,7 +11644,7 @@
       <w:pPr>
         <w:pStyle w:val="3"/>
       </w:pPr>
-      <w:bookmarkStart w:id="28" w:name="_Toc223628883"/>
+      <w:bookmarkStart w:id="28" w:name="_Toc223630224"/>
       <w:r>
         <w:rPr>
           <w:rFonts w:hint="eastAsia"/>
@@ -11603,7 +11696,7 @@
       <w:pPr>
         <w:pStyle w:val="3"/>
       </w:pPr>
-      <w:bookmarkStart w:id="29" w:name="_Toc223628884"/>
+      <w:bookmarkStart w:id="29" w:name="_Toc223630225"/>
       <w:r>
         <w:rPr>
           <w:rFonts w:hint="eastAsia"/>
@@ -11660,7 +11753,7 @@
       <w:pPr>
         <w:pStyle w:val="3"/>
       </w:pPr>
-      <w:bookmarkStart w:id="30" w:name="_Toc223628885"/>
+      <w:bookmarkStart w:id="30" w:name="_Toc223630226"/>
       <w:r>
         <w:rPr>
           <w:rFonts w:hint="eastAsia"/>
@@ -14130,7 +14223,7 @@
         </w:tabs>
         <w:ind w:left="1260" w:hanging="840"/>
       </w:pPr>
-      <w:bookmarkStart w:id="31" w:name="_Toc223628886"/>
+      <w:bookmarkStart w:id="31" w:name="_Toc223630227"/>
       <w:r>
         <w:rPr>
           <w:rFonts w:hint="eastAsia"/>
@@ -14148,7 +14241,7 @@
           <w:numId w:val="10"/>
         </w:numPr>
       </w:pPr>
-      <w:bookmarkStart w:id="32" w:name="_Toc223628887"/>
+      <w:bookmarkStart w:id="32" w:name="_Toc223630228"/>
       <w:r>
         <w:rPr>
           <w:rFonts w:hint="eastAsia"/>
@@ -14238,7 +14331,7 @@
       <w:pPr>
         <w:pStyle w:val="3"/>
       </w:pPr>
-      <w:bookmarkStart w:id="33" w:name="_Toc223628888"/>
+      <w:bookmarkStart w:id="33" w:name="_Toc223630229"/>
       <w:r>
         <w:t>2</w:t>
       </w:r>
@@ -14597,7 +14690,7 @@
       <w:pPr>
         <w:pStyle w:val="3"/>
       </w:pPr>
-      <w:bookmarkStart w:id="34" w:name="_Toc223628889"/>
+      <w:bookmarkStart w:id="34" w:name="_Toc223630230"/>
       <w:r>
         <w:t>2</w:t>
       </w:r>
@@ -14643,7 +14736,7 @@
             <wp:cNvGraphicFramePr/>
             <a:graphic xmlns:a="http://schemas.openxmlformats.org/drawingml/2006/main">
               <a:graphicData uri="http://schemas.openxmlformats.org/drawingml/2006/chart">
-                <c:chart xmlns:c="http://schemas.openxmlformats.org/drawingml/2006/chart" xmlns:r="http://schemas.openxmlformats.org/officeDocument/2006/relationships" r:id="rId34"/>
+                <c:chart xmlns:c="http://schemas.openxmlformats.org/drawingml/2006/chart" xmlns:r="http://schemas.openxmlformats.org/officeDocument/2006/relationships" r:id="rId31"/>
               </a:graphicData>
             </a:graphic>
           </wp:inline>
@@ -14729,7 +14822,7 @@
             <wp:cNvGraphicFramePr/>
             <a:graphic xmlns:a="http://schemas.openxmlformats.org/drawingml/2006/main">
               <a:graphicData uri="http://schemas.openxmlformats.org/drawingml/2006/chart">
-                <c:chart xmlns:c="http://schemas.openxmlformats.org/drawingml/2006/chart" xmlns:r="http://schemas.openxmlformats.org/officeDocument/2006/relationships" r:id="rId35"/>
+                <c:chart xmlns:c="http://schemas.openxmlformats.org/drawingml/2006/chart" xmlns:r="http://schemas.openxmlformats.org/officeDocument/2006/relationships" r:id="rId32"/>
               </a:graphicData>
             </a:graphic>
           </wp:inline>
@@ -14807,7 +14900,7 @@
           <w:szCs w:val="32"/>
         </w:rPr>
       </w:pPr>
-      <w:bookmarkStart w:id="35" w:name="_Toc223628890"/>
+      <w:bookmarkStart w:id="35" w:name="_Toc223630231"/>
       <w:r>
         <w:rPr>
           <w:rFonts w:asciiTheme="majorEastAsia" w:hAnsiTheme="majorEastAsia"/>
@@ -14867,16 +14960,48 @@
         </w:rPr>
         <w:t>订立</w:t>
       </w:r>
-      <w:hyperlink r:id="rId36" w:history="1">
-        <w:r>
-          <w:rPr>
-            <w:rStyle w:val="ae"/>
-            <w:rFonts w:ascii="宋体" w:hAnsi="宋体" w:cs="宋体" w:hint="eastAsia"/>
-            <w:szCs w:val="24"/>
-          </w:rPr>
-          <w:t>补充合同</w:t>
-        </w:r>
-      </w:hyperlink>
+      <w:r>
+        <w:rPr>
+          <w:rFonts w:ascii="宋体" w:hAnsi="宋体" w:cs="宋体"/>
+          <w:szCs w:val="24"/>
+        </w:rPr>
+        <w:fldChar w:fldCharType="begin"/>
+      </w:r>
+      <w:r>
+        <w:rPr>
+          <w:rFonts w:ascii="宋体" w:hAnsi="宋体" w:cs="宋体" w:hint="eastAsia"/>
+          <w:szCs w:val="24"/>
+        </w:rPr>
+        <w:instrText>HYPERLINK "https://github.com/opendatalab/MinerU"</w:instrText>
+      </w:r>
+      <w:r>
+        <w:rPr>
+          <w:rFonts w:ascii="宋体" w:hAnsi="宋体" w:cs="宋体"/>
+          <w:szCs w:val="24"/>
+        </w:rPr>
+      </w:r>
+      <w:r>
+        <w:rPr>
+          <w:rFonts w:ascii="宋体" w:hAnsi="宋体" w:cs="宋体"/>
+          <w:szCs w:val="24"/>
+        </w:rPr>
+        <w:fldChar w:fldCharType="separate"/>
+      </w:r>
+      <w:r>
+        <w:rPr>
+          <w:rStyle w:val="ae"/>
+          <w:rFonts w:ascii="宋体" w:hAnsi="宋体" w:cs="宋体" w:hint="eastAsia"/>
+          <w:szCs w:val="24"/>
+        </w:rPr>
+        <w:t>补充合同</w:t>
+      </w:r>
+      <w:r>
+        <w:rPr>
+          <w:rFonts w:ascii="宋体" w:hAnsi="宋体" w:cs="宋体"/>
+          <w:szCs w:val="24"/>
+        </w:rPr>
+        <w:fldChar w:fldCharType="end"/>
+      </w:r>
       <w:r>
         <w:rPr>
           <w:rFonts w:ascii="宋体" w:hAnsi="宋体" w:cs="宋体" w:hint="eastAsia"/>
@@ -15428,6 +15553,7 @@
           <w:szCs w:val="24"/>
         </w:rPr>
       </w:pPr>
+      <w:proofErr w:type="spellStart"/>
       <w:r>
         <w:rPr>
           <w:rFonts w:ascii="宋体" w:hAnsi="宋体" w:cs="宋体" w:hint="eastAsia"/>
@@ -15439,6 +15565,7 @@
         </w:rPr>
         <w:t>xyz</w:t>
       </w:r>
+      <w:proofErr w:type="spellEnd"/>
       <w:r>
         <w:rPr>
           <w:rFonts w:ascii="宋体" w:hAnsi="宋体" w:cs="宋体" w:hint="eastAsia"/>
@@ -15579,7 +15706,7 @@
         <w:lastRenderedPageBreak/>
         <w:t>文本</w:t>
       </w:r>
-      <w:hyperlink r:id="rId37" w:history="1">
+      <w:hyperlink r:id="rId33" w:history="1">
         <w:r>
           <w:rPr>
             <w:rStyle w:val="ae"/>
@@ -15800,7 +15927,7 @@
           <w:szCs w:val="32"/>
         </w:rPr>
       </w:pPr>
-      <w:bookmarkStart w:id="36" w:name="_Toc223628891"/>
+      <w:bookmarkStart w:id="36" w:name="_Toc223630232"/>
       <w:r>
         <w:rPr>
           <w:rFonts w:asciiTheme="majorEastAsia" w:hAnsiTheme="majorEastAsia"/>
@@ -16317,7 +16444,7 @@
       </w:pPr>
     </w:p>
     <w:sectPr>
-      <w:footerReference w:type="default" r:id="rId38"/>
+      <w:footerReference w:type="default" r:id="rId34"/>
       <w:pgSz w:w="11906" w:h="16838"/>
       <w:pgMar w:top="1440" w:right="1800" w:bottom="1440" w:left="1800" w:header="851" w:footer="992" w:gutter="0"/>
       <w:pgNumType w:start="1"/>

</xml_diff>

<commit_message>
feat: enhance paragraph text extraction to include inline content controls
</commit_message>
<xml_diff>
--- a/demo/docx/demo1.docx
+++ b/demo/docx/demo1.docx
@@ -5210,27 +5210,19 @@
         <w:jc w:val="left"/>
         <w:outlineLvl w:val="1"/>
         <w:rPr>
+          <w:rFonts w:ascii="宋体" w:eastAsia="宋体" w:hAnsi="宋体" w:cs="宋体"/>
+          <w:b/>
+          <w:sz w:val="32"/>
+        </w:rPr>
+      </w:pPr>
+      <w:bookmarkStart w:id="8" w:name="_Toc223630204"/>
+      <w:r>
+        <w:rPr>
           <w:rFonts w:ascii="宋体" w:eastAsia="宋体" w:hAnsi="宋体" w:cs="宋体" w:hint="eastAsia"/>
           <w:b/>
           <w:sz w:val="32"/>
         </w:rPr>
-      </w:pPr>
-      <w:bookmarkStart w:id="8" w:name="_Toc223630204"/>
-      <w:r>
-        <w:rPr>
-          <w:rFonts w:ascii="宋体" w:eastAsia="宋体" w:hAnsi="宋体" w:cs="宋体" w:hint="eastAsia"/>
-          <w:b/>
-          <w:sz w:val="32"/>
-        </w:rPr>
-        <w:t>标题内包含</w:t>
-      </w:r>
-      <w:r>
-        <w:rPr>
-          <w:rFonts w:ascii="宋体" w:eastAsia="宋体" w:hAnsi="宋体" w:cs="宋体" w:hint="eastAsia"/>
-          <w:b/>
-          <w:sz w:val="32"/>
-        </w:rPr>
-        <w:t xml:space="preserve"> </w:t>
+        <w:t xml:space="preserve">标题内包含 </w:t>
       </w:r>
       <w:r>
         <w:rPr>
@@ -5660,24 +5652,76 @@
     <w:p>
       <w:pPr>
         <w:pStyle w:val="af9"/>
-      </w:pPr>
-      <w:r>
-        <w:rPr>
-          <w:rFonts w:asciiTheme="minorEastAsia" w:hAnsiTheme="minorEastAsia" w:hint="eastAsia"/>
-          <w:b/>
-        </w:rPr>
-        <w:t xml:space="preserve"> </w:t>
-      </w:r>
-      <w:r>
-        <w:rPr>
-          <w:rFonts w:asciiTheme="minorEastAsia" w:hAnsiTheme="minorEastAsia"/>
-          <w:b/>
-        </w:rPr>
-        <w:t xml:space="preserve">   </w:t>
-      </w:r>
+        <w:ind w:firstLine="480"/>
+      </w:pPr>
       <w:r>
         <w:t>在这个日新月异、瞬息万变的时代背景下，我们不可避免地需要面对一系列错综复杂的多维度挑战与前所未有的历史性机遇。众所周知，事物的发展始终遵循着其内在的客观规律，并在不断的迭代与重塑中寻找新的动态平衡点。</w:t>
       </w:r>
+    </w:p>
+    <w:p>
+      <w:pPr>
+        <w:pStyle w:val="af9"/>
+        <w:rPr>
+          <w:rFonts w:hint="eastAsia"/>
+        </w:rPr>
+      </w:pPr>
+      <w:r>
+        <w:rPr>
+          <w:rFonts w:hint="eastAsia"/>
+        </w:rPr>
+        <w:t>正文内插入内联SDT元素</w:t>
+      </w:r>
+      <w:sdt>
+        <w:sdtPr>
+          <w:rPr>
+            <w:rFonts w:ascii="仿宋" w:eastAsia="仿宋" w:hAnsi="仿宋"/>
+          </w:rPr>
+          <w:alias w:val="合同金额小写"/>
+          <w:tag w:val="合同金额小写"/>
+          <w:id w:val="20002"/>
+        </w:sdtPr>
+        <w:sdtEndPr>
+          <w:rPr>
+            <w:color w:val="FF0000"/>
+          </w:rPr>
+        </w:sdtEndPr>
+        <w:sdtContent>
+          <w:r>
+            <w:rPr>
+              <w:rFonts w:ascii="仿宋" w:eastAsia="仿宋" w:hAnsi="仿宋" w:hint="eastAsia"/>
+            </w:rPr>
+            <w:t>无税固定总价</w:t>
+          </w:r>
+          <w:r>
+            <w:rPr>
+              <w:rFonts w:ascii="仿宋" w:eastAsia="仿宋" w:hAnsi="仿宋" w:hint="eastAsia"/>
+              <w:color w:val="FF0000"/>
+            </w:rPr>
+            <w:t>￥</w:t>
+          </w:r>
+          <w:r>
+            <w:rPr>
+              <w:rFonts w:ascii="仿宋" w:eastAsia="仿宋" w:hAnsi="仿宋"/>
+              <w:color w:val="FF0000"/>
+            </w:rPr>
+            <w:t>1</w:t>
+          </w:r>
+          <w:r>
+            <w:rPr>
+              <w:rFonts w:ascii="仿宋" w:eastAsia="仿宋" w:hAnsi="仿宋" w:hint="eastAsia"/>
+              <w:color w:val="FF0000"/>
+            </w:rPr>
+            <w:t>2</w:t>
+          </w:r>
+          <w:r>
+            <w:rPr>
+              <w:rFonts w:ascii="仿宋" w:eastAsia="仿宋" w:hAnsi="仿宋"/>
+              <w:color w:val="FF0000"/>
+            </w:rPr>
+            <w:t>5000</w:t>
+          </w:r>
+        </w:sdtContent>
+      </w:sdt>
     </w:p>
     <w:p>
       <w:pPr>
@@ -6264,13 +6308,13 @@
               <w:br/>
             </w:r>
             <w:r>
+              <w:lastRenderedPageBreak/>
               <w:br/>
               <w:t>Second Paragraph</w:t>
             </w:r>
           </w:p>
           <w:p>
             <w:r>
-              <w:lastRenderedPageBreak/>
               <w:br/>
               <w:t>Third paragraph before a numbered list</w:t>
             </w:r>
@@ -6344,7 +6388,11 @@
               <w:t>strikethrough</w:t>
             </w:r>
             <w:r>
-              <w:t xml:space="preserve"> and </w:t>
+              <w:t xml:space="preserve"> </w:t>
+            </w:r>
+            <w:r>
+              <w:lastRenderedPageBreak/>
+              <w:t xml:space="preserve">and </w:t>
             </w:r>
             <w:r>
               <w:rPr>
@@ -7447,6 +7495,7 @@
         <w:rPr>
           <w:rFonts w:hint="eastAsia"/>
         </w:rPr>
+        <w:lastRenderedPageBreak/>
         <w:t>1.</w:t>
       </w:r>
       <w:r>
@@ -7506,7 +7555,6 @@
                 </w:tcPr>
                 <w:p>
                   <w:r>
-                    <w:lastRenderedPageBreak/>
                     <w:t>Tab1</w:t>
                   </w:r>
                 </w:p>
@@ -8753,7 +8801,14 @@
               <w:rPr>
                 <w:rFonts w:hint="eastAsia"/>
               </w:rPr>
-              <w:t>户口迁出地</w:t>
+              <w:t>户口迁出</w:t>
+            </w:r>
+            <w:r>
+              <w:rPr>
+                <w:rFonts w:hint="eastAsia"/>
+              </w:rPr>
+              <w:lastRenderedPageBreak/>
+              <w:t>地</w:t>
             </w:r>
           </w:p>
         </w:tc>
@@ -8774,6 +8829,7 @@
               <w:rPr>
                 <w:rFonts w:hint="eastAsia"/>
               </w:rPr>
+              <w:lastRenderedPageBreak/>
               <w:t>户口迁出地地址</w:t>
             </w:r>
           </w:p>
@@ -8922,14 +8978,7 @@
               <w:rPr>
                 <w:rFonts w:hint="eastAsia"/>
               </w:rPr>
-              <w:t>户口迁入</w:t>
-            </w:r>
-            <w:r>
-              <w:rPr>
-                <w:rFonts w:hint="eastAsia"/>
-              </w:rPr>
-              <w:lastRenderedPageBreak/>
-              <w:t>地</w:t>
+              <w:t>户口迁入地</w:t>
             </w:r>
           </w:p>
         </w:tc>
@@ -8950,7 +8999,6 @@
               <w:rPr>
                 <w:rFonts w:hint="eastAsia"/>
               </w:rPr>
-              <w:lastRenderedPageBreak/>
               <w:t>户口迁入地地址</w:t>
             </w:r>
           </w:p>
@@ -10494,7 +10542,15 @@
                 <w:rFonts w:hint="eastAsia"/>
                 <w:lang w:eastAsia="zh-CN"/>
               </w:rPr>
-              <w:t>劳动（聘用）合同试用期起止时间</w:t>
+              <w:t>劳动（聘</w:t>
+            </w:r>
+            <w:r>
+              <w:rPr>
+                <w:rFonts w:hint="eastAsia"/>
+                <w:lang w:eastAsia="zh-CN"/>
+              </w:rPr>
+              <w:lastRenderedPageBreak/>
+              <w:t>用）合同试用期起止时间</w:t>
             </w:r>
           </w:p>
         </w:tc>
@@ -10548,7 +10604,6 @@
                 <w:rFonts w:hint="eastAsia"/>
                 <w:b/>
               </w:rPr>
-              <w:lastRenderedPageBreak/>
               <w:t>主申请人</w:t>
             </w:r>
             <w:r>
@@ -11489,6 +11544,7 @@
         <w:rPr>
           <w:rFonts w:hint="eastAsia"/>
         </w:rPr>
+        <w:lastRenderedPageBreak/>
         <w:t>2.1.2</w:t>
       </w:r>
       <w:r>
@@ -11538,7 +11594,6 @@
         <w:rPr>
           <w:rFonts w:hint="eastAsia"/>
         </w:rPr>
-        <w:lastRenderedPageBreak/>
         <w:t>2.1.3</w:t>
       </w:r>
       <w:r>
@@ -14228,7 +14283,6 @@
         <w:rPr>
           <w:rFonts w:hint="eastAsia"/>
         </w:rPr>
-        <w:lastRenderedPageBreak/>
         <w:t>Table/Figure/Chart with caption</w:t>
       </w:r>
       <w:bookmarkEnd w:id="31"/>
@@ -14692,6 +14746,7 @@
       </w:pPr>
       <w:bookmarkStart w:id="34" w:name="_Toc223630230"/>
       <w:r>
+        <w:lastRenderedPageBreak/>
         <w:t>2</w:t>
       </w:r>
       <w:r>
@@ -14907,6 +14962,7 @@
           <w:sz w:val="32"/>
           <w:szCs w:val="32"/>
         </w:rPr>
+        <w:lastRenderedPageBreak/>
         <w:t>3</w:t>
       </w:r>
       <w:r>
@@ -15703,7 +15759,6 @@
           <w:rFonts w:ascii="宋体" w:hAnsi="宋体" w:cs="宋体" w:hint="eastAsia"/>
           <w:szCs w:val="24"/>
         </w:rPr>
-        <w:lastRenderedPageBreak/>
         <w:t>文本</w:t>
       </w:r>
       <w:hyperlink r:id="rId33" w:history="1">
@@ -16210,6 +16265,7 @@
         <w:rPr>
           <w:rFonts w:ascii="Times New Roman" w:eastAsia="宋体" w:hAnsi="Times New Roman" w:cs="Times New Roman"/>
         </w:rPr>
+        <w:lastRenderedPageBreak/>
         <w:t xml:space="preserve">Garcia, E. T. (2025). Navigating multiversal tax loopholes: A comparative study of Earth-137 and Earth-616 fiscal policies. </w:t>
       </w:r>
       <w:r>

</xml_diff>